<commit_message>
feat: added authentication endpoints to API plan
Added Participant (User) and Organiser API as well as ACcounts with their Authentication
</commit_message>
<xml_diff>
--- a/docs/RaceDay_ API Endpoint Planning.docx
+++ b/docs/RaceDay_ API Endpoint Planning.docx
@@ -9,12 +9,12 @@
         <w:tblLook w:val="04A0" w:firstRow="1" w:lastRow="0" w:firstColumn="1" w:lastColumn="0" w:noHBand="0" w:noVBand="1"/>
       </w:tblPr>
       <w:tblGrid>
-        <w:gridCol w:w="1838"/>
-        <w:gridCol w:w="1166"/>
-        <w:gridCol w:w="3512"/>
-        <w:gridCol w:w="1843"/>
-        <w:gridCol w:w="2409"/>
-        <w:gridCol w:w="3828"/>
+        <w:gridCol w:w="1650"/>
+        <w:gridCol w:w="1804"/>
+        <w:gridCol w:w="3049"/>
+        <w:gridCol w:w="1746"/>
+        <w:gridCol w:w="3098"/>
+        <w:gridCol w:w="3249"/>
       </w:tblGrid>
       <w:tr>
         <w:trPr>
@@ -22,7 +22,7 @@
         </w:trPr>
         <w:tc>
           <w:tcPr>
-            <w:tcW w:w="1838" w:type="dxa"/>
+            <w:tcW w:w="1650" w:type="dxa"/>
           </w:tcPr>
           <w:p>
             <w:r>
@@ -32,7 +32,7 @@
         </w:tc>
         <w:tc>
           <w:tcPr>
-            <w:tcW w:w="1166" w:type="dxa"/>
+            <w:tcW w:w="1804" w:type="dxa"/>
           </w:tcPr>
           <w:p>
             <w:r>
@@ -42,7 +42,7 @@
         </w:tc>
         <w:tc>
           <w:tcPr>
-            <w:tcW w:w="3512" w:type="dxa"/>
+            <w:tcW w:w="3049" w:type="dxa"/>
           </w:tcPr>
           <w:p>
             <w:r>
@@ -52,7 +52,7 @@
         </w:tc>
         <w:tc>
           <w:tcPr>
-            <w:tcW w:w="1843" w:type="dxa"/>
+            <w:tcW w:w="1746" w:type="dxa"/>
           </w:tcPr>
           <w:p>
             <w:r>
@@ -62,7 +62,7 @@
         </w:tc>
         <w:tc>
           <w:tcPr>
-            <w:tcW w:w="2409" w:type="dxa"/>
+            <w:tcW w:w="3098" w:type="dxa"/>
           </w:tcPr>
           <w:p>
             <w:r>
@@ -72,7 +72,7 @@
         </w:tc>
         <w:tc>
           <w:tcPr>
-            <w:tcW w:w="3828" w:type="dxa"/>
+            <w:tcW w:w="3249" w:type="dxa"/>
           </w:tcPr>
           <w:p>
             <w:r>
@@ -87,189 +87,533 @@
         </w:trPr>
         <w:tc>
           <w:tcPr>
-            <w:tcW w:w="1838" w:type="dxa"/>
-          </w:tcPr>
-          <w:p/>
-        </w:tc>
-        <w:tc>
-          <w:tcPr>
-            <w:tcW w:w="1166" w:type="dxa"/>
-          </w:tcPr>
-          <w:p/>
-        </w:tc>
-        <w:tc>
-          <w:tcPr>
-            <w:tcW w:w="3512" w:type="dxa"/>
-          </w:tcPr>
-          <w:p/>
-        </w:tc>
-        <w:tc>
-          <w:tcPr>
-            <w:tcW w:w="1843" w:type="dxa"/>
-          </w:tcPr>
-          <w:p/>
-        </w:tc>
-        <w:tc>
-          <w:tcPr>
-            <w:tcW w:w="2409" w:type="dxa"/>
-          </w:tcPr>
-          <w:p/>
-        </w:tc>
-        <w:tc>
-          <w:tcPr>
-            <w:tcW w:w="3828" w:type="dxa"/>
-          </w:tcPr>
-          <w:p/>
+            <w:tcW w:w="1650" w:type="dxa"/>
+          </w:tcPr>
+          <w:p>
+            <w:r>
+              <w:t>POST</w:t>
+            </w:r>
+          </w:p>
+        </w:tc>
+        <w:tc>
+          <w:tcPr>
+            <w:tcW w:w="1804" w:type="dxa"/>
+          </w:tcPr>
+          <w:p>
+            <w:r>
+              <w:t>/</w:t>
+            </w:r>
+            <w:proofErr w:type="spellStart"/>
+            <w:r>
+              <w:t>api</w:t>
+            </w:r>
+            <w:proofErr w:type="spellEnd"/>
+            <w:r>
+              <w:t>/</w:t>
+            </w:r>
+            <w:r>
+              <w:t>Participant</w:t>
+            </w:r>
+          </w:p>
+        </w:tc>
+        <w:tc>
+          <w:tcPr>
+            <w:tcW w:w="3049" w:type="dxa"/>
+          </w:tcPr>
+          <w:p>
+            <w:r>
+              <w:t>R</w:t>
+            </w:r>
+            <w:r>
+              <w:t>egisters a new participant's details</w:t>
+            </w:r>
+          </w:p>
+        </w:tc>
+        <w:tc>
+          <w:tcPr>
+            <w:tcW w:w="1746" w:type="dxa"/>
+          </w:tcPr>
+          <w:p>
+            <w:r>
+              <w:t>Participant</w:t>
+            </w:r>
+          </w:p>
+        </w:tc>
+        <w:tc>
+          <w:tcPr>
+            <w:tcW w:w="3098" w:type="dxa"/>
+          </w:tcPr>
+          <w:p>
+            <w:r>
+              <w:t>{</w:t>
+            </w:r>
+            <w:proofErr w:type="spellStart"/>
+            <w:r>
+              <w:t>ParticipantID</w:t>
+            </w:r>
+            <w:proofErr w:type="spellEnd"/>
+            <w:r>
+              <w:t xml:space="preserve">, </w:t>
+            </w:r>
+            <w:r>
+              <w:t>FirstName</w:t>
+            </w:r>
+            <w:r>
+              <w:t xml:space="preserve">, </w:t>
+            </w:r>
+            <w:proofErr w:type="spellStart"/>
+            <w:r>
+              <w:t>LastName</w:t>
+            </w:r>
+            <w:proofErr w:type="spellEnd"/>
+            <w:r>
+              <w:t xml:space="preserve">, </w:t>
+            </w:r>
+            <w:proofErr w:type="spellStart"/>
+            <w:r>
+              <w:t>cellnumbe</w:t>
+            </w:r>
+            <w:r>
+              <w:t>r</w:t>
+            </w:r>
+            <w:proofErr w:type="spellEnd"/>
+            <w:r>
+              <w:t xml:space="preserve">, </w:t>
+            </w:r>
+            <w:r>
+              <w:t>address</w:t>
+            </w:r>
+            <w:r>
+              <w:t>}</w:t>
+            </w:r>
+          </w:p>
+        </w:tc>
+        <w:tc>
+          <w:tcPr>
+            <w:tcW w:w="3249" w:type="dxa"/>
+          </w:tcPr>
+          <w:p>
+            <w:r>
+              <w:t>201 Created</w:t>
+            </w:r>
+          </w:p>
         </w:tc>
       </w:tr>
       <w:tr>
-        <w:tc>
-          <w:tcPr>
-            <w:tcW w:w="1838" w:type="dxa"/>
-          </w:tcPr>
-          <w:p/>
-        </w:tc>
-        <w:tc>
-          <w:tcPr>
-            <w:tcW w:w="1166" w:type="dxa"/>
-          </w:tcPr>
-          <w:p/>
-        </w:tc>
-        <w:tc>
-          <w:tcPr>
-            <w:tcW w:w="3512" w:type="dxa"/>
-          </w:tcPr>
-          <w:p/>
-        </w:tc>
-        <w:tc>
-          <w:tcPr>
-            <w:tcW w:w="1843" w:type="dxa"/>
-          </w:tcPr>
-          <w:p/>
-        </w:tc>
-        <w:tc>
-          <w:tcPr>
-            <w:tcW w:w="2409" w:type="dxa"/>
-          </w:tcPr>
-          <w:p/>
-        </w:tc>
-        <w:tc>
-          <w:tcPr>
-            <w:tcW w:w="3828" w:type="dxa"/>
-          </w:tcPr>
-          <w:p/>
+        <w:trPr>
+          <w:trHeight w:val="547"/>
+        </w:trPr>
+        <w:tc>
+          <w:tcPr>
+            <w:tcW w:w="1650" w:type="dxa"/>
+          </w:tcPr>
+          <w:p>
+            <w:r>
+              <w:t>POST</w:t>
+            </w:r>
+          </w:p>
+        </w:tc>
+        <w:tc>
+          <w:tcPr>
+            <w:tcW w:w="1804" w:type="dxa"/>
+          </w:tcPr>
+          <w:p>
+            <w:r>
+              <w:t>/</w:t>
+            </w:r>
+            <w:proofErr w:type="spellStart"/>
+            <w:r>
+              <w:t>api</w:t>
+            </w:r>
+            <w:proofErr w:type="spellEnd"/>
+            <w:r>
+              <w:t>/</w:t>
+            </w:r>
+            <w:r>
+              <w:t>Organiser</w:t>
+            </w:r>
+          </w:p>
+        </w:tc>
+        <w:tc>
+          <w:tcPr>
+            <w:tcW w:w="3049" w:type="dxa"/>
+          </w:tcPr>
+          <w:p>
+            <w:r>
+              <w:t>R</w:t>
+            </w:r>
+            <w:r>
+              <w:t xml:space="preserve">egisters a new </w:t>
+            </w:r>
+            <w:r>
+              <w:t>Organiser</w:t>
+            </w:r>
+            <w:r>
+              <w:t>'s details</w:t>
+            </w:r>
+          </w:p>
+        </w:tc>
+        <w:tc>
+          <w:tcPr>
+            <w:tcW w:w="1746" w:type="dxa"/>
+          </w:tcPr>
+          <w:p>
+            <w:r>
+              <w:t>Organiser</w:t>
+            </w:r>
+          </w:p>
+        </w:tc>
+        <w:tc>
+          <w:tcPr>
+            <w:tcW w:w="3098" w:type="dxa"/>
+          </w:tcPr>
+          <w:p>
+            <w:r>
+              <w:t>{</w:t>
+            </w:r>
+            <w:proofErr w:type="spellStart"/>
+            <w:r>
+              <w:t>OrganiserID</w:t>
+            </w:r>
+            <w:proofErr w:type="spellEnd"/>
+            <w:r>
+              <w:t xml:space="preserve">, </w:t>
+            </w:r>
+            <w:proofErr w:type="spellStart"/>
+            <w:r>
+              <w:t>LastName</w:t>
+            </w:r>
+            <w:proofErr w:type="spellEnd"/>
+            <w:r>
+              <w:t xml:space="preserve">, </w:t>
+            </w:r>
+            <w:proofErr w:type="spellStart"/>
+            <w:r>
+              <w:t>cellnumber</w:t>
+            </w:r>
+            <w:proofErr w:type="spellEnd"/>
+            <w:r>
+              <w:t>, address</w:t>
+            </w:r>
+            <w:r>
+              <w:t>}</w:t>
+            </w:r>
+          </w:p>
+        </w:tc>
+        <w:tc>
+          <w:tcPr>
+            <w:tcW w:w="3249" w:type="dxa"/>
+          </w:tcPr>
+          <w:p>
+            <w:r>
+              <w:t>201 Created</w:t>
+            </w:r>
+          </w:p>
         </w:tc>
       </w:tr>
       <w:tr>
-        <w:tc>
-          <w:tcPr>
-            <w:tcW w:w="1838" w:type="dxa"/>
-          </w:tcPr>
-          <w:p/>
-        </w:tc>
-        <w:tc>
-          <w:tcPr>
-            <w:tcW w:w="1166" w:type="dxa"/>
-          </w:tcPr>
-          <w:p/>
-        </w:tc>
-        <w:tc>
-          <w:tcPr>
-            <w:tcW w:w="3512" w:type="dxa"/>
-          </w:tcPr>
-          <w:p/>
-        </w:tc>
-        <w:tc>
-          <w:tcPr>
-            <w:tcW w:w="1843" w:type="dxa"/>
-          </w:tcPr>
-          <w:p/>
-        </w:tc>
-        <w:tc>
-          <w:tcPr>
-            <w:tcW w:w="2409" w:type="dxa"/>
-          </w:tcPr>
-          <w:p/>
-        </w:tc>
-        <w:tc>
-          <w:tcPr>
-            <w:tcW w:w="3828" w:type="dxa"/>
-          </w:tcPr>
-          <w:p/>
+        <w:trPr>
+          <w:trHeight w:val="547"/>
+        </w:trPr>
+        <w:tc>
+          <w:tcPr>
+            <w:tcW w:w="1650" w:type="dxa"/>
+          </w:tcPr>
+          <w:p>
+            <w:r>
+              <w:t>POST</w:t>
+            </w:r>
+          </w:p>
+        </w:tc>
+        <w:tc>
+          <w:tcPr>
+            <w:tcW w:w="1804" w:type="dxa"/>
+          </w:tcPr>
+          <w:p>
+            <w:r>
+              <w:t>/</w:t>
+            </w:r>
+            <w:proofErr w:type="spellStart"/>
+            <w:r>
+              <w:t>api</w:t>
+            </w:r>
+            <w:proofErr w:type="spellEnd"/>
+            <w:r>
+              <w:t>/account</w:t>
+            </w:r>
+          </w:p>
+        </w:tc>
+        <w:tc>
+          <w:tcPr>
+            <w:tcW w:w="3049" w:type="dxa"/>
+          </w:tcPr>
+          <w:p>
+            <w:r>
+              <w:t>Registers a new participant or organiser account</w:t>
+            </w:r>
+          </w:p>
+        </w:tc>
+        <w:tc>
+          <w:tcPr>
+            <w:tcW w:w="1746" w:type="dxa"/>
+          </w:tcPr>
+          <w:p>
+            <w:r>
+              <w:t>Participant/ Organiser</w:t>
+            </w:r>
+          </w:p>
+        </w:tc>
+        <w:tc>
+          <w:tcPr>
+            <w:tcW w:w="3098" w:type="dxa"/>
+          </w:tcPr>
+          <w:p>
+            <w:r>
+              <w:t>{</w:t>
+            </w:r>
+            <w:proofErr w:type="spellStart"/>
+            <w:r>
+              <w:t>ParticipantID</w:t>
+            </w:r>
+            <w:proofErr w:type="spellEnd"/>
+            <w:r>
+              <w:t>/</w:t>
+            </w:r>
+            <w:proofErr w:type="spellStart"/>
+            <w:proofErr w:type="gramStart"/>
+            <w:r>
+              <w:t>OrganiserID</w:t>
+            </w:r>
+            <w:proofErr w:type="spellEnd"/>
+            <w:r>
+              <w:t xml:space="preserve">,   </w:t>
+            </w:r>
+            <w:proofErr w:type="gramEnd"/>
+            <w:r>
+              <w:t xml:space="preserve">  </w:t>
+            </w:r>
+            <w:proofErr w:type="spellStart"/>
+            <w:r>
+              <w:t>AuthenticationRole</w:t>
+            </w:r>
+            <w:proofErr w:type="spellEnd"/>
+            <w:r>
+              <w:t>, email, Password}</w:t>
+            </w:r>
+          </w:p>
+        </w:tc>
+        <w:tc>
+          <w:tcPr>
+            <w:tcW w:w="3249" w:type="dxa"/>
+          </w:tcPr>
+          <w:p>
+            <w:r>
+              <w:t>201 Created</w:t>
+            </w:r>
+          </w:p>
         </w:tc>
       </w:tr>
       <w:tr>
         <w:tc>
           <w:tcPr>
-            <w:tcW w:w="1838" w:type="dxa"/>
-          </w:tcPr>
-          <w:p/>
-        </w:tc>
-        <w:tc>
-          <w:tcPr>
-            <w:tcW w:w="1166" w:type="dxa"/>
-          </w:tcPr>
-          <w:p/>
-        </w:tc>
-        <w:tc>
-          <w:tcPr>
-            <w:tcW w:w="3512" w:type="dxa"/>
-          </w:tcPr>
-          <w:p/>
-        </w:tc>
-        <w:tc>
-          <w:tcPr>
-            <w:tcW w:w="1843" w:type="dxa"/>
-          </w:tcPr>
-          <w:p/>
-        </w:tc>
-        <w:tc>
-          <w:tcPr>
-            <w:tcW w:w="2409" w:type="dxa"/>
-          </w:tcPr>
-          <w:p/>
-        </w:tc>
-        <w:tc>
-          <w:tcPr>
-            <w:tcW w:w="3828" w:type="dxa"/>
-          </w:tcPr>
-          <w:p/>
+            <w:tcW w:w="1650" w:type="dxa"/>
+          </w:tcPr>
+          <w:p>
+            <w:r>
+              <w:t>POST</w:t>
+            </w:r>
+          </w:p>
+        </w:tc>
+        <w:tc>
+          <w:tcPr>
+            <w:tcW w:w="1804" w:type="dxa"/>
+          </w:tcPr>
+          <w:p>
+            <w:r>
+              <w:t>/</w:t>
+            </w:r>
+            <w:proofErr w:type="spellStart"/>
+            <w:r>
+              <w:t>api</w:t>
+            </w:r>
+            <w:proofErr w:type="spellEnd"/>
+            <w:r>
+              <w:t>/auth/login</w:t>
+            </w:r>
+          </w:p>
+        </w:tc>
+        <w:tc>
+          <w:tcPr>
+            <w:tcW w:w="3049" w:type="dxa"/>
+          </w:tcPr>
+          <w:p>
+            <w:r>
+              <w:t xml:space="preserve">Authenticates a participant or organiser and </w:t>
+            </w:r>
+            <w:r>
+              <w:t xml:space="preserve">allows </w:t>
+            </w:r>
+            <w:r>
+              <w:t>access according to their</w:t>
+            </w:r>
+            <w:r>
+              <w:t xml:space="preserve"> specific</w:t>
+            </w:r>
+            <w:r>
+              <w:t xml:space="preserve"> role</w:t>
+            </w:r>
+          </w:p>
+        </w:tc>
+        <w:tc>
+          <w:tcPr>
+            <w:tcW w:w="1746" w:type="dxa"/>
+          </w:tcPr>
+          <w:tbl>
+            <w:tblPr>
+              <w:tblW w:w="0" w:type="auto"/>
+              <w:tblCellSpacing w:w="15" w:type="dxa"/>
+              <w:tblCellMar>
+                <w:top w:w="15" w:type="dxa"/>
+                <w:left w:w="15" w:type="dxa"/>
+                <w:bottom w:w="15" w:type="dxa"/>
+                <w:right w:w="15" w:type="dxa"/>
+              </w:tblCellMar>
+              <w:tblLook w:val="04A0" w:firstRow="1" w:lastRow="0" w:firstColumn="1" w:lastColumn="0" w:noHBand="0" w:noVBand="1"/>
+            </w:tblPr>
+            <w:tblGrid>
+              <w:gridCol w:w="96"/>
+            </w:tblGrid>
+            <w:tr>
+              <w:trPr>
+                <w:tblCellSpacing w:w="15" w:type="dxa"/>
+              </w:trPr>
+              <w:tc>
+                <w:tcPr>
+                  <w:tcW w:w="0" w:type="auto"/>
+                  <w:vAlign w:val="center"/>
+                  <w:hideMark/>
+                </w:tcPr>
+                <w:p>
+                  <w:pPr>
+                    <w:spacing w:after="0" w:line="240" w:lineRule="auto"/>
+                    <w:rPr>
+                      <w:lang w:val="en-ZA"/>
+                    </w:rPr>
+                  </w:pPr>
+                </w:p>
+              </w:tc>
+            </w:tr>
+          </w:tbl>
+          <w:p>
+            <w:pPr>
+              <w:rPr>
+                <w:vanish/>
+                <w:lang w:val="en-ZA"/>
+              </w:rPr>
+            </w:pPr>
+          </w:p>
+          <w:tbl>
+            <w:tblPr>
+              <w:tblW w:w="0" w:type="auto"/>
+              <w:tblCellSpacing w:w="15" w:type="dxa"/>
+              <w:tblCellMar>
+                <w:top w:w="15" w:type="dxa"/>
+                <w:left w:w="15" w:type="dxa"/>
+                <w:bottom w:w="15" w:type="dxa"/>
+                <w:right w:w="15" w:type="dxa"/>
+              </w:tblCellMar>
+              <w:tblLook w:val="04A0" w:firstRow="1" w:lastRow="0" w:firstColumn="1" w:lastColumn="0" w:noHBand="0" w:noVBand="1"/>
+            </w:tblPr>
+            <w:tblGrid>
+              <w:gridCol w:w="1530"/>
+            </w:tblGrid>
+            <w:tr>
+              <w:trPr>
+                <w:tblCellSpacing w:w="15" w:type="dxa"/>
+              </w:trPr>
+              <w:tc>
+                <w:tcPr>
+                  <w:tcW w:w="0" w:type="auto"/>
+                  <w:vAlign w:val="center"/>
+                  <w:hideMark/>
+                </w:tcPr>
+                <w:p>
+                  <w:pPr>
+                    <w:spacing w:after="0" w:line="240" w:lineRule="auto"/>
+                    <w:rPr>
+                      <w:lang w:val="en-ZA"/>
+                    </w:rPr>
+                  </w:pPr>
+                  <w:r>
+                    <w:rPr>
+                      <w:lang w:val="en-ZA"/>
+                    </w:rPr>
+                    <w:t>Participant / Organiser</w:t>
+                  </w:r>
+                </w:p>
+              </w:tc>
+            </w:tr>
+          </w:tbl>
+          <w:p/>
+        </w:tc>
+        <w:tc>
+          <w:tcPr>
+            <w:tcW w:w="3098" w:type="dxa"/>
+          </w:tcPr>
+          <w:p>
+            <w:r>
+              <w:t>{E</w:t>
+            </w:r>
+            <w:r>
+              <w:t>mail, Password}</w:t>
+            </w:r>
+          </w:p>
+        </w:tc>
+        <w:tc>
+          <w:tcPr>
+            <w:tcW w:w="3249" w:type="dxa"/>
+          </w:tcPr>
+          <w:p>
+            <w:r>
+              <w:t>200 OK</w:t>
+            </w:r>
+          </w:p>
         </w:tc>
       </w:tr>
       <w:tr>
         <w:tc>
           <w:tcPr>
-            <w:tcW w:w="1838" w:type="dxa"/>
-          </w:tcPr>
-          <w:p/>
-        </w:tc>
-        <w:tc>
-          <w:tcPr>
-            <w:tcW w:w="1166" w:type="dxa"/>
-          </w:tcPr>
-          <w:p/>
-        </w:tc>
-        <w:tc>
-          <w:tcPr>
-            <w:tcW w:w="3512" w:type="dxa"/>
-          </w:tcPr>
-          <w:p/>
-        </w:tc>
-        <w:tc>
-          <w:tcPr>
-            <w:tcW w:w="1843" w:type="dxa"/>
-          </w:tcPr>
-          <w:p/>
-        </w:tc>
-        <w:tc>
-          <w:tcPr>
-            <w:tcW w:w="2409" w:type="dxa"/>
-          </w:tcPr>
-          <w:p/>
-        </w:tc>
-        <w:tc>
-          <w:tcPr>
-            <w:tcW w:w="3828" w:type="dxa"/>
+            <w:tcW w:w="1650" w:type="dxa"/>
+          </w:tcPr>
+          <w:p/>
+        </w:tc>
+        <w:tc>
+          <w:tcPr>
+            <w:tcW w:w="1804" w:type="dxa"/>
+          </w:tcPr>
+          <w:p/>
+        </w:tc>
+        <w:tc>
+          <w:tcPr>
+            <w:tcW w:w="3049" w:type="dxa"/>
+          </w:tcPr>
+          <w:p/>
+        </w:tc>
+        <w:tc>
+          <w:tcPr>
+            <w:tcW w:w="1746" w:type="dxa"/>
+          </w:tcPr>
+          <w:p/>
+        </w:tc>
+        <w:tc>
+          <w:tcPr>
+            <w:tcW w:w="3098" w:type="dxa"/>
+          </w:tcPr>
+          <w:p/>
+        </w:tc>
+        <w:tc>
+          <w:tcPr>
+            <w:tcW w:w="3249" w:type="dxa"/>
           </w:tcPr>
           <w:p/>
         </w:tc>
@@ -277,37 +621,37 @@
       <w:tr>
         <w:tc>
           <w:tcPr>
-            <w:tcW w:w="1838" w:type="dxa"/>
-          </w:tcPr>
-          <w:p/>
-        </w:tc>
-        <w:tc>
-          <w:tcPr>
-            <w:tcW w:w="1166" w:type="dxa"/>
-          </w:tcPr>
-          <w:p/>
-        </w:tc>
-        <w:tc>
-          <w:tcPr>
-            <w:tcW w:w="3512" w:type="dxa"/>
-          </w:tcPr>
-          <w:p/>
-        </w:tc>
-        <w:tc>
-          <w:tcPr>
-            <w:tcW w:w="1843" w:type="dxa"/>
-          </w:tcPr>
-          <w:p/>
-        </w:tc>
-        <w:tc>
-          <w:tcPr>
-            <w:tcW w:w="2409" w:type="dxa"/>
-          </w:tcPr>
-          <w:p/>
-        </w:tc>
-        <w:tc>
-          <w:tcPr>
-            <w:tcW w:w="3828" w:type="dxa"/>
+            <w:tcW w:w="1650" w:type="dxa"/>
+          </w:tcPr>
+          <w:p/>
+        </w:tc>
+        <w:tc>
+          <w:tcPr>
+            <w:tcW w:w="1804" w:type="dxa"/>
+          </w:tcPr>
+          <w:p/>
+        </w:tc>
+        <w:tc>
+          <w:tcPr>
+            <w:tcW w:w="3049" w:type="dxa"/>
+          </w:tcPr>
+          <w:p/>
+        </w:tc>
+        <w:tc>
+          <w:tcPr>
+            <w:tcW w:w="1746" w:type="dxa"/>
+          </w:tcPr>
+          <w:p/>
+        </w:tc>
+        <w:tc>
+          <w:tcPr>
+            <w:tcW w:w="3098" w:type="dxa"/>
+          </w:tcPr>
+          <w:p/>
+        </w:tc>
+        <w:tc>
+          <w:tcPr>
+            <w:tcW w:w="3249" w:type="dxa"/>
           </w:tcPr>
           <w:p/>
         </w:tc>
@@ -315,37 +659,113 @@
       <w:tr>
         <w:tc>
           <w:tcPr>
-            <w:tcW w:w="1838" w:type="dxa"/>
-          </w:tcPr>
-          <w:p/>
-        </w:tc>
-        <w:tc>
-          <w:tcPr>
-            <w:tcW w:w="1166" w:type="dxa"/>
-          </w:tcPr>
-          <w:p/>
-        </w:tc>
-        <w:tc>
-          <w:tcPr>
-            <w:tcW w:w="3512" w:type="dxa"/>
-          </w:tcPr>
-          <w:p/>
-        </w:tc>
-        <w:tc>
-          <w:tcPr>
-            <w:tcW w:w="1843" w:type="dxa"/>
-          </w:tcPr>
-          <w:p/>
-        </w:tc>
-        <w:tc>
-          <w:tcPr>
-            <w:tcW w:w="2409" w:type="dxa"/>
-          </w:tcPr>
-          <w:p/>
-        </w:tc>
-        <w:tc>
-          <w:tcPr>
-            <w:tcW w:w="3828" w:type="dxa"/>
+            <w:tcW w:w="1650" w:type="dxa"/>
+          </w:tcPr>
+          <w:p/>
+        </w:tc>
+        <w:tc>
+          <w:tcPr>
+            <w:tcW w:w="1804" w:type="dxa"/>
+          </w:tcPr>
+          <w:p/>
+        </w:tc>
+        <w:tc>
+          <w:tcPr>
+            <w:tcW w:w="3049" w:type="dxa"/>
+          </w:tcPr>
+          <w:p/>
+        </w:tc>
+        <w:tc>
+          <w:tcPr>
+            <w:tcW w:w="1746" w:type="dxa"/>
+          </w:tcPr>
+          <w:p/>
+        </w:tc>
+        <w:tc>
+          <w:tcPr>
+            <w:tcW w:w="3098" w:type="dxa"/>
+          </w:tcPr>
+          <w:p/>
+        </w:tc>
+        <w:tc>
+          <w:tcPr>
+            <w:tcW w:w="3249" w:type="dxa"/>
+          </w:tcPr>
+          <w:p/>
+        </w:tc>
+      </w:tr>
+      <w:tr>
+        <w:tc>
+          <w:tcPr>
+            <w:tcW w:w="1650" w:type="dxa"/>
+          </w:tcPr>
+          <w:p/>
+        </w:tc>
+        <w:tc>
+          <w:tcPr>
+            <w:tcW w:w="1804" w:type="dxa"/>
+          </w:tcPr>
+          <w:p/>
+        </w:tc>
+        <w:tc>
+          <w:tcPr>
+            <w:tcW w:w="3049" w:type="dxa"/>
+          </w:tcPr>
+          <w:p/>
+        </w:tc>
+        <w:tc>
+          <w:tcPr>
+            <w:tcW w:w="1746" w:type="dxa"/>
+          </w:tcPr>
+          <w:p/>
+        </w:tc>
+        <w:tc>
+          <w:tcPr>
+            <w:tcW w:w="3098" w:type="dxa"/>
+          </w:tcPr>
+          <w:p/>
+        </w:tc>
+        <w:tc>
+          <w:tcPr>
+            <w:tcW w:w="3249" w:type="dxa"/>
+          </w:tcPr>
+          <w:p/>
+        </w:tc>
+      </w:tr>
+      <w:tr>
+        <w:tc>
+          <w:tcPr>
+            <w:tcW w:w="1650" w:type="dxa"/>
+          </w:tcPr>
+          <w:p/>
+        </w:tc>
+        <w:tc>
+          <w:tcPr>
+            <w:tcW w:w="1804" w:type="dxa"/>
+          </w:tcPr>
+          <w:p/>
+        </w:tc>
+        <w:tc>
+          <w:tcPr>
+            <w:tcW w:w="3049" w:type="dxa"/>
+          </w:tcPr>
+          <w:p/>
+        </w:tc>
+        <w:tc>
+          <w:tcPr>
+            <w:tcW w:w="1746" w:type="dxa"/>
+          </w:tcPr>
+          <w:p/>
+        </w:tc>
+        <w:tc>
+          <w:tcPr>
+            <w:tcW w:w="3098" w:type="dxa"/>
+          </w:tcPr>
+          <w:p/>
+        </w:tc>
+        <w:tc>
+          <w:tcPr>
+            <w:tcW w:w="3249" w:type="dxa"/>
           </w:tcPr>
           <w:p/>
         </w:tc>

</xml_diff>

<commit_message>
feat: Added User Profile API funtionality
Participant or Organiser can view/update their profile (Account in this POE)
</commit_message>
<xml_diff>
--- a/docs/RaceDay_ API Endpoint Planning.docx
+++ b/docs/RaceDay_ API Endpoint Planning.docx
@@ -147,14 +147,6 @@
             <w:r>
               <w:t>{</w:t>
             </w:r>
-            <w:proofErr w:type="spellStart"/>
-            <w:r>
-              <w:t>ParticipantID</w:t>
-            </w:r>
-            <w:proofErr w:type="spellEnd"/>
-            <w:r>
-              <w:t xml:space="preserve">, </w:t>
-            </w:r>
             <w:r>
               <w:t>FirstName</w:t>
             </w:r>
@@ -271,25 +263,15 @@
             <w:r>
               <w:t>{</w:t>
             </w:r>
+            <w:r>
+              <w:t>FirstName</w:t>
+            </w:r>
+            <w:r>
+              <w:t xml:space="preserve">, </w:t>
+            </w:r>
             <w:proofErr w:type="spellStart"/>
             <w:r>
-              <w:t>OrganiserID</w:t>
-            </w:r>
-            <w:proofErr w:type="spellEnd"/>
-            <w:r>
-              <w:t xml:space="preserve">, </w:t>
-            </w:r>
-            <w:proofErr w:type="spellStart"/>
-            <w:r>
               <w:t>LastName</w:t>
-            </w:r>
-            <w:proofErr w:type="spellEnd"/>
-            <w:r>
-              <w:t xml:space="preserve">, </w:t>
-            </w:r>
-            <w:proofErr w:type="spellStart"/>
-            <w:r>
-              <w:t>cellnumber</w:t>
             </w:r>
             <w:proofErr w:type="spellEnd"/>
             <w:r>
@@ -380,17 +362,12 @@
               <w:t>/</w:t>
             </w:r>
             <w:proofErr w:type="spellStart"/>
-            <w:proofErr w:type="gramStart"/>
             <w:r>
               <w:t>OrganiserID</w:t>
             </w:r>
             <w:proofErr w:type="spellEnd"/>
             <w:r>
-              <w:t xml:space="preserve">,   </w:t>
-            </w:r>
-            <w:proofErr w:type="gramEnd"/>
-            <w:r>
-              <w:t xml:space="preserve">  </w:t>
+              <w:t xml:space="preserve">,     </w:t>
             </w:r>
             <w:proofErr w:type="spellStart"/>
             <w:r>
@@ -585,37 +562,75 @@
           <w:tcPr>
             <w:tcW w:w="1650" w:type="dxa"/>
           </w:tcPr>
-          <w:p/>
+          <w:p>
+            <w:r>
+              <w:t>GET</w:t>
+            </w:r>
+          </w:p>
         </w:tc>
         <w:tc>
           <w:tcPr>
             <w:tcW w:w="1804" w:type="dxa"/>
           </w:tcPr>
-          <w:p/>
+          <w:p>
+            <w:r>
+              <w:t>/</w:t>
+            </w:r>
+            <w:proofErr w:type="spellStart"/>
+            <w:r>
+              <w:t>api</w:t>
+            </w:r>
+            <w:proofErr w:type="spellEnd"/>
+            <w:r>
+              <w:t>/</w:t>
+            </w:r>
+            <w:r>
+              <w:t>account</w:t>
+            </w:r>
+          </w:p>
         </w:tc>
         <w:tc>
           <w:tcPr>
             <w:tcW w:w="3049" w:type="dxa"/>
           </w:tcPr>
-          <w:p/>
+          <w:p>
+            <w:r>
+              <w:t>Participant views their account/profile details</w:t>
+            </w:r>
+          </w:p>
         </w:tc>
         <w:tc>
           <w:tcPr>
             <w:tcW w:w="1746" w:type="dxa"/>
           </w:tcPr>
-          <w:p/>
+          <w:p>
+            <w:r>
+              <w:rPr>
+                <w:lang w:val="en-ZA"/>
+              </w:rPr>
+              <w:t>Participant</w:t>
+            </w:r>
+          </w:p>
         </w:tc>
         <w:tc>
           <w:tcPr>
             <w:tcW w:w="3098" w:type="dxa"/>
           </w:tcPr>
-          <w:p/>
+          <w:p>
+            <w:r>
+              <w:t>None</w:t>
+            </w:r>
+          </w:p>
         </w:tc>
         <w:tc>
           <w:tcPr>
             <w:tcW w:w="3249" w:type="dxa"/>
           </w:tcPr>
-          <w:p/>
+          <w:p>
+            <w:r>
+              <w:t>200 OK</w:t>
+            </w:r>
+          </w:p>
         </w:tc>
       </w:tr>
       <w:tr>
@@ -623,37 +638,75 @@
           <w:tcPr>
             <w:tcW w:w="1650" w:type="dxa"/>
           </w:tcPr>
-          <w:p/>
+          <w:p>
+            <w:r>
+              <w:t>GET</w:t>
+            </w:r>
+          </w:p>
         </w:tc>
         <w:tc>
           <w:tcPr>
             <w:tcW w:w="1804" w:type="dxa"/>
           </w:tcPr>
-          <w:p/>
+          <w:p>
+            <w:r>
+              <w:t>/</w:t>
+            </w:r>
+            <w:proofErr w:type="spellStart"/>
+            <w:r>
+              <w:t>api</w:t>
+            </w:r>
+            <w:proofErr w:type="spellEnd"/>
+            <w:r>
+              <w:t>/account</w:t>
+            </w:r>
+          </w:p>
         </w:tc>
         <w:tc>
           <w:tcPr>
             <w:tcW w:w="3049" w:type="dxa"/>
           </w:tcPr>
-          <w:p/>
+          <w:p>
+            <w:r>
+              <w:t>Organiser</w:t>
+            </w:r>
+            <w:r>
+              <w:t xml:space="preserve"> views their account/profile details</w:t>
+            </w:r>
+          </w:p>
         </w:tc>
         <w:tc>
           <w:tcPr>
             <w:tcW w:w="1746" w:type="dxa"/>
           </w:tcPr>
-          <w:p/>
+          <w:p>
+            <w:r>
+              <w:rPr>
+                <w:lang w:val="en-ZA"/>
+              </w:rPr>
+              <w:t>Organiser</w:t>
+            </w:r>
+          </w:p>
         </w:tc>
         <w:tc>
           <w:tcPr>
             <w:tcW w:w="3098" w:type="dxa"/>
           </w:tcPr>
-          <w:p/>
+          <w:p>
+            <w:r>
+              <w:t>None</w:t>
+            </w:r>
+          </w:p>
         </w:tc>
         <w:tc>
           <w:tcPr>
             <w:tcW w:w="3249" w:type="dxa"/>
           </w:tcPr>
-          <w:p/>
+          <w:p>
+            <w:r>
+              <w:t>200 OK</w:t>
+            </w:r>
+          </w:p>
         </w:tc>
       </w:tr>
       <w:tr>
@@ -661,37 +714,100 @@
           <w:tcPr>
             <w:tcW w:w="1650" w:type="dxa"/>
           </w:tcPr>
-          <w:p/>
+          <w:p>
+            <w:r>
+              <w:t>PUT</w:t>
+            </w:r>
+          </w:p>
         </w:tc>
         <w:tc>
           <w:tcPr>
             <w:tcW w:w="1804" w:type="dxa"/>
           </w:tcPr>
-          <w:p/>
+          <w:p>
+            <w:r>
+              <w:t>/</w:t>
+            </w:r>
+            <w:proofErr w:type="spellStart"/>
+            <w:r>
+              <w:t>api</w:t>
+            </w:r>
+            <w:proofErr w:type="spellEnd"/>
+            <w:r>
+              <w:t>/account</w:t>
+            </w:r>
+          </w:p>
         </w:tc>
         <w:tc>
           <w:tcPr>
             <w:tcW w:w="3049" w:type="dxa"/>
           </w:tcPr>
-          <w:p/>
+          <w:p>
+            <w:r>
+              <w:t>Participant updates their account/profile details</w:t>
+            </w:r>
+          </w:p>
         </w:tc>
         <w:tc>
           <w:tcPr>
             <w:tcW w:w="1746" w:type="dxa"/>
           </w:tcPr>
-          <w:p/>
+          <w:p>
+            <w:r>
+              <w:rPr>
+                <w:lang w:val="en-ZA"/>
+              </w:rPr>
+              <w:t>Participant</w:t>
+            </w:r>
+          </w:p>
         </w:tc>
         <w:tc>
           <w:tcPr>
             <w:tcW w:w="3098" w:type="dxa"/>
           </w:tcPr>
-          <w:p/>
+          <w:p>
+            <w:r>
+              <w:t xml:space="preserve">{FirstName, </w:t>
+            </w:r>
+            <w:proofErr w:type="spellStart"/>
+            <w:r>
+              <w:t>LastName</w:t>
+            </w:r>
+            <w:proofErr w:type="spellEnd"/>
+            <w:r>
+              <w:t xml:space="preserve">, </w:t>
+            </w:r>
+            <w:proofErr w:type="spellStart"/>
+            <w:r>
+              <w:t>cellnumber</w:t>
+            </w:r>
+            <w:proofErr w:type="spellEnd"/>
+            <w:r>
+              <w:t xml:space="preserve">, </w:t>
+            </w:r>
+            <w:r>
+              <w:t>A</w:t>
+            </w:r>
+            <w:r>
+              <w:t>ddress</w:t>
+            </w:r>
+            <w:r>
+              <w:t>, Email</w:t>
+            </w:r>
+            <w:r>
+              <w:t>}</w:t>
+            </w:r>
+          </w:p>
         </w:tc>
         <w:tc>
           <w:tcPr>
             <w:tcW w:w="3249" w:type="dxa"/>
           </w:tcPr>
-          <w:p/>
+          <w:p>
+            <w:r>
+              <w:t>200 OK</w:t>
+            </w:r>
+          </w:p>
         </w:tc>
       </w:tr>
       <w:tr>
@@ -699,37 +815,80 @@
           <w:tcPr>
             <w:tcW w:w="1650" w:type="dxa"/>
           </w:tcPr>
-          <w:p/>
+          <w:p>
+            <w:r>
+              <w:t>PUT</w:t>
+            </w:r>
+          </w:p>
         </w:tc>
         <w:tc>
           <w:tcPr>
             <w:tcW w:w="1804" w:type="dxa"/>
           </w:tcPr>
-          <w:p/>
+          <w:p>
+            <w:r>
+              <w:t>/</w:t>
+            </w:r>
+            <w:proofErr w:type="spellStart"/>
+            <w:r>
+              <w:t>api</w:t>
+            </w:r>
+            <w:proofErr w:type="spellEnd"/>
+            <w:r>
+              <w:t>/account</w:t>
+            </w:r>
+          </w:p>
         </w:tc>
         <w:tc>
           <w:tcPr>
             <w:tcW w:w="3049" w:type="dxa"/>
           </w:tcPr>
-          <w:p/>
+          <w:p>
+            <w:r>
+              <w:t>Organiser</w:t>
+            </w:r>
+            <w:r>
+              <w:t xml:space="preserve"> updates their account/profile details</w:t>
+            </w:r>
+          </w:p>
         </w:tc>
         <w:tc>
           <w:tcPr>
             <w:tcW w:w="1746" w:type="dxa"/>
           </w:tcPr>
-          <w:p/>
+          <w:p>
+            <w:r>
+              <w:t>Organiser</w:t>
+            </w:r>
+          </w:p>
         </w:tc>
         <w:tc>
           <w:tcPr>
             <w:tcW w:w="3098" w:type="dxa"/>
           </w:tcPr>
-          <w:p/>
+          <w:p>
+            <w:r>
+              <w:t xml:space="preserve">{FirstName, </w:t>
+            </w:r>
+            <w:proofErr w:type="spellStart"/>
+            <w:r>
+              <w:t>LastName</w:t>
+            </w:r>
+            <w:proofErr w:type="spellEnd"/>
+            <w:r>
+              <w:t>, Address, Email}</w:t>
+            </w:r>
+          </w:p>
         </w:tc>
         <w:tc>
           <w:tcPr>
             <w:tcW w:w="3249" w:type="dxa"/>
           </w:tcPr>
-          <w:p/>
+          <w:p>
+            <w:r>
+              <w:t>200 OK</w:t>
+            </w:r>
+          </w:p>
         </w:tc>
       </w:tr>
       <w:tr>

</xml_diff>

<commit_message>
feat: added Events API functionality
Organiser gets to create/update/delete events and public gets to view a specific or all events
</commit_message>
<xml_diff>
--- a/docs/RaceDay_ API Endpoint Planning.docx
+++ b/docs/RaceDay_ API Endpoint Planning.docx
@@ -101,15 +101,7 @@
           </w:tcPr>
           <w:p>
             <w:r>
-              <w:t>/</w:t>
-            </w:r>
-            <w:proofErr w:type="spellStart"/>
-            <w:r>
-              <w:t>api</w:t>
-            </w:r>
-            <w:proofErr w:type="spellEnd"/>
-            <w:r>
-              <w:t>/</w:t>
+              <w:t>/api/</w:t>
             </w:r>
             <w:r>
               <w:t>Participant</w:t>
@@ -127,6 +119,9 @@
             <w:r>
               <w:t>egisters a new participant's details</w:t>
             </w:r>
+            <w:r>
+              <w:t>.</w:t>
+            </w:r>
           </w:p>
         </w:tc>
         <w:tc>
@@ -153,24 +148,17 @@
             <w:r>
               <w:t xml:space="preserve">, </w:t>
             </w:r>
-            <w:proofErr w:type="spellStart"/>
             <w:r>
               <w:t>LastName</w:t>
             </w:r>
-            <w:proofErr w:type="spellEnd"/>
             <w:r>
               <w:t xml:space="preserve">, </w:t>
             </w:r>
-            <w:proofErr w:type="spellStart"/>
             <w:r>
               <w:t>cellnumbe</w:t>
             </w:r>
             <w:r>
-              <w:t>r</w:t>
-            </w:r>
-            <w:proofErr w:type="spellEnd"/>
-            <w:r>
-              <w:t xml:space="preserve">, </w:t>
+              <w:t xml:space="preserve">r, </w:t>
             </w:r>
             <w:r>
               <w:t>address</w:t>
@@ -211,15 +199,7 @@
           </w:tcPr>
           <w:p>
             <w:r>
-              <w:t>/</w:t>
-            </w:r>
-            <w:proofErr w:type="spellStart"/>
-            <w:r>
-              <w:t>api</w:t>
-            </w:r>
-            <w:proofErr w:type="spellEnd"/>
-            <w:r>
-              <w:t>/</w:t>
+              <w:t>/api/</w:t>
             </w:r>
             <w:r>
               <w:t>Organiser</w:t>
@@ -243,6 +223,9 @@
             <w:r>
               <w:t>'s details</w:t>
             </w:r>
+            <w:r>
+              <w:t>.</w:t>
+            </w:r>
           </w:p>
         </w:tc>
         <w:tc>
@@ -269,13 +252,8 @@
             <w:r>
               <w:t xml:space="preserve">, </w:t>
             </w:r>
-            <w:proofErr w:type="spellStart"/>
-            <w:r>
-              <w:t>LastName</w:t>
-            </w:r>
-            <w:proofErr w:type="spellEnd"/>
-            <w:r>
-              <w:t>, address</w:t>
+            <w:r>
+              <w:t>LastName, address</w:t>
             </w:r>
             <w:r>
               <w:t>}</w:t>
@@ -313,15 +291,7 @@
           </w:tcPr>
           <w:p>
             <w:r>
-              <w:t>/</w:t>
-            </w:r>
-            <w:proofErr w:type="spellStart"/>
-            <w:r>
-              <w:t>api</w:t>
-            </w:r>
-            <w:proofErr w:type="spellEnd"/>
-            <w:r>
-              <w:t>/account</w:t>
+              <w:t>/api/account</w:t>
             </w:r>
           </w:p>
         </w:tc>
@@ -333,6 +303,9 @@
             <w:r>
               <w:t>Registers a new participant or organiser account</w:t>
             </w:r>
+            <w:r>
+              <w:t>.</w:t>
+            </w:r>
           </w:p>
         </w:tc>
         <w:tc>
@@ -351,31 +324,7 @@
           </w:tcPr>
           <w:p>
             <w:r>
-              <w:t>{</w:t>
-            </w:r>
-            <w:proofErr w:type="spellStart"/>
-            <w:r>
-              <w:t>ParticipantID</w:t>
-            </w:r>
-            <w:proofErr w:type="spellEnd"/>
-            <w:r>
-              <w:t>/</w:t>
-            </w:r>
-            <w:proofErr w:type="spellStart"/>
-            <w:r>
-              <w:t>OrganiserID</w:t>
-            </w:r>
-            <w:proofErr w:type="spellEnd"/>
-            <w:r>
-              <w:t xml:space="preserve">,     </w:t>
-            </w:r>
-            <w:proofErr w:type="spellStart"/>
-            <w:r>
-              <w:t>AuthenticationRole</w:t>
-            </w:r>
-            <w:proofErr w:type="spellEnd"/>
-            <w:r>
-              <w:t>, email, Password}</w:t>
+              <w:t>{ParticipantID/OrganiserID,     AuthenticationRole, email, Password}</w:t>
             </w:r>
           </w:p>
         </w:tc>
@@ -407,15 +356,7 @@
           </w:tcPr>
           <w:p>
             <w:r>
-              <w:t>/</w:t>
-            </w:r>
-            <w:proofErr w:type="spellStart"/>
-            <w:r>
-              <w:t>api</w:t>
-            </w:r>
-            <w:proofErr w:type="spellEnd"/>
-            <w:r>
-              <w:t>/auth/login</w:t>
+              <w:t>/api/auth/login</w:t>
             </w:r>
           </w:p>
         </w:tc>
@@ -438,6 +379,9 @@
             </w:r>
             <w:r>
               <w:t xml:space="preserve"> role</w:t>
+            </w:r>
+            <w:r>
+              <w:t>.</w:t>
             </w:r>
           </w:p>
         </w:tc>
@@ -574,15 +518,7 @@
           </w:tcPr>
           <w:p>
             <w:r>
-              <w:t>/</w:t>
-            </w:r>
-            <w:proofErr w:type="spellStart"/>
-            <w:r>
-              <w:t>api</w:t>
-            </w:r>
-            <w:proofErr w:type="spellEnd"/>
-            <w:r>
-              <w:t>/</w:t>
+              <w:t>/api/</w:t>
             </w:r>
             <w:r>
               <w:t>account</w:t>
@@ -596,6 +532,9 @@
           <w:p>
             <w:r>
               <w:t>Participant views their account/profile details</w:t>
+            </w:r>
+            <w:r>
+              <w:t>.</w:t>
             </w:r>
           </w:p>
         </w:tc>
@@ -650,15 +589,7 @@
           </w:tcPr>
           <w:p>
             <w:r>
-              <w:t>/</w:t>
-            </w:r>
-            <w:proofErr w:type="spellStart"/>
-            <w:r>
-              <w:t>api</w:t>
-            </w:r>
-            <w:proofErr w:type="spellEnd"/>
-            <w:r>
-              <w:t>/account</w:t>
+              <w:t>/api/account</w:t>
             </w:r>
           </w:p>
         </w:tc>
@@ -672,6 +603,9 @@
             </w:r>
             <w:r>
               <w:t xml:space="preserve"> views their account/profile details</w:t>
+            </w:r>
+            <w:r>
+              <w:t>.</w:t>
             </w:r>
           </w:p>
         </w:tc>
@@ -726,15 +660,7 @@
           </w:tcPr>
           <w:p>
             <w:r>
-              <w:t>/</w:t>
-            </w:r>
-            <w:proofErr w:type="spellStart"/>
-            <w:r>
-              <w:t>api</w:t>
-            </w:r>
-            <w:proofErr w:type="spellEnd"/>
-            <w:r>
-              <w:t>/account</w:t>
+              <w:t>/api/account</w:t>
             </w:r>
           </w:p>
         </w:tc>
@@ -745,6 +671,9 @@
           <w:p>
             <w:r>
               <w:t>Participant updates their account/profile details</w:t>
+            </w:r>
+            <w:r>
+              <w:t>.</w:t>
             </w:r>
           </w:p>
         </w:tc>
@@ -767,23 +696,7 @@
           </w:tcPr>
           <w:p>
             <w:r>
-              <w:t xml:space="preserve">{FirstName, </w:t>
-            </w:r>
-            <w:proofErr w:type="spellStart"/>
-            <w:r>
-              <w:t>LastName</w:t>
-            </w:r>
-            <w:proofErr w:type="spellEnd"/>
-            <w:r>
-              <w:t xml:space="preserve">, </w:t>
-            </w:r>
-            <w:proofErr w:type="spellStart"/>
-            <w:r>
-              <w:t>cellnumber</w:t>
-            </w:r>
-            <w:proofErr w:type="spellEnd"/>
-            <w:r>
-              <w:t xml:space="preserve">, </w:t>
+              <w:t xml:space="preserve">{FirstName, LastName, cellnumber, </w:t>
             </w:r>
             <w:r>
               <w:t>A</w:t>
@@ -827,15 +740,7 @@
           </w:tcPr>
           <w:p>
             <w:r>
-              <w:t>/</w:t>
-            </w:r>
-            <w:proofErr w:type="spellStart"/>
-            <w:r>
-              <w:t>api</w:t>
-            </w:r>
-            <w:proofErr w:type="spellEnd"/>
-            <w:r>
-              <w:t>/account</w:t>
+              <w:t>/api/account</w:t>
             </w:r>
           </w:p>
         </w:tc>
@@ -850,6 +755,9 @@
             <w:r>
               <w:t xml:space="preserve"> updates their account/profile details</w:t>
             </w:r>
+            <w:r>
+              <w:t>.</w:t>
+            </w:r>
           </w:p>
         </w:tc>
         <w:tc>
@@ -868,15 +776,7 @@
           </w:tcPr>
           <w:p>
             <w:r>
-              <w:t xml:space="preserve">{FirstName, </w:t>
-            </w:r>
-            <w:proofErr w:type="spellStart"/>
-            <w:r>
-              <w:t>LastName</w:t>
-            </w:r>
-            <w:proofErr w:type="spellEnd"/>
-            <w:r>
-              <w:t>, Address, Email}</w:t>
+              <w:t>{FirstName, LastName, Address, Email}</w:t>
             </w:r>
           </w:p>
         </w:tc>
@@ -896,37 +796,487 @@
           <w:tcPr>
             <w:tcW w:w="1650" w:type="dxa"/>
           </w:tcPr>
-          <w:p/>
+          <w:p>
+            <w:r>
+              <w:t>P</w:t>
+            </w:r>
+            <w:r>
+              <w:t>OST</w:t>
+            </w:r>
+          </w:p>
         </w:tc>
         <w:tc>
           <w:tcPr>
             <w:tcW w:w="1804" w:type="dxa"/>
           </w:tcPr>
-          <w:p/>
+          <w:p>
+            <w:r>
+              <w:t>/api/ events</w:t>
+            </w:r>
+          </w:p>
         </w:tc>
         <w:tc>
           <w:tcPr>
             <w:tcW w:w="3049" w:type="dxa"/>
           </w:tcPr>
-          <w:p/>
+          <w:p>
+            <w:r>
+              <w:t>Creates a new RaceDay event</w:t>
+            </w:r>
+            <w:r>
+              <w:t>.</w:t>
+            </w:r>
+          </w:p>
         </w:tc>
         <w:tc>
           <w:tcPr>
             <w:tcW w:w="1746" w:type="dxa"/>
           </w:tcPr>
-          <w:p/>
+          <w:p>
+            <w:r>
+              <w:t>Organiser</w:t>
+            </w:r>
+          </w:p>
         </w:tc>
         <w:tc>
           <w:tcPr>
             <w:tcW w:w="3098" w:type="dxa"/>
           </w:tcPr>
-          <w:p/>
+          <w:p>
+            <w:r>
+              <w:t>{</w:t>
+            </w:r>
+            <w:r>
+              <w:t>OrganiserID,</w:t>
+            </w:r>
+            <w:r>
+              <w:t xml:space="preserve"> </w:t>
+            </w:r>
+            <w:r>
+              <w:t>EventName,</w:t>
+            </w:r>
+            <w:r>
+              <w:t xml:space="preserve"> </w:t>
+            </w:r>
+            <w:r>
+              <w:t>Description,</w:t>
+            </w:r>
+            <w:r>
+              <w:t xml:space="preserve"> </w:t>
+            </w:r>
+            <w:r>
+              <w:t>EventType,</w:t>
+            </w:r>
+            <w:r>
+              <w:t xml:space="preserve"> </w:t>
+            </w:r>
+            <w:r>
+              <w:t>EventDate,</w:t>
+            </w:r>
+            <w:r>
+              <w:t xml:space="preserve"> </w:t>
+            </w:r>
+            <w:r>
+              <w:t>EventDuration,</w:t>
+            </w:r>
+            <w:r>
+              <w:t xml:space="preserve"> </w:t>
+            </w:r>
+            <w:r>
+              <w:t>Location,</w:t>
+            </w:r>
+            <w:r>
+              <w:t xml:space="preserve"> </w:t>
+            </w:r>
+            <w:r>
+              <w:t>Distance</w:t>
+            </w:r>
+            <w:r>
+              <w:t>}</w:t>
+            </w:r>
+          </w:p>
         </w:tc>
         <w:tc>
           <w:tcPr>
             <w:tcW w:w="3249" w:type="dxa"/>
           </w:tcPr>
-          <w:p/>
+          <w:p>
+            <w:r>
+              <w:t>201 Created; 400 Bad Request;</w:t>
+            </w:r>
+            <w:r>
+              <w:t xml:space="preserve"> </w:t>
+            </w:r>
+            <w:r>
+              <w:t>401/403 if access is invalid</w:t>
+            </w:r>
+          </w:p>
+        </w:tc>
+      </w:tr>
+      <w:tr>
+        <w:tc>
+          <w:tcPr>
+            <w:tcW w:w="1650" w:type="dxa"/>
+          </w:tcPr>
+          <w:p>
+            <w:r>
+              <w:t>PUT</w:t>
+            </w:r>
+          </w:p>
+        </w:tc>
+        <w:tc>
+          <w:tcPr>
+            <w:tcW w:w="1804" w:type="dxa"/>
+          </w:tcPr>
+          <w:p>
+            <w:r>
+              <w:t>/api/ events</w:t>
+            </w:r>
+          </w:p>
+        </w:tc>
+        <w:tc>
+          <w:tcPr>
+            <w:tcW w:w="3049" w:type="dxa"/>
+          </w:tcPr>
+          <w:p>
+            <w:r>
+              <w:t>Organiser</w:t>
+            </w:r>
+            <w:r>
+              <w:t xml:space="preserve"> updates the</w:t>
+            </w:r>
+            <w:r>
+              <w:t xml:space="preserve"> event</w:t>
+            </w:r>
+            <w:r>
+              <w:t xml:space="preserve"> details</w:t>
+            </w:r>
+            <w:r>
+              <w:t>.</w:t>
+            </w:r>
+          </w:p>
+        </w:tc>
+        <w:tc>
+          <w:tcPr>
+            <w:tcW w:w="1746" w:type="dxa"/>
+          </w:tcPr>
+          <w:p>
+            <w:r>
+              <w:t>Organiser</w:t>
+            </w:r>
+          </w:p>
+        </w:tc>
+        <w:tc>
+          <w:tcPr>
+            <w:tcW w:w="3098" w:type="dxa"/>
+          </w:tcPr>
+          <w:p>
+            <w:r>
+              <w:t>{</w:t>
+            </w:r>
+            <w:r>
+              <w:t>OrganiserID,</w:t>
+            </w:r>
+            <w:r>
+              <w:t xml:space="preserve"> </w:t>
+            </w:r>
+            <w:r>
+              <w:t>EventName, Description,</w:t>
+            </w:r>
+            <w:r>
+              <w:t xml:space="preserve"> </w:t>
+            </w:r>
+            <w:r>
+              <w:t>EventType,</w:t>
+            </w:r>
+            <w:r>
+              <w:t xml:space="preserve"> </w:t>
+            </w:r>
+            <w:r>
+              <w:t>EventDate,</w:t>
+            </w:r>
+            <w:r>
+              <w:t xml:space="preserve"> </w:t>
+            </w:r>
+            <w:r>
+              <w:t>EventDuration,</w:t>
+            </w:r>
+            <w:r>
+              <w:t xml:space="preserve"> </w:t>
+            </w:r>
+            <w:r>
+              <w:t>Location,</w:t>
+            </w:r>
+            <w:r>
+              <w:t xml:space="preserve"> </w:t>
+            </w:r>
+            <w:r>
+              <w:t>Distance</w:t>
+            </w:r>
+            <w:r>
+              <w:t>}</w:t>
+            </w:r>
+          </w:p>
+        </w:tc>
+        <w:tc>
+          <w:tcPr>
+            <w:tcW w:w="3249" w:type="dxa"/>
+          </w:tcPr>
+          <w:p>
+            <w:r>
+              <w:t>200 OK</w:t>
+            </w:r>
+            <w:r>
+              <w:t xml:space="preserve">; </w:t>
+            </w:r>
+            <w:r>
+              <w:t>400 Bad Request;</w:t>
+            </w:r>
+            <w:r>
+              <w:t xml:space="preserve"> </w:t>
+            </w:r>
+            <w:r>
+              <w:t>401/403 if access is invalid</w:t>
+            </w:r>
+          </w:p>
+        </w:tc>
+      </w:tr>
+      <w:tr>
+        <w:tc>
+          <w:tcPr>
+            <w:tcW w:w="1650" w:type="dxa"/>
+          </w:tcPr>
+          <w:p>
+            <w:r>
+              <w:t>DELETE</w:t>
+            </w:r>
+          </w:p>
+        </w:tc>
+        <w:tc>
+          <w:tcPr>
+            <w:tcW w:w="1804" w:type="dxa"/>
+          </w:tcPr>
+          <w:p>
+            <w:r>
+              <w:t>/api/ events</w:t>
+            </w:r>
+          </w:p>
+        </w:tc>
+        <w:tc>
+          <w:tcPr>
+            <w:tcW w:w="3049" w:type="dxa"/>
+          </w:tcPr>
+          <w:p>
+            <w:r>
+              <w:t>Organiser</w:t>
+            </w:r>
+            <w:r>
+              <w:t xml:space="preserve"> </w:t>
+            </w:r>
+            <w:r>
+              <w:t>deletes</w:t>
+            </w:r>
+            <w:r>
+              <w:t xml:space="preserve"> the</w:t>
+            </w:r>
+            <w:r>
+              <w:t xml:space="preserve"> event</w:t>
+            </w:r>
+            <w:r>
+              <w:t>.</w:t>
+            </w:r>
+          </w:p>
+        </w:tc>
+        <w:tc>
+          <w:tcPr>
+            <w:tcW w:w="1746" w:type="dxa"/>
+          </w:tcPr>
+          <w:p>
+            <w:r>
+              <w:t>Organiser</w:t>
+            </w:r>
+          </w:p>
+        </w:tc>
+        <w:tc>
+          <w:tcPr>
+            <w:tcW w:w="3098" w:type="dxa"/>
+          </w:tcPr>
+          <w:p>
+            <w:r>
+              <w:t>None</w:t>
+            </w:r>
+          </w:p>
+        </w:tc>
+        <w:tc>
+          <w:tcPr>
+            <w:tcW w:w="3249" w:type="dxa"/>
+          </w:tcPr>
+          <w:p>
+            <w:r>
+              <w:t xml:space="preserve">200 OK; </w:t>
+            </w:r>
+            <w:r>
+              <w:t>400 Bad Request;</w:t>
+            </w:r>
+            <w:r>
+              <w:t xml:space="preserve"> </w:t>
+            </w:r>
+            <w:r>
+              <w:t>401/403 if access is invalid</w:t>
+            </w:r>
+          </w:p>
+        </w:tc>
+      </w:tr>
+      <w:tr>
+        <w:tc>
+          <w:tcPr>
+            <w:tcW w:w="1650" w:type="dxa"/>
+          </w:tcPr>
+          <w:p>
+            <w:r>
+              <w:lastRenderedPageBreak/>
+              <w:t>GET</w:t>
+            </w:r>
+          </w:p>
+        </w:tc>
+        <w:tc>
+          <w:tcPr>
+            <w:tcW w:w="1804" w:type="dxa"/>
+          </w:tcPr>
+          <w:p>
+            <w:r>
+              <w:t>/api/ events</w:t>
+            </w:r>
+          </w:p>
+        </w:tc>
+        <w:tc>
+          <w:tcPr>
+            <w:tcW w:w="3049" w:type="dxa"/>
+          </w:tcPr>
+          <w:p>
+            <w:r>
+              <w:t>Public</w:t>
+            </w:r>
+            <w:r>
+              <w:t xml:space="preserve"> views </w:t>
+            </w:r>
+            <w:r>
+              <w:t>a specific event</w:t>
+            </w:r>
+            <w:r>
+              <w:t xml:space="preserve"> detail</w:t>
+            </w:r>
+            <w:r>
+              <w:t>.</w:t>
+            </w:r>
+          </w:p>
+        </w:tc>
+        <w:tc>
+          <w:tcPr>
+            <w:tcW w:w="1746" w:type="dxa"/>
+          </w:tcPr>
+          <w:p>
+            <w:r>
+              <w:t>None</w:t>
+            </w:r>
+          </w:p>
+        </w:tc>
+        <w:tc>
+          <w:tcPr>
+            <w:tcW w:w="3098" w:type="dxa"/>
+          </w:tcPr>
+          <w:p>
+            <w:r>
+              <w:t>None</w:t>
+            </w:r>
+          </w:p>
+        </w:tc>
+        <w:tc>
+          <w:tcPr>
+            <w:tcW w:w="3249" w:type="dxa"/>
+          </w:tcPr>
+          <w:p>
+            <w:r>
+              <w:t>200 OK</w:t>
+            </w:r>
+          </w:p>
+        </w:tc>
+      </w:tr>
+      <w:tr>
+        <w:tc>
+          <w:tcPr>
+            <w:tcW w:w="1650" w:type="dxa"/>
+          </w:tcPr>
+          <w:p>
+            <w:r>
+              <w:t>GET</w:t>
+            </w:r>
+          </w:p>
+        </w:tc>
+        <w:tc>
+          <w:tcPr>
+            <w:tcW w:w="1804" w:type="dxa"/>
+          </w:tcPr>
+          <w:p>
+            <w:r>
+              <w:t>/api/ events</w:t>
+            </w:r>
+          </w:p>
+        </w:tc>
+        <w:tc>
+          <w:tcPr>
+            <w:tcW w:w="3049" w:type="dxa"/>
+          </w:tcPr>
+          <w:p>
+            <w:r>
+              <w:t>Public</w:t>
+            </w:r>
+            <w:r>
+              <w:t xml:space="preserve"> views </w:t>
+            </w:r>
+            <w:r>
+              <w:t>all</w:t>
+            </w:r>
+            <w:r>
+              <w:t xml:space="preserve"> event</w:t>
+            </w:r>
+            <w:r>
+              <w:t xml:space="preserve"> detail</w:t>
+            </w:r>
+            <w:r>
+              <w:t>.</w:t>
+            </w:r>
+          </w:p>
+        </w:tc>
+        <w:tc>
+          <w:tcPr>
+            <w:tcW w:w="1746" w:type="dxa"/>
+          </w:tcPr>
+          <w:p>
+            <w:r>
+              <w:t>None</w:t>
+            </w:r>
+          </w:p>
+        </w:tc>
+        <w:tc>
+          <w:tcPr>
+            <w:tcW w:w="3098" w:type="dxa"/>
+          </w:tcPr>
+          <w:p>
+            <w:r>
+              <w:t>None</w:t>
+            </w:r>
+          </w:p>
+        </w:tc>
+        <w:tc>
+          <w:tcPr>
+            <w:tcW w:w="3249" w:type="dxa"/>
+          </w:tcPr>
+          <w:p>
+            <w:r>
+              <w:t>200 OK</w:t>
+            </w:r>
+          </w:p>
         </w:tc>
       </w:tr>
     </w:tbl>

</xml_diff>

<commit_message>
feat: added Categories API functionality
Organiser creates/updates/deletes the RaceDay Categories and anyone can view the categories
</commit_message>
<xml_diff>
--- a/docs/RaceDay_ API Endpoint Planning.docx
+++ b/docs/RaceDay_ API Endpoint Planning.docx
@@ -101,7 +101,15 @@
           </w:tcPr>
           <w:p>
             <w:r>
-              <w:t>/api/</w:t>
+              <w:t>/</w:t>
+            </w:r>
+            <w:proofErr w:type="spellStart"/>
+            <w:r>
+              <w:t>api</w:t>
+            </w:r>
+            <w:proofErr w:type="spellEnd"/>
+            <w:r>
+              <w:t>/</w:t>
             </w:r>
             <w:r>
               <w:t>Participant</w:t>
@@ -148,17 +156,24 @@
             <w:r>
               <w:t xml:space="preserve">, </w:t>
             </w:r>
+            <w:proofErr w:type="spellStart"/>
             <w:r>
               <w:t>LastName</w:t>
             </w:r>
+            <w:proofErr w:type="spellEnd"/>
             <w:r>
               <w:t xml:space="preserve">, </w:t>
             </w:r>
+            <w:proofErr w:type="spellStart"/>
             <w:r>
               <w:t>cellnumbe</w:t>
             </w:r>
             <w:r>
-              <w:t xml:space="preserve">r, </w:t>
+              <w:t>r</w:t>
+            </w:r>
+            <w:proofErr w:type="spellEnd"/>
+            <w:r>
+              <w:t xml:space="preserve">, </w:t>
             </w:r>
             <w:r>
               <w:t>address</w:t>
@@ -199,7 +214,15 @@
           </w:tcPr>
           <w:p>
             <w:r>
-              <w:t>/api/</w:t>
+              <w:t>/</w:t>
+            </w:r>
+            <w:proofErr w:type="spellStart"/>
+            <w:r>
+              <w:t>api</w:t>
+            </w:r>
+            <w:proofErr w:type="spellEnd"/>
+            <w:r>
+              <w:t>/</w:t>
             </w:r>
             <w:r>
               <w:t>Organiser</w:t>
@@ -252,8 +275,13 @@
             <w:r>
               <w:t xml:space="preserve">, </w:t>
             </w:r>
-            <w:r>
-              <w:t>LastName, address</w:t>
+            <w:proofErr w:type="spellStart"/>
+            <w:r>
+              <w:t>LastName</w:t>
+            </w:r>
+            <w:proofErr w:type="spellEnd"/>
+            <w:r>
+              <w:t>, address</w:t>
             </w:r>
             <w:r>
               <w:t>}</w:t>
@@ -291,7 +319,15 @@
           </w:tcPr>
           <w:p>
             <w:r>
-              <w:t>/api/account</w:t>
+              <w:t>/</w:t>
+            </w:r>
+            <w:proofErr w:type="spellStart"/>
+            <w:r>
+              <w:t>api</w:t>
+            </w:r>
+            <w:proofErr w:type="spellEnd"/>
+            <w:r>
+              <w:t>/account</w:t>
             </w:r>
           </w:p>
         </w:tc>
@@ -324,7 +360,31 @@
           </w:tcPr>
           <w:p>
             <w:r>
-              <w:t>{ParticipantID/OrganiserID,     AuthenticationRole, email, Password}</w:t>
+              <w:t>{</w:t>
+            </w:r>
+            <w:proofErr w:type="spellStart"/>
+            <w:r>
+              <w:t>ParticipantID</w:t>
+            </w:r>
+            <w:proofErr w:type="spellEnd"/>
+            <w:r>
+              <w:t>/</w:t>
+            </w:r>
+            <w:proofErr w:type="spellStart"/>
+            <w:r>
+              <w:t>OrganiserID</w:t>
+            </w:r>
+            <w:proofErr w:type="spellEnd"/>
+            <w:r>
+              <w:t xml:space="preserve">,     </w:t>
+            </w:r>
+            <w:proofErr w:type="spellStart"/>
+            <w:r>
+              <w:t>AuthenticationRole</w:t>
+            </w:r>
+            <w:proofErr w:type="spellEnd"/>
+            <w:r>
+              <w:t>, email, Password}</w:t>
             </w:r>
           </w:p>
         </w:tc>
@@ -356,7 +416,15 @@
           </w:tcPr>
           <w:p>
             <w:r>
-              <w:t>/api/auth/login</w:t>
+              <w:t>/</w:t>
+            </w:r>
+            <w:proofErr w:type="spellStart"/>
+            <w:r>
+              <w:t>api</w:t>
+            </w:r>
+            <w:proofErr w:type="spellEnd"/>
+            <w:r>
+              <w:t>/auth/login</w:t>
             </w:r>
           </w:p>
         </w:tc>
@@ -518,7 +586,15 @@
           </w:tcPr>
           <w:p>
             <w:r>
-              <w:t>/api/</w:t>
+              <w:t>/</w:t>
+            </w:r>
+            <w:proofErr w:type="spellStart"/>
+            <w:r>
+              <w:t>api</w:t>
+            </w:r>
+            <w:proofErr w:type="spellEnd"/>
+            <w:r>
+              <w:t>/</w:t>
             </w:r>
             <w:r>
               <w:t>account</w:t>
@@ -589,7 +665,15 @@
           </w:tcPr>
           <w:p>
             <w:r>
-              <w:t>/api/account</w:t>
+              <w:t>/</w:t>
+            </w:r>
+            <w:proofErr w:type="spellStart"/>
+            <w:r>
+              <w:t>api</w:t>
+            </w:r>
+            <w:proofErr w:type="spellEnd"/>
+            <w:r>
+              <w:t>/account</w:t>
             </w:r>
           </w:p>
         </w:tc>
@@ -660,7 +744,15 @@
           </w:tcPr>
           <w:p>
             <w:r>
-              <w:t>/api/account</w:t>
+              <w:t>/</w:t>
+            </w:r>
+            <w:proofErr w:type="spellStart"/>
+            <w:r>
+              <w:t>api</w:t>
+            </w:r>
+            <w:proofErr w:type="spellEnd"/>
+            <w:r>
+              <w:t>/account</w:t>
             </w:r>
           </w:p>
         </w:tc>
@@ -696,7 +788,23 @@
           </w:tcPr>
           <w:p>
             <w:r>
-              <w:t xml:space="preserve">{FirstName, LastName, cellnumber, </w:t>
+              <w:t xml:space="preserve">{FirstName, </w:t>
+            </w:r>
+            <w:proofErr w:type="spellStart"/>
+            <w:r>
+              <w:t>LastName</w:t>
+            </w:r>
+            <w:proofErr w:type="spellEnd"/>
+            <w:r>
+              <w:t xml:space="preserve">, </w:t>
+            </w:r>
+            <w:proofErr w:type="spellStart"/>
+            <w:r>
+              <w:t>cellnumber</w:t>
+            </w:r>
+            <w:proofErr w:type="spellEnd"/>
+            <w:r>
+              <w:t xml:space="preserve">, </w:t>
             </w:r>
             <w:r>
               <w:t>A</w:t>
@@ -724,6 +832,9 @@
         </w:tc>
       </w:tr>
       <w:tr>
+        <w:trPr>
+          <w:trHeight w:val="623"/>
+        </w:trPr>
         <w:tc>
           <w:tcPr>
             <w:tcW w:w="1650" w:type="dxa"/>
@@ -740,7 +851,15 @@
           </w:tcPr>
           <w:p>
             <w:r>
-              <w:t>/api/account</w:t>
+              <w:t>/</w:t>
+            </w:r>
+            <w:proofErr w:type="spellStart"/>
+            <w:r>
+              <w:t>api</w:t>
+            </w:r>
+            <w:proofErr w:type="spellEnd"/>
+            <w:r>
+              <w:t>/account</w:t>
             </w:r>
           </w:p>
         </w:tc>
@@ -776,7 +895,15 @@
           </w:tcPr>
           <w:p>
             <w:r>
-              <w:t>{FirstName, LastName, Address, Email}</w:t>
+              <w:t xml:space="preserve">{FirstName, </w:t>
+            </w:r>
+            <w:proofErr w:type="spellStart"/>
+            <w:r>
+              <w:t>LastName</w:t>
+            </w:r>
+            <w:proofErr w:type="spellEnd"/>
+            <w:r>
+              <w:t>, Address, Email}</w:t>
             </w:r>
           </w:p>
         </w:tc>
@@ -811,7 +938,15 @@
           </w:tcPr>
           <w:p>
             <w:r>
-              <w:t>/api/ events</w:t>
+              <w:t>/</w:t>
+            </w:r>
+            <w:proofErr w:type="spellStart"/>
+            <w:r>
+              <w:t>api</w:t>
+            </w:r>
+            <w:proofErr w:type="spellEnd"/>
+            <w:r>
+              <w:t>/ events</w:t>
             </w:r>
           </w:p>
         </w:tc>
@@ -821,7 +956,15 @@
           </w:tcPr>
           <w:p>
             <w:r>
-              <w:t>Creates a new RaceDay event</w:t>
+              <w:t xml:space="preserve">Creates a new </w:t>
+            </w:r>
+            <w:proofErr w:type="spellStart"/>
+            <w:r>
+              <w:t>RaceDay</w:t>
+            </w:r>
+            <w:proofErr w:type="spellEnd"/>
+            <w:r>
+              <w:t xml:space="preserve"> event</w:t>
             </w:r>
             <w:r>
               <w:t>.</w:t>
@@ -846,14 +989,24 @@
             <w:r>
               <w:t>{</w:t>
             </w:r>
-            <w:r>
-              <w:t>OrganiserID,</w:t>
+            <w:proofErr w:type="spellStart"/>
+            <w:r>
+              <w:t>OrganiserID</w:t>
+            </w:r>
+            <w:proofErr w:type="spellEnd"/>
+            <w:r>
+              <w:t>,</w:t>
             </w:r>
             <w:r>
               <w:t xml:space="preserve"> </w:t>
             </w:r>
-            <w:r>
-              <w:t>EventName,</w:t>
+            <w:proofErr w:type="spellStart"/>
+            <w:r>
+              <w:t>EventName</w:t>
+            </w:r>
+            <w:proofErr w:type="spellEnd"/>
+            <w:r>
+              <w:t>,</w:t>
             </w:r>
             <w:r>
               <w:t xml:space="preserve"> </w:t>
@@ -864,20 +1017,35 @@
             <w:r>
               <w:t xml:space="preserve"> </w:t>
             </w:r>
-            <w:r>
-              <w:t>EventType,</w:t>
+            <w:proofErr w:type="spellStart"/>
+            <w:r>
+              <w:t>EventType</w:t>
+            </w:r>
+            <w:proofErr w:type="spellEnd"/>
+            <w:r>
+              <w:t>,</w:t>
             </w:r>
             <w:r>
               <w:t xml:space="preserve"> </w:t>
             </w:r>
-            <w:r>
-              <w:t>EventDate,</w:t>
+            <w:proofErr w:type="spellStart"/>
+            <w:r>
+              <w:t>EventDate</w:t>
+            </w:r>
+            <w:proofErr w:type="spellEnd"/>
+            <w:r>
+              <w:t>,</w:t>
             </w:r>
             <w:r>
               <w:t xml:space="preserve"> </w:t>
             </w:r>
-            <w:r>
-              <w:t>EventDuration,</w:t>
+            <w:proofErr w:type="spellStart"/>
+            <w:r>
+              <w:t>EventDuration</w:t>
+            </w:r>
+            <w:proofErr w:type="spellEnd"/>
+            <w:r>
+              <w:t>,</w:t>
             </w:r>
             <w:r>
               <w:t xml:space="preserve"> </w:t>
@@ -930,7 +1098,15 @@
           </w:tcPr>
           <w:p>
             <w:r>
-              <w:t>/api/ events</w:t>
+              <w:t>/</w:t>
+            </w:r>
+            <w:proofErr w:type="spellStart"/>
+            <w:r>
+              <w:t>api</w:t>
+            </w:r>
+            <w:proofErr w:type="spellEnd"/>
+            <w:r>
+              <w:t>/ events</w:t>
             </w:r>
           </w:p>
         </w:tc>
@@ -974,32 +1150,57 @@
             <w:r>
               <w:t>{</w:t>
             </w:r>
-            <w:r>
-              <w:t>OrganiserID,</w:t>
+            <w:proofErr w:type="spellStart"/>
+            <w:r>
+              <w:t>OrganiserID</w:t>
+            </w:r>
+            <w:proofErr w:type="spellEnd"/>
+            <w:r>
+              <w:t>,</w:t>
             </w:r>
             <w:r>
               <w:t xml:space="preserve"> </w:t>
             </w:r>
-            <w:r>
-              <w:t>EventName, Description,</w:t>
+            <w:proofErr w:type="spellStart"/>
+            <w:r>
+              <w:t>EventName</w:t>
+            </w:r>
+            <w:proofErr w:type="spellEnd"/>
+            <w:r>
+              <w:t>, Description,</w:t>
             </w:r>
             <w:r>
               <w:t xml:space="preserve"> </w:t>
             </w:r>
-            <w:r>
-              <w:t>EventType,</w:t>
+            <w:proofErr w:type="spellStart"/>
+            <w:r>
+              <w:t>EventType</w:t>
+            </w:r>
+            <w:proofErr w:type="spellEnd"/>
+            <w:r>
+              <w:t>,</w:t>
             </w:r>
             <w:r>
               <w:t xml:space="preserve"> </w:t>
             </w:r>
-            <w:r>
-              <w:t>EventDate,</w:t>
+            <w:proofErr w:type="spellStart"/>
+            <w:r>
+              <w:t>EventDate</w:t>
+            </w:r>
+            <w:proofErr w:type="spellEnd"/>
+            <w:r>
+              <w:t>,</w:t>
             </w:r>
             <w:r>
               <w:t xml:space="preserve"> </w:t>
             </w:r>
-            <w:r>
-              <w:t>EventDuration,</w:t>
+            <w:proofErr w:type="spellStart"/>
+            <w:r>
+              <w:t>EventDuration</w:t>
+            </w:r>
+            <w:proofErr w:type="spellEnd"/>
+            <w:r>
+              <w:t>,</w:t>
             </w:r>
             <w:r>
               <w:t xml:space="preserve"> </w:t>
@@ -1048,6 +1249,7 @@
           </w:tcPr>
           <w:p>
             <w:r>
+              <w:lastRenderedPageBreak/>
               <w:t>DELETE</w:t>
             </w:r>
           </w:p>
@@ -1058,7 +1260,15 @@
           </w:tcPr>
           <w:p>
             <w:r>
-              <w:t>/api/ events</w:t>
+              <w:t>/</w:t>
+            </w:r>
+            <w:proofErr w:type="spellStart"/>
+            <w:r>
+              <w:t>api</w:t>
+            </w:r>
+            <w:proofErr w:type="spellEnd"/>
+            <w:r>
+              <w:t>/ events</w:t>
             </w:r>
           </w:p>
         </w:tc>
@@ -1134,7 +1344,6 @@
           </w:tcPr>
           <w:p>
             <w:r>
-              <w:lastRenderedPageBreak/>
               <w:t>GET</w:t>
             </w:r>
           </w:p>
@@ -1145,7 +1354,15 @@
           </w:tcPr>
           <w:p>
             <w:r>
-              <w:t>/api/ events</w:t>
+              <w:t>/</w:t>
+            </w:r>
+            <w:proofErr w:type="spellStart"/>
+            <w:r>
+              <w:t>api</w:t>
+            </w:r>
+            <w:proofErr w:type="spellEnd"/>
+            <w:r>
+              <w:t>/ events</w:t>
             </w:r>
           </w:p>
         </w:tc>
@@ -1219,7 +1436,15 @@
           </w:tcPr>
           <w:p>
             <w:r>
-              <w:t>/api/ events</w:t>
+              <w:t>/</w:t>
+            </w:r>
+            <w:proofErr w:type="spellStart"/>
+            <w:r>
+              <w:t>api</w:t>
+            </w:r>
+            <w:proofErr w:type="spellEnd"/>
+            <w:r>
+              <w:t>/ events</w:t>
             </w:r>
           </w:p>
         </w:tc>
@@ -1242,6 +1467,448 @@
             </w:r>
             <w:r>
               <w:t xml:space="preserve"> detail</w:t>
+            </w:r>
+            <w:r>
+              <w:t>s</w:t>
+            </w:r>
+            <w:r>
+              <w:t>.</w:t>
+            </w:r>
+          </w:p>
+        </w:tc>
+        <w:tc>
+          <w:tcPr>
+            <w:tcW w:w="1746" w:type="dxa"/>
+          </w:tcPr>
+          <w:p>
+            <w:r>
+              <w:t>None</w:t>
+            </w:r>
+          </w:p>
+        </w:tc>
+        <w:tc>
+          <w:tcPr>
+            <w:tcW w:w="3098" w:type="dxa"/>
+          </w:tcPr>
+          <w:p>
+            <w:r>
+              <w:t>None</w:t>
+            </w:r>
+          </w:p>
+        </w:tc>
+        <w:tc>
+          <w:tcPr>
+            <w:tcW w:w="3249" w:type="dxa"/>
+          </w:tcPr>
+          <w:p>
+            <w:r>
+              <w:t>200 OK</w:t>
+            </w:r>
+          </w:p>
+        </w:tc>
+      </w:tr>
+      <w:tr>
+        <w:tc>
+          <w:tcPr>
+            <w:tcW w:w="1650" w:type="dxa"/>
+          </w:tcPr>
+          <w:p>
+            <w:r>
+              <w:t>P</w:t>
+            </w:r>
+            <w:r>
+              <w:t>OST</w:t>
+            </w:r>
+          </w:p>
+        </w:tc>
+        <w:tc>
+          <w:tcPr>
+            <w:tcW w:w="1804" w:type="dxa"/>
+          </w:tcPr>
+          <w:p>
+            <w:r>
+              <w:t>/</w:t>
+            </w:r>
+            <w:proofErr w:type="spellStart"/>
+            <w:r>
+              <w:t>api</w:t>
+            </w:r>
+            <w:proofErr w:type="spellEnd"/>
+            <w:r>
+              <w:t>/</w:t>
+            </w:r>
+            <w:r>
+              <w:t>Category</w:t>
+            </w:r>
+          </w:p>
+        </w:tc>
+        <w:tc>
+          <w:tcPr>
+            <w:tcW w:w="3049" w:type="dxa"/>
+          </w:tcPr>
+          <w:p>
+            <w:r>
+              <w:t>Organiser</w:t>
+            </w:r>
+            <w:r>
+              <w:t xml:space="preserve"> c</w:t>
+            </w:r>
+            <w:r>
+              <w:t xml:space="preserve">reates a new </w:t>
+            </w:r>
+            <w:proofErr w:type="spellStart"/>
+            <w:r>
+              <w:t>RaceDay</w:t>
+            </w:r>
+            <w:proofErr w:type="spellEnd"/>
+            <w:r>
+              <w:t xml:space="preserve"> </w:t>
+            </w:r>
+            <w:r>
+              <w:t>category</w:t>
+            </w:r>
+          </w:p>
+        </w:tc>
+        <w:tc>
+          <w:tcPr>
+            <w:tcW w:w="1746" w:type="dxa"/>
+          </w:tcPr>
+          <w:p>
+            <w:r>
+              <w:t>Organiser</w:t>
+            </w:r>
+          </w:p>
+        </w:tc>
+        <w:tc>
+          <w:tcPr>
+            <w:tcW w:w="3098" w:type="dxa"/>
+          </w:tcPr>
+          <w:p>
+            <w:r>
+              <w:t>{</w:t>
+            </w:r>
+            <w:proofErr w:type="spellStart"/>
+            <w:r>
+              <w:t>EventID</w:t>
+            </w:r>
+            <w:proofErr w:type="spellEnd"/>
+            <w:r>
+              <w:t xml:space="preserve">, </w:t>
+            </w:r>
+            <w:proofErr w:type="spellStart"/>
+            <w:r>
+              <w:t>CategoryName</w:t>
+            </w:r>
+            <w:proofErr w:type="spellEnd"/>
+            <w:r>
+              <w:t xml:space="preserve">, </w:t>
+            </w:r>
+            <w:proofErr w:type="spellStart"/>
+            <w:r>
+              <w:t>MinAge</w:t>
+            </w:r>
+            <w:proofErr w:type="spellEnd"/>
+            <w:r>
+              <w:t xml:space="preserve">, </w:t>
+            </w:r>
+            <w:proofErr w:type="spellStart"/>
+            <w:r>
+              <w:t>MaxAge</w:t>
+            </w:r>
+            <w:proofErr w:type="spellEnd"/>
+            <w:r>
+              <w:t>}</w:t>
+            </w:r>
+          </w:p>
+        </w:tc>
+        <w:tc>
+          <w:tcPr>
+            <w:tcW w:w="3249" w:type="dxa"/>
+          </w:tcPr>
+          <w:p>
+            <w:r>
+              <w:t>201 Created; 400 Bad Request;</w:t>
+            </w:r>
+            <w:r>
+              <w:t xml:space="preserve"> </w:t>
+            </w:r>
+            <w:r>
+              <w:t>401/403 if access is invalid</w:t>
+            </w:r>
+          </w:p>
+        </w:tc>
+      </w:tr>
+      <w:tr>
+        <w:tc>
+          <w:tcPr>
+            <w:tcW w:w="1650" w:type="dxa"/>
+          </w:tcPr>
+          <w:p>
+            <w:r>
+              <w:t>PUT</w:t>
+            </w:r>
+          </w:p>
+        </w:tc>
+        <w:tc>
+          <w:tcPr>
+            <w:tcW w:w="1804" w:type="dxa"/>
+          </w:tcPr>
+          <w:p>
+            <w:r>
+              <w:t>/</w:t>
+            </w:r>
+            <w:proofErr w:type="spellStart"/>
+            <w:r>
+              <w:t>api</w:t>
+            </w:r>
+            <w:proofErr w:type="spellEnd"/>
+            <w:r>
+              <w:t>/Category</w:t>
+            </w:r>
+          </w:p>
+        </w:tc>
+        <w:tc>
+          <w:tcPr>
+            <w:tcW w:w="3049" w:type="dxa"/>
+          </w:tcPr>
+          <w:p>
+            <w:r>
+              <w:t>Organiser</w:t>
+            </w:r>
+            <w:r>
+              <w:t xml:space="preserve"> updates the</w:t>
+            </w:r>
+            <w:r>
+              <w:t xml:space="preserve"> category</w:t>
+            </w:r>
+            <w:r>
+              <w:t xml:space="preserve"> details</w:t>
+            </w:r>
+            <w:r>
+              <w:t>.</w:t>
+            </w:r>
+          </w:p>
+        </w:tc>
+        <w:tc>
+          <w:tcPr>
+            <w:tcW w:w="1746" w:type="dxa"/>
+          </w:tcPr>
+          <w:p>
+            <w:r>
+              <w:t>Organiser</w:t>
+            </w:r>
+          </w:p>
+        </w:tc>
+        <w:tc>
+          <w:tcPr>
+            <w:tcW w:w="3098" w:type="dxa"/>
+          </w:tcPr>
+          <w:p>
+            <w:r>
+              <w:t>{</w:t>
+            </w:r>
+            <w:proofErr w:type="spellStart"/>
+            <w:r>
+              <w:t>EventID</w:t>
+            </w:r>
+            <w:proofErr w:type="spellEnd"/>
+            <w:r>
+              <w:t xml:space="preserve">, </w:t>
+            </w:r>
+            <w:proofErr w:type="spellStart"/>
+            <w:r>
+              <w:t>CategoryName</w:t>
+            </w:r>
+            <w:proofErr w:type="spellEnd"/>
+            <w:r>
+              <w:t xml:space="preserve">, </w:t>
+            </w:r>
+            <w:proofErr w:type="spellStart"/>
+            <w:r>
+              <w:t>MinAge</w:t>
+            </w:r>
+            <w:proofErr w:type="spellEnd"/>
+            <w:r>
+              <w:t xml:space="preserve">, </w:t>
+            </w:r>
+            <w:proofErr w:type="spellStart"/>
+            <w:r>
+              <w:t>MaxAge</w:t>
+            </w:r>
+            <w:proofErr w:type="spellEnd"/>
+            <w:r>
+              <w:t>}</w:t>
+            </w:r>
+          </w:p>
+        </w:tc>
+        <w:tc>
+          <w:tcPr>
+            <w:tcW w:w="3249" w:type="dxa"/>
+          </w:tcPr>
+          <w:p>
+            <w:r>
+              <w:t xml:space="preserve">200 OK; </w:t>
+            </w:r>
+            <w:r>
+              <w:t>400 Bad Request;</w:t>
+            </w:r>
+            <w:r>
+              <w:t xml:space="preserve"> </w:t>
+            </w:r>
+            <w:r>
+              <w:t>401/403 if access is invalid</w:t>
+            </w:r>
+          </w:p>
+        </w:tc>
+      </w:tr>
+      <w:tr>
+        <w:tc>
+          <w:tcPr>
+            <w:tcW w:w="1650" w:type="dxa"/>
+          </w:tcPr>
+          <w:p>
+            <w:r>
+              <w:t>DELETE</w:t>
+            </w:r>
+          </w:p>
+        </w:tc>
+        <w:tc>
+          <w:tcPr>
+            <w:tcW w:w="1804" w:type="dxa"/>
+          </w:tcPr>
+          <w:p>
+            <w:r>
+              <w:t>/</w:t>
+            </w:r>
+            <w:proofErr w:type="spellStart"/>
+            <w:r>
+              <w:t>api</w:t>
+            </w:r>
+            <w:proofErr w:type="spellEnd"/>
+            <w:r>
+              <w:t>/Category</w:t>
+            </w:r>
+          </w:p>
+        </w:tc>
+        <w:tc>
+          <w:tcPr>
+            <w:tcW w:w="3049" w:type="dxa"/>
+          </w:tcPr>
+          <w:p>
+            <w:r>
+              <w:t>Organiser</w:t>
+            </w:r>
+            <w:r>
+              <w:t xml:space="preserve"> </w:t>
+            </w:r>
+            <w:r>
+              <w:t>deletes</w:t>
+            </w:r>
+            <w:r>
+              <w:t xml:space="preserve"> the</w:t>
+            </w:r>
+            <w:r>
+              <w:t xml:space="preserve"> </w:t>
+            </w:r>
+            <w:r>
+              <w:t>category</w:t>
+            </w:r>
+            <w:r>
+              <w:t>.</w:t>
+            </w:r>
+          </w:p>
+        </w:tc>
+        <w:tc>
+          <w:tcPr>
+            <w:tcW w:w="1746" w:type="dxa"/>
+          </w:tcPr>
+          <w:p>
+            <w:r>
+              <w:t>Organiser</w:t>
+            </w:r>
+          </w:p>
+        </w:tc>
+        <w:tc>
+          <w:tcPr>
+            <w:tcW w:w="3098" w:type="dxa"/>
+          </w:tcPr>
+          <w:p>
+            <w:r>
+              <w:t xml:space="preserve">None </w:t>
+            </w:r>
+          </w:p>
+        </w:tc>
+        <w:tc>
+          <w:tcPr>
+            <w:tcW w:w="3249" w:type="dxa"/>
+          </w:tcPr>
+          <w:p>
+            <w:r>
+              <w:t xml:space="preserve">200 OK; </w:t>
+            </w:r>
+            <w:r>
+              <w:t>400 Bad Request;</w:t>
+            </w:r>
+            <w:r>
+              <w:t xml:space="preserve"> </w:t>
+            </w:r>
+            <w:r>
+              <w:t>401/403 if access is invalid</w:t>
+            </w:r>
+          </w:p>
+        </w:tc>
+      </w:tr>
+      <w:tr>
+        <w:tc>
+          <w:tcPr>
+            <w:tcW w:w="1650" w:type="dxa"/>
+          </w:tcPr>
+          <w:p>
+            <w:r>
+              <w:t>GET</w:t>
+            </w:r>
+          </w:p>
+        </w:tc>
+        <w:tc>
+          <w:tcPr>
+            <w:tcW w:w="1804" w:type="dxa"/>
+          </w:tcPr>
+          <w:p>
+            <w:r>
+              <w:t>/</w:t>
+            </w:r>
+            <w:proofErr w:type="spellStart"/>
+            <w:r>
+              <w:t>api</w:t>
+            </w:r>
+            <w:proofErr w:type="spellEnd"/>
+            <w:r>
+              <w:t>/Category</w:t>
+            </w:r>
+          </w:p>
+        </w:tc>
+        <w:tc>
+          <w:tcPr>
+            <w:tcW w:w="3049" w:type="dxa"/>
+          </w:tcPr>
+          <w:p>
+            <w:r>
+              <w:t>Public</w:t>
+            </w:r>
+            <w:r>
+              <w:t xml:space="preserve"> views </w:t>
+            </w:r>
+            <w:r>
+              <w:t xml:space="preserve">all </w:t>
+            </w:r>
+            <w:r>
+              <w:t xml:space="preserve">category </w:t>
+            </w:r>
+            <w:r>
+              <w:t>detail</w:t>
+            </w:r>
+            <w:r>
+              <w:t>s</w:t>
             </w:r>
             <w:r>
               <w:t>.</w:t>

</xml_diff>

<commit_message>
feat: Added Event Enrolment API Functionality
Participant can enroll for an event, view their enrolment, organisers can view the enrolments for the event. Organiser can record the relationship between Participant, Event and Category
</commit_message>
<xml_diff>
--- a/docs/RaceDay_ API Endpoint Planning.docx
+++ b/docs/RaceDay_ API Endpoint Planning.docx
@@ -9,12 +9,12 @@
         <w:tblLook w:val="04A0" w:firstRow="1" w:lastRow="0" w:firstColumn="1" w:lastColumn="0" w:noHBand="0" w:noVBand="1"/>
       </w:tblPr>
       <w:tblGrid>
-        <w:gridCol w:w="1650"/>
-        <w:gridCol w:w="1804"/>
-        <w:gridCol w:w="3049"/>
-        <w:gridCol w:w="1746"/>
+        <w:gridCol w:w="1481"/>
+        <w:gridCol w:w="3165"/>
+        <w:gridCol w:w="2619"/>
+        <w:gridCol w:w="1643"/>
         <w:gridCol w:w="3098"/>
-        <w:gridCol w:w="3249"/>
+        <w:gridCol w:w="2590"/>
       </w:tblGrid>
       <w:tr>
         <w:trPr>
@@ -22,7 +22,7 @@
         </w:trPr>
         <w:tc>
           <w:tcPr>
-            <w:tcW w:w="1650" w:type="dxa"/>
+            <w:tcW w:w="1481" w:type="dxa"/>
           </w:tcPr>
           <w:p>
             <w:r>
@@ -32,7 +32,7 @@
         </w:tc>
         <w:tc>
           <w:tcPr>
-            <w:tcW w:w="1804" w:type="dxa"/>
+            <w:tcW w:w="3165" w:type="dxa"/>
           </w:tcPr>
           <w:p>
             <w:r>
@@ -42,7 +42,7 @@
         </w:tc>
         <w:tc>
           <w:tcPr>
-            <w:tcW w:w="3049" w:type="dxa"/>
+            <w:tcW w:w="2619" w:type="dxa"/>
           </w:tcPr>
           <w:p>
             <w:r>
@@ -52,7 +52,7 @@
         </w:tc>
         <w:tc>
           <w:tcPr>
-            <w:tcW w:w="1746" w:type="dxa"/>
+            <w:tcW w:w="1643" w:type="dxa"/>
           </w:tcPr>
           <w:p>
             <w:r>
@@ -72,7 +72,7 @@
         </w:tc>
         <w:tc>
           <w:tcPr>
-            <w:tcW w:w="3249" w:type="dxa"/>
+            <w:tcW w:w="2590" w:type="dxa"/>
           </w:tcPr>
           <w:p>
             <w:r>
@@ -87,7 +87,7 @@
         </w:trPr>
         <w:tc>
           <w:tcPr>
-            <w:tcW w:w="1650" w:type="dxa"/>
+            <w:tcW w:w="1481" w:type="dxa"/>
           </w:tcPr>
           <w:p>
             <w:r>
@@ -97,7 +97,7 @@
         </w:tc>
         <w:tc>
           <w:tcPr>
-            <w:tcW w:w="1804" w:type="dxa"/>
+            <w:tcW w:w="3165" w:type="dxa"/>
           </w:tcPr>
           <w:p>
             <w:r>
@@ -118,7 +118,7 @@
         </w:tc>
         <w:tc>
           <w:tcPr>
-            <w:tcW w:w="3049" w:type="dxa"/>
+            <w:tcW w:w="2619" w:type="dxa"/>
           </w:tcPr>
           <w:p>
             <w:r>
@@ -134,7 +134,7 @@
         </w:tc>
         <w:tc>
           <w:tcPr>
-            <w:tcW w:w="1746" w:type="dxa"/>
+            <w:tcW w:w="1643" w:type="dxa"/>
           </w:tcPr>
           <w:p>
             <w:r>
@@ -185,7 +185,7 @@
         </w:tc>
         <w:tc>
           <w:tcPr>
-            <w:tcW w:w="3249" w:type="dxa"/>
+            <w:tcW w:w="2590" w:type="dxa"/>
           </w:tcPr>
           <w:p>
             <w:r>
@@ -200,7 +200,7 @@
         </w:trPr>
         <w:tc>
           <w:tcPr>
-            <w:tcW w:w="1650" w:type="dxa"/>
+            <w:tcW w:w="1481" w:type="dxa"/>
           </w:tcPr>
           <w:p>
             <w:r>
@@ -210,7 +210,7 @@
         </w:tc>
         <w:tc>
           <w:tcPr>
-            <w:tcW w:w="1804" w:type="dxa"/>
+            <w:tcW w:w="3165" w:type="dxa"/>
           </w:tcPr>
           <w:p>
             <w:r>
@@ -231,7 +231,7 @@
         </w:tc>
         <w:tc>
           <w:tcPr>
-            <w:tcW w:w="3049" w:type="dxa"/>
+            <w:tcW w:w="2619" w:type="dxa"/>
           </w:tcPr>
           <w:p>
             <w:r>
@@ -253,7 +253,7 @@
         </w:tc>
         <w:tc>
           <w:tcPr>
-            <w:tcW w:w="1746" w:type="dxa"/>
+            <w:tcW w:w="1643" w:type="dxa"/>
           </w:tcPr>
           <w:p>
             <w:r>
@@ -290,7 +290,7 @@
         </w:tc>
         <w:tc>
           <w:tcPr>
-            <w:tcW w:w="3249" w:type="dxa"/>
+            <w:tcW w:w="2590" w:type="dxa"/>
           </w:tcPr>
           <w:p>
             <w:r>
@@ -305,7 +305,7 @@
         </w:trPr>
         <w:tc>
           <w:tcPr>
-            <w:tcW w:w="1650" w:type="dxa"/>
+            <w:tcW w:w="1481" w:type="dxa"/>
           </w:tcPr>
           <w:p>
             <w:r>
@@ -315,7 +315,7 @@
         </w:tc>
         <w:tc>
           <w:tcPr>
-            <w:tcW w:w="1804" w:type="dxa"/>
+            <w:tcW w:w="3165" w:type="dxa"/>
           </w:tcPr>
           <w:p>
             <w:r>
@@ -333,7 +333,7 @@
         </w:tc>
         <w:tc>
           <w:tcPr>
-            <w:tcW w:w="3049" w:type="dxa"/>
+            <w:tcW w:w="2619" w:type="dxa"/>
           </w:tcPr>
           <w:p>
             <w:r>
@@ -346,7 +346,7 @@
         </w:tc>
         <w:tc>
           <w:tcPr>
-            <w:tcW w:w="1746" w:type="dxa"/>
+            <w:tcW w:w="1643" w:type="dxa"/>
           </w:tcPr>
           <w:p>
             <w:r>
@@ -390,7 +390,7 @@
         </w:tc>
         <w:tc>
           <w:tcPr>
-            <w:tcW w:w="3249" w:type="dxa"/>
+            <w:tcW w:w="2590" w:type="dxa"/>
           </w:tcPr>
           <w:p>
             <w:r>
@@ -402,7 +402,7 @@
       <w:tr>
         <w:tc>
           <w:tcPr>
-            <w:tcW w:w="1650" w:type="dxa"/>
+            <w:tcW w:w="1481" w:type="dxa"/>
           </w:tcPr>
           <w:p>
             <w:r>
@@ -412,7 +412,7 @@
         </w:tc>
         <w:tc>
           <w:tcPr>
-            <w:tcW w:w="1804" w:type="dxa"/>
+            <w:tcW w:w="3165" w:type="dxa"/>
           </w:tcPr>
           <w:p>
             <w:r>
@@ -430,7 +430,7 @@
         </w:tc>
         <w:tc>
           <w:tcPr>
-            <w:tcW w:w="3049" w:type="dxa"/>
+            <w:tcW w:w="2619" w:type="dxa"/>
           </w:tcPr>
           <w:p>
             <w:r>
@@ -455,7 +455,7 @@
         </w:tc>
         <w:tc>
           <w:tcPr>
-            <w:tcW w:w="1746" w:type="dxa"/>
+            <w:tcW w:w="1643" w:type="dxa"/>
           </w:tcPr>
           <w:tbl>
             <w:tblPr>
@@ -514,7 +514,7 @@
               <w:tblLook w:val="04A0" w:firstRow="1" w:lastRow="0" w:firstColumn="1" w:lastColumn="0" w:noHBand="0" w:noVBand="1"/>
             </w:tblPr>
             <w:tblGrid>
-              <w:gridCol w:w="1530"/>
+              <w:gridCol w:w="1427"/>
             </w:tblGrid>
             <w:tr>
               <w:trPr>
@@ -560,7 +560,7 @@
         </w:tc>
         <w:tc>
           <w:tcPr>
-            <w:tcW w:w="3249" w:type="dxa"/>
+            <w:tcW w:w="2590" w:type="dxa"/>
           </w:tcPr>
           <w:p>
             <w:r>
@@ -572,7 +572,7 @@
       <w:tr>
         <w:tc>
           <w:tcPr>
-            <w:tcW w:w="1650" w:type="dxa"/>
+            <w:tcW w:w="1481" w:type="dxa"/>
           </w:tcPr>
           <w:p>
             <w:r>
@@ -582,7 +582,7 @@
         </w:tc>
         <w:tc>
           <w:tcPr>
-            <w:tcW w:w="1804" w:type="dxa"/>
+            <w:tcW w:w="3165" w:type="dxa"/>
           </w:tcPr>
           <w:p>
             <w:r>
@@ -603,7 +603,7 @@
         </w:tc>
         <w:tc>
           <w:tcPr>
-            <w:tcW w:w="3049" w:type="dxa"/>
+            <w:tcW w:w="2619" w:type="dxa"/>
           </w:tcPr>
           <w:p>
             <w:r>
@@ -616,7 +616,7 @@
         </w:tc>
         <w:tc>
           <w:tcPr>
-            <w:tcW w:w="1746" w:type="dxa"/>
+            <w:tcW w:w="1643" w:type="dxa"/>
           </w:tcPr>
           <w:p>
             <w:r>
@@ -639,7 +639,7 @@
         </w:tc>
         <w:tc>
           <w:tcPr>
-            <w:tcW w:w="3249" w:type="dxa"/>
+            <w:tcW w:w="2590" w:type="dxa"/>
           </w:tcPr>
           <w:p>
             <w:r>
@@ -651,7 +651,7 @@
       <w:tr>
         <w:tc>
           <w:tcPr>
-            <w:tcW w:w="1650" w:type="dxa"/>
+            <w:tcW w:w="1481" w:type="dxa"/>
           </w:tcPr>
           <w:p>
             <w:r>
@@ -661,7 +661,7 @@
         </w:tc>
         <w:tc>
           <w:tcPr>
-            <w:tcW w:w="1804" w:type="dxa"/>
+            <w:tcW w:w="3165" w:type="dxa"/>
           </w:tcPr>
           <w:p>
             <w:r>
@@ -679,7 +679,7 @@
         </w:tc>
         <w:tc>
           <w:tcPr>
-            <w:tcW w:w="3049" w:type="dxa"/>
+            <w:tcW w:w="2619" w:type="dxa"/>
           </w:tcPr>
           <w:p>
             <w:r>
@@ -695,7 +695,7 @@
         </w:tc>
         <w:tc>
           <w:tcPr>
-            <w:tcW w:w="1746" w:type="dxa"/>
+            <w:tcW w:w="1643" w:type="dxa"/>
           </w:tcPr>
           <w:p>
             <w:r>
@@ -718,7 +718,7 @@
         </w:tc>
         <w:tc>
           <w:tcPr>
-            <w:tcW w:w="3249" w:type="dxa"/>
+            <w:tcW w:w="2590" w:type="dxa"/>
           </w:tcPr>
           <w:p>
             <w:r>
@@ -730,7 +730,7 @@
       <w:tr>
         <w:tc>
           <w:tcPr>
-            <w:tcW w:w="1650" w:type="dxa"/>
+            <w:tcW w:w="1481" w:type="dxa"/>
           </w:tcPr>
           <w:p>
             <w:r>
@@ -740,7 +740,7 @@
         </w:tc>
         <w:tc>
           <w:tcPr>
-            <w:tcW w:w="1804" w:type="dxa"/>
+            <w:tcW w:w="3165" w:type="dxa"/>
           </w:tcPr>
           <w:p>
             <w:r>
@@ -754,11 +754,22 @@
             <w:r>
               <w:t>/account</w:t>
             </w:r>
-          </w:p>
-        </w:tc>
-        <w:tc>
-          <w:tcPr>
-            <w:tcW w:w="3049" w:type="dxa"/>
+            <w:r>
+              <w:t>/{</w:t>
+            </w:r>
+            <w:proofErr w:type="spellStart"/>
+            <w:r>
+              <w:t>ParticipantID</w:t>
+            </w:r>
+            <w:proofErr w:type="spellEnd"/>
+            <w:r>
+              <w:t>}</w:t>
+            </w:r>
+          </w:p>
+        </w:tc>
+        <w:tc>
+          <w:tcPr>
+            <w:tcW w:w="2619" w:type="dxa"/>
           </w:tcPr>
           <w:p>
             <w:r>
@@ -771,7 +782,7 @@
         </w:tc>
         <w:tc>
           <w:tcPr>
-            <w:tcW w:w="1746" w:type="dxa"/>
+            <w:tcW w:w="1643" w:type="dxa"/>
           </w:tcPr>
           <w:p>
             <w:r>
@@ -822,7 +833,7 @@
         </w:tc>
         <w:tc>
           <w:tcPr>
-            <w:tcW w:w="3249" w:type="dxa"/>
+            <w:tcW w:w="2590" w:type="dxa"/>
           </w:tcPr>
           <w:p>
             <w:r>
@@ -837,7 +848,7 @@
         </w:trPr>
         <w:tc>
           <w:tcPr>
-            <w:tcW w:w="1650" w:type="dxa"/>
+            <w:tcW w:w="1481" w:type="dxa"/>
           </w:tcPr>
           <w:p>
             <w:r>
@@ -847,7 +858,7 @@
         </w:tc>
         <w:tc>
           <w:tcPr>
-            <w:tcW w:w="1804" w:type="dxa"/>
+            <w:tcW w:w="3165" w:type="dxa"/>
           </w:tcPr>
           <w:p>
             <w:r>
@@ -861,11 +872,22 @@
             <w:r>
               <w:t>/account</w:t>
             </w:r>
-          </w:p>
-        </w:tc>
-        <w:tc>
-          <w:tcPr>
-            <w:tcW w:w="3049" w:type="dxa"/>
+            <w:r>
+              <w:t>/{</w:t>
+            </w:r>
+            <w:proofErr w:type="spellStart"/>
+            <w:r>
+              <w:t>OrganiserID</w:t>
+            </w:r>
+            <w:proofErr w:type="spellEnd"/>
+            <w:r>
+              <w:t>}</w:t>
+            </w:r>
+          </w:p>
+        </w:tc>
+        <w:tc>
+          <w:tcPr>
+            <w:tcW w:w="2619" w:type="dxa"/>
           </w:tcPr>
           <w:p>
             <w:r>
@@ -881,7 +903,7 @@
         </w:tc>
         <w:tc>
           <w:tcPr>
-            <w:tcW w:w="1746" w:type="dxa"/>
+            <w:tcW w:w="1643" w:type="dxa"/>
           </w:tcPr>
           <w:p>
             <w:r>
@@ -909,7 +931,7 @@
         </w:tc>
         <w:tc>
           <w:tcPr>
-            <w:tcW w:w="3249" w:type="dxa"/>
+            <w:tcW w:w="2590" w:type="dxa"/>
           </w:tcPr>
           <w:p>
             <w:r>
@@ -921,7 +943,7 @@
       <w:tr>
         <w:tc>
           <w:tcPr>
-            <w:tcW w:w="1650" w:type="dxa"/>
+            <w:tcW w:w="1481" w:type="dxa"/>
           </w:tcPr>
           <w:p>
             <w:r>
@@ -934,7 +956,7 @@
         </w:tc>
         <w:tc>
           <w:tcPr>
-            <w:tcW w:w="1804" w:type="dxa"/>
+            <w:tcW w:w="3165" w:type="dxa"/>
           </w:tcPr>
           <w:p>
             <w:r>
@@ -946,13 +968,13 @@
             </w:r>
             <w:proofErr w:type="spellEnd"/>
             <w:r>
-              <w:t>/ events</w:t>
-            </w:r>
-          </w:p>
-        </w:tc>
-        <w:tc>
-          <w:tcPr>
-            <w:tcW w:w="3049" w:type="dxa"/>
+              <w:t>/events</w:t>
+            </w:r>
+          </w:p>
+        </w:tc>
+        <w:tc>
+          <w:tcPr>
+            <w:tcW w:w="2619" w:type="dxa"/>
           </w:tcPr>
           <w:p>
             <w:r>
@@ -973,7 +995,7 @@
         </w:tc>
         <w:tc>
           <w:tcPr>
-            <w:tcW w:w="1746" w:type="dxa"/>
+            <w:tcW w:w="1643" w:type="dxa"/>
           </w:tcPr>
           <w:p>
             <w:r>
@@ -1066,7 +1088,7 @@
         </w:tc>
         <w:tc>
           <w:tcPr>
-            <w:tcW w:w="3249" w:type="dxa"/>
+            <w:tcW w:w="2590" w:type="dxa"/>
           </w:tcPr>
           <w:p>
             <w:r>
@@ -1084,7 +1106,7 @@
       <w:tr>
         <w:tc>
           <w:tcPr>
-            <w:tcW w:w="1650" w:type="dxa"/>
+            <w:tcW w:w="1481" w:type="dxa"/>
           </w:tcPr>
           <w:p>
             <w:r>
@@ -1094,7 +1116,7 @@
         </w:tc>
         <w:tc>
           <w:tcPr>
-            <w:tcW w:w="1804" w:type="dxa"/>
+            <w:tcW w:w="3165" w:type="dxa"/>
           </w:tcPr>
           <w:p>
             <w:r>
@@ -1106,13 +1128,24 @@
             </w:r>
             <w:proofErr w:type="spellEnd"/>
             <w:r>
-              <w:t>/ events</w:t>
-            </w:r>
-          </w:p>
-        </w:tc>
-        <w:tc>
-          <w:tcPr>
-            <w:tcW w:w="3049" w:type="dxa"/>
+              <w:t>/events</w:t>
+            </w:r>
+            <w:r>
+              <w:t>/{</w:t>
+            </w:r>
+            <w:proofErr w:type="spellStart"/>
+            <w:r>
+              <w:t>OrganiserID</w:t>
+            </w:r>
+            <w:proofErr w:type="spellEnd"/>
+            <w:r>
+              <w:t>}</w:t>
+            </w:r>
+          </w:p>
+        </w:tc>
+        <w:tc>
+          <w:tcPr>
+            <w:tcW w:w="2619" w:type="dxa"/>
           </w:tcPr>
           <w:p>
             <w:r>
@@ -1134,7 +1167,7 @@
         </w:tc>
         <w:tc>
           <w:tcPr>
-            <w:tcW w:w="1746" w:type="dxa"/>
+            <w:tcW w:w="1643" w:type="dxa"/>
           </w:tcPr>
           <w:p>
             <w:r>
@@ -1221,7 +1254,7 @@
         </w:tc>
         <w:tc>
           <w:tcPr>
-            <w:tcW w:w="3249" w:type="dxa"/>
+            <w:tcW w:w="2590" w:type="dxa"/>
           </w:tcPr>
           <w:p>
             <w:r>
@@ -1245,7 +1278,7 @@
       <w:tr>
         <w:tc>
           <w:tcPr>
-            <w:tcW w:w="1650" w:type="dxa"/>
+            <w:tcW w:w="1481" w:type="dxa"/>
           </w:tcPr>
           <w:p>
             <w:r>
@@ -1256,7 +1289,7 @@
         </w:tc>
         <w:tc>
           <w:tcPr>
-            <w:tcW w:w="1804" w:type="dxa"/>
+            <w:tcW w:w="3165" w:type="dxa"/>
           </w:tcPr>
           <w:p>
             <w:r>
@@ -1268,13 +1301,24 @@
             </w:r>
             <w:proofErr w:type="spellEnd"/>
             <w:r>
-              <w:t>/ events</w:t>
-            </w:r>
-          </w:p>
-        </w:tc>
-        <w:tc>
-          <w:tcPr>
-            <w:tcW w:w="3049" w:type="dxa"/>
+              <w:t>/events</w:t>
+            </w:r>
+            <w:r>
+              <w:t>/{</w:t>
+            </w:r>
+            <w:proofErr w:type="spellStart"/>
+            <w:r>
+              <w:t>OrganiserID</w:t>
+            </w:r>
+            <w:proofErr w:type="spellEnd"/>
+            <w:r>
+              <w:t>}</w:t>
+            </w:r>
+          </w:p>
+        </w:tc>
+        <w:tc>
+          <w:tcPr>
+            <w:tcW w:w="2619" w:type="dxa"/>
           </w:tcPr>
           <w:p>
             <w:r>
@@ -1299,7 +1343,7 @@
         </w:tc>
         <w:tc>
           <w:tcPr>
-            <w:tcW w:w="1746" w:type="dxa"/>
+            <w:tcW w:w="1643" w:type="dxa"/>
           </w:tcPr>
           <w:p>
             <w:r>
@@ -1319,7 +1363,7 @@
         </w:tc>
         <w:tc>
           <w:tcPr>
-            <w:tcW w:w="3249" w:type="dxa"/>
+            <w:tcW w:w="2590" w:type="dxa"/>
           </w:tcPr>
           <w:p>
             <w:r>
@@ -1340,7 +1384,7 @@
       <w:tr>
         <w:tc>
           <w:tcPr>
-            <w:tcW w:w="1650" w:type="dxa"/>
+            <w:tcW w:w="1481" w:type="dxa"/>
           </w:tcPr>
           <w:p>
             <w:r>
@@ -1350,7 +1394,7 @@
         </w:tc>
         <w:tc>
           <w:tcPr>
-            <w:tcW w:w="1804" w:type="dxa"/>
+            <w:tcW w:w="3165" w:type="dxa"/>
           </w:tcPr>
           <w:p>
             <w:r>
@@ -1362,20 +1406,26 @@
             </w:r>
             <w:proofErr w:type="spellEnd"/>
             <w:r>
-              <w:t>/ events</w:t>
-            </w:r>
-          </w:p>
-        </w:tc>
-        <w:tc>
-          <w:tcPr>
-            <w:tcW w:w="3049" w:type="dxa"/>
-          </w:tcPr>
-          <w:p>
-            <w:r>
-              <w:t>Public</w:t>
-            </w:r>
-            <w:r>
-              <w:t xml:space="preserve"> views </w:t>
+              <w:t>/events</w:t>
+            </w:r>
+          </w:p>
+        </w:tc>
+        <w:tc>
+          <w:tcPr>
+            <w:tcW w:w="2619" w:type="dxa"/>
+          </w:tcPr>
+          <w:p>
+            <w:r>
+              <w:t>Anyone</w:t>
+            </w:r>
+            <w:r>
+              <w:t xml:space="preserve"> </w:t>
+            </w:r>
+            <w:r>
+              <w:t xml:space="preserve">can </w:t>
+            </w:r>
+            <w:r>
+              <w:t xml:space="preserve">view </w:t>
             </w:r>
             <w:r>
               <w:t>a specific event</w:t>
@@ -1390,7 +1440,7 @@
         </w:tc>
         <w:tc>
           <w:tcPr>
-            <w:tcW w:w="1746" w:type="dxa"/>
+            <w:tcW w:w="1643" w:type="dxa"/>
           </w:tcPr>
           <w:p>
             <w:r>
@@ -1410,7 +1460,7 @@
         </w:tc>
         <w:tc>
           <w:tcPr>
-            <w:tcW w:w="3249" w:type="dxa"/>
+            <w:tcW w:w="2590" w:type="dxa"/>
           </w:tcPr>
           <w:p>
             <w:r>
@@ -1422,7 +1472,7 @@
       <w:tr>
         <w:tc>
           <w:tcPr>
-            <w:tcW w:w="1650" w:type="dxa"/>
+            <w:tcW w:w="1481" w:type="dxa"/>
           </w:tcPr>
           <w:p>
             <w:r>
@@ -1432,7 +1482,7 @@
         </w:tc>
         <w:tc>
           <w:tcPr>
-            <w:tcW w:w="1804" w:type="dxa"/>
+            <w:tcW w:w="3165" w:type="dxa"/>
           </w:tcPr>
           <w:p>
             <w:r>
@@ -1444,20 +1494,20 @@
             </w:r>
             <w:proofErr w:type="spellEnd"/>
             <w:r>
-              <w:t>/ events</w:t>
-            </w:r>
-          </w:p>
-        </w:tc>
-        <w:tc>
-          <w:tcPr>
-            <w:tcW w:w="3049" w:type="dxa"/>
-          </w:tcPr>
-          <w:p>
-            <w:r>
-              <w:t>Public</w:t>
-            </w:r>
-            <w:r>
-              <w:t xml:space="preserve"> views </w:t>
+              <w:t>/events</w:t>
+            </w:r>
+          </w:p>
+        </w:tc>
+        <w:tc>
+          <w:tcPr>
+            <w:tcW w:w="2619" w:type="dxa"/>
+          </w:tcPr>
+          <w:p>
+            <w:r>
+              <w:t>Anyone can</w:t>
+            </w:r>
+            <w:r>
+              <w:t xml:space="preserve"> view </w:t>
             </w:r>
             <w:r>
               <w:t>all</w:t>
@@ -1478,7 +1528,7 @@
         </w:tc>
         <w:tc>
           <w:tcPr>
-            <w:tcW w:w="1746" w:type="dxa"/>
+            <w:tcW w:w="1643" w:type="dxa"/>
           </w:tcPr>
           <w:p>
             <w:r>
@@ -1498,7 +1548,7 @@
         </w:tc>
         <w:tc>
           <w:tcPr>
-            <w:tcW w:w="3249" w:type="dxa"/>
+            <w:tcW w:w="2590" w:type="dxa"/>
           </w:tcPr>
           <w:p>
             <w:r>
@@ -1510,7 +1560,7 @@
       <w:tr>
         <w:tc>
           <w:tcPr>
-            <w:tcW w:w="1650" w:type="dxa"/>
+            <w:tcW w:w="1481" w:type="dxa"/>
           </w:tcPr>
           <w:p>
             <w:r>
@@ -1523,7 +1573,7 @@
         </w:tc>
         <w:tc>
           <w:tcPr>
-            <w:tcW w:w="1804" w:type="dxa"/>
+            <w:tcW w:w="3165" w:type="dxa"/>
           </w:tcPr>
           <w:p>
             <w:r>
@@ -1544,7 +1594,7 @@
         </w:tc>
         <w:tc>
           <w:tcPr>
-            <w:tcW w:w="3049" w:type="dxa"/>
+            <w:tcW w:w="2619" w:type="dxa"/>
           </w:tcPr>
           <w:p>
             <w:r>
@@ -1571,7 +1621,7 @@
         </w:tc>
         <w:tc>
           <w:tcPr>
-            <w:tcW w:w="1746" w:type="dxa"/>
+            <w:tcW w:w="1643" w:type="dxa"/>
           </w:tcPr>
           <w:p>
             <w:r>
@@ -1623,7 +1673,7 @@
         </w:tc>
         <w:tc>
           <w:tcPr>
-            <w:tcW w:w="3249" w:type="dxa"/>
+            <w:tcW w:w="2590" w:type="dxa"/>
           </w:tcPr>
           <w:p>
             <w:r>
@@ -1641,7 +1691,7 @@
       <w:tr>
         <w:tc>
           <w:tcPr>
-            <w:tcW w:w="1650" w:type="dxa"/>
+            <w:tcW w:w="1481" w:type="dxa"/>
           </w:tcPr>
           <w:p>
             <w:r>
@@ -1651,7 +1701,7 @@
         </w:tc>
         <w:tc>
           <w:tcPr>
-            <w:tcW w:w="1804" w:type="dxa"/>
+            <w:tcW w:w="3165" w:type="dxa"/>
           </w:tcPr>
           <w:p>
             <w:r>
@@ -1665,11 +1715,22 @@
             <w:r>
               <w:t>/Category</w:t>
             </w:r>
-          </w:p>
-        </w:tc>
-        <w:tc>
-          <w:tcPr>
-            <w:tcW w:w="3049" w:type="dxa"/>
+            <w:r>
+              <w:t>/{</w:t>
+            </w:r>
+            <w:proofErr w:type="spellStart"/>
+            <w:r>
+              <w:t>OrganiserID</w:t>
+            </w:r>
+            <w:proofErr w:type="spellEnd"/>
+            <w:r>
+              <w:t>}</w:t>
+            </w:r>
+          </w:p>
+        </w:tc>
+        <w:tc>
+          <w:tcPr>
+            <w:tcW w:w="2619" w:type="dxa"/>
           </w:tcPr>
           <w:p>
             <w:r>
@@ -1691,7 +1752,7 @@
         </w:tc>
         <w:tc>
           <w:tcPr>
-            <w:tcW w:w="1746" w:type="dxa"/>
+            <w:tcW w:w="1643" w:type="dxa"/>
           </w:tcPr>
           <w:p>
             <w:r>
@@ -1743,7 +1804,7 @@
         </w:tc>
         <w:tc>
           <w:tcPr>
-            <w:tcW w:w="3249" w:type="dxa"/>
+            <w:tcW w:w="2590" w:type="dxa"/>
           </w:tcPr>
           <w:p>
             <w:r>
@@ -1764,7 +1825,7 @@
       <w:tr>
         <w:tc>
           <w:tcPr>
-            <w:tcW w:w="1650" w:type="dxa"/>
+            <w:tcW w:w="1481" w:type="dxa"/>
           </w:tcPr>
           <w:p>
             <w:r>
@@ -1774,7 +1835,7 @@
         </w:tc>
         <w:tc>
           <w:tcPr>
-            <w:tcW w:w="1804" w:type="dxa"/>
+            <w:tcW w:w="3165" w:type="dxa"/>
           </w:tcPr>
           <w:p>
             <w:r>
@@ -1788,11 +1849,22 @@
             <w:r>
               <w:t>/Category</w:t>
             </w:r>
-          </w:p>
-        </w:tc>
-        <w:tc>
-          <w:tcPr>
-            <w:tcW w:w="3049" w:type="dxa"/>
+            <w:r>
+              <w:t>/{</w:t>
+            </w:r>
+            <w:proofErr w:type="spellStart"/>
+            <w:r>
+              <w:t>OrganiserID</w:t>
+            </w:r>
+            <w:proofErr w:type="spellEnd"/>
+            <w:r>
+              <w:t>}</w:t>
+            </w:r>
+          </w:p>
+        </w:tc>
+        <w:tc>
+          <w:tcPr>
+            <w:tcW w:w="2619" w:type="dxa"/>
           </w:tcPr>
           <w:p>
             <w:r>
@@ -1820,7 +1892,7 @@
         </w:tc>
         <w:tc>
           <w:tcPr>
-            <w:tcW w:w="1746" w:type="dxa"/>
+            <w:tcW w:w="1643" w:type="dxa"/>
           </w:tcPr>
           <w:p>
             <w:r>
@@ -1840,7 +1912,7 @@
         </w:tc>
         <w:tc>
           <w:tcPr>
-            <w:tcW w:w="3249" w:type="dxa"/>
+            <w:tcW w:w="2590" w:type="dxa"/>
           </w:tcPr>
           <w:p>
             <w:r>
@@ -1861,7 +1933,7 @@
       <w:tr>
         <w:tc>
           <w:tcPr>
-            <w:tcW w:w="1650" w:type="dxa"/>
+            <w:tcW w:w="1481" w:type="dxa"/>
           </w:tcPr>
           <w:p>
             <w:r>
@@ -1871,7 +1943,7 @@
         </w:tc>
         <w:tc>
           <w:tcPr>
-            <w:tcW w:w="1804" w:type="dxa"/>
+            <w:tcW w:w="3165" w:type="dxa"/>
           </w:tcPr>
           <w:p>
             <w:r>
@@ -1889,14 +1961,20 @@
         </w:tc>
         <w:tc>
           <w:tcPr>
-            <w:tcW w:w="3049" w:type="dxa"/>
-          </w:tcPr>
-          <w:p>
-            <w:r>
-              <w:t>Public</w:t>
-            </w:r>
-            <w:r>
-              <w:t xml:space="preserve"> views </w:t>
+            <w:tcW w:w="2619" w:type="dxa"/>
+          </w:tcPr>
+          <w:p>
+            <w:r>
+              <w:t>Anyone</w:t>
+            </w:r>
+            <w:r>
+              <w:t xml:space="preserve"> </w:t>
+            </w:r>
+            <w:r>
+              <w:t xml:space="preserve">can </w:t>
+            </w:r>
+            <w:r>
+              <w:t xml:space="preserve">view </w:t>
             </w:r>
             <w:r>
               <w:t xml:space="preserve">all </w:t>
@@ -1917,7 +1995,7 @@
         </w:tc>
         <w:tc>
           <w:tcPr>
-            <w:tcW w:w="1746" w:type="dxa"/>
+            <w:tcW w:w="1643" w:type="dxa"/>
           </w:tcPr>
           <w:p>
             <w:r>
@@ -1937,7 +2015,478 @@
         </w:tc>
         <w:tc>
           <w:tcPr>
-            <w:tcW w:w="3249" w:type="dxa"/>
+            <w:tcW w:w="2590" w:type="dxa"/>
+          </w:tcPr>
+          <w:p>
+            <w:r>
+              <w:t>200 OK</w:t>
+            </w:r>
+          </w:p>
+        </w:tc>
+      </w:tr>
+      <w:tr>
+        <w:tc>
+          <w:tcPr>
+            <w:tcW w:w="1481" w:type="dxa"/>
+          </w:tcPr>
+          <w:p>
+            <w:r>
+              <w:t>P</w:t>
+            </w:r>
+            <w:r>
+              <w:t>OST</w:t>
+            </w:r>
+          </w:p>
+        </w:tc>
+        <w:tc>
+          <w:tcPr>
+            <w:tcW w:w="3165" w:type="dxa"/>
+          </w:tcPr>
+          <w:p>
+            <w:r>
+              <w:t>/</w:t>
+            </w:r>
+            <w:proofErr w:type="spellStart"/>
+            <w:r>
+              <w:t>api</w:t>
+            </w:r>
+            <w:proofErr w:type="spellEnd"/>
+            <w:r>
+              <w:t>/</w:t>
+            </w:r>
+            <w:r>
+              <w:t>Enrolment</w:t>
+            </w:r>
+          </w:p>
+        </w:tc>
+        <w:tc>
+          <w:tcPr>
+            <w:tcW w:w="2619" w:type="dxa"/>
+          </w:tcPr>
+          <w:p>
+            <w:r>
+              <w:t>Participant enrols for an event</w:t>
+            </w:r>
+            <w:r>
+              <w:t>.</w:t>
+            </w:r>
+          </w:p>
+        </w:tc>
+        <w:tc>
+          <w:tcPr>
+            <w:tcW w:w="1643" w:type="dxa"/>
+          </w:tcPr>
+          <w:p>
+            <w:r>
+              <w:rPr>
+                <w:lang w:val="en-ZA"/>
+              </w:rPr>
+              <w:t>Participant</w:t>
+            </w:r>
+          </w:p>
+        </w:tc>
+        <w:tc>
+          <w:tcPr>
+            <w:tcW w:w="3098" w:type="dxa"/>
+          </w:tcPr>
+          <w:p>
+            <w:r>
+              <w:t>{</w:t>
+            </w:r>
+            <w:proofErr w:type="spellStart"/>
+            <w:r>
+              <w:t>AccountID</w:t>
+            </w:r>
+            <w:proofErr w:type="spellEnd"/>
+            <w:r>
+              <w:t xml:space="preserve">, </w:t>
+            </w:r>
+            <w:proofErr w:type="spellStart"/>
+            <w:r>
+              <w:t>CategoryID</w:t>
+            </w:r>
+            <w:proofErr w:type="spellEnd"/>
+            <w:r>
+              <w:t xml:space="preserve">, </w:t>
+            </w:r>
+            <w:proofErr w:type="spellStart"/>
+            <w:r>
+              <w:t>EnrollmentDate</w:t>
+            </w:r>
+            <w:proofErr w:type="spellEnd"/>
+            <w:r>
+              <w:t>}</w:t>
+            </w:r>
+          </w:p>
+        </w:tc>
+        <w:tc>
+          <w:tcPr>
+            <w:tcW w:w="2590" w:type="dxa"/>
+          </w:tcPr>
+          <w:p>
+            <w:r>
+              <w:t>201 Created</w:t>
+            </w:r>
+          </w:p>
+        </w:tc>
+      </w:tr>
+      <w:tr>
+        <w:tc>
+          <w:tcPr>
+            <w:tcW w:w="1481" w:type="dxa"/>
+          </w:tcPr>
+          <w:p>
+            <w:r>
+              <w:t>GET</w:t>
+            </w:r>
+          </w:p>
+        </w:tc>
+        <w:tc>
+          <w:tcPr>
+            <w:tcW w:w="3165" w:type="dxa"/>
+          </w:tcPr>
+          <w:p>
+            <w:r>
+              <w:t>/</w:t>
+            </w:r>
+            <w:proofErr w:type="spellStart"/>
+            <w:r>
+              <w:t>api</w:t>
+            </w:r>
+            <w:proofErr w:type="spellEnd"/>
+            <w:r>
+              <w:t>/Enrolment</w:t>
+            </w:r>
+          </w:p>
+        </w:tc>
+        <w:tc>
+          <w:tcPr>
+            <w:tcW w:w="2619" w:type="dxa"/>
+          </w:tcPr>
+          <w:p>
+            <w:r>
+              <w:t xml:space="preserve">Participant </w:t>
+            </w:r>
+            <w:r>
+              <w:t>views</w:t>
+            </w:r>
+            <w:r>
+              <w:t xml:space="preserve"> </w:t>
+            </w:r>
+            <w:r>
+              <w:t xml:space="preserve">their event </w:t>
+            </w:r>
+            <w:r>
+              <w:t>e</w:t>
+            </w:r>
+            <w:r>
+              <w:t>nrolment</w:t>
+            </w:r>
+            <w:r>
+              <w:t>.</w:t>
+            </w:r>
+          </w:p>
+        </w:tc>
+        <w:tc>
+          <w:tcPr>
+            <w:tcW w:w="1643" w:type="dxa"/>
+          </w:tcPr>
+          <w:p>
+            <w:pPr>
+              <w:rPr>
+                <w:lang w:val="en-ZA"/>
+              </w:rPr>
+            </w:pPr>
+            <w:r>
+              <w:rPr>
+                <w:lang w:val="en-ZA"/>
+              </w:rPr>
+              <w:t>Participant</w:t>
+            </w:r>
+          </w:p>
+        </w:tc>
+        <w:tc>
+          <w:tcPr>
+            <w:tcW w:w="3098" w:type="dxa"/>
+          </w:tcPr>
+          <w:p>
+            <w:r>
+              <w:t>None</w:t>
+            </w:r>
+          </w:p>
+        </w:tc>
+        <w:tc>
+          <w:tcPr>
+            <w:tcW w:w="2590" w:type="dxa"/>
+          </w:tcPr>
+          <w:p>
+            <w:r>
+              <w:t>200 OK</w:t>
+            </w:r>
+          </w:p>
+        </w:tc>
+      </w:tr>
+      <w:tr>
+        <w:tc>
+          <w:tcPr>
+            <w:tcW w:w="1481" w:type="dxa"/>
+          </w:tcPr>
+          <w:p>
+            <w:r>
+              <w:t>GET</w:t>
+            </w:r>
+          </w:p>
+        </w:tc>
+        <w:tc>
+          <w:tcPr>
+            <w:tcW w:w="3165" w:type="dxa"/>
+          </w:tcPr>
+          <w:p>
+            <w:r>
+              <w:t>/</w:t>
+            </w:r>
+            <w:proofErr w:type="spellStart"/>
+            <w:r>
+              <w:t>api</w:t>
+            </w:r>
+            <w:proofErr w:type="spellEnd"/>
+            <w:r>
+              <w:t>/Enrolment</w:t>
+            </w:r>
+          </w:p>
+        </w:tc>
+        <w:tc>
+          <w:tcPr>
+            <w:tcW w:w="2619" w:type="dxa"/>
+          </w:tcPr>
+          <w:p>
+            <w:r>
+              <w:t xml:space="preserve">Organiser views </w:t>
+            </w:r>
+            <w:r>
+              <w:t xml:space="preserve">all </w:t>
+            </w:r>
+            <w:r>
+              <w:t>event enrolment</w:t>
+            </w:r>
+            <w:r>
+              <w:t>s</w:t>
+            </w:r>
+            <w:r>
+              <w:t>.</w:t>
+            </w:r>
+          </w:p>
+        </w:tc>
+        <w:tc>
+          <w:tcPr>
+            <w:tcW w:w="1643" w:type="dxa"/>
+          </w:tcPr>
+          <w:p>
+            <w:pPr>
+              <w:rPr>
+                <w:lang w:val="en-ZA"/>
+              </w:rPr>
+            </w:pPr>
+            <w:r>
+              <w:t>Organiser</w:t>
+            </w:r>
+          </w:p>
+        </w:tc>
+        <w:tc>
+          <w:tcPr>
+            <w:tcW w:w="3098" w:type="dxa"/>
+          </w:tcPr>
+          <w:p>
+            <w:r>
+              <w:t>None</w:t>
+            </w:r>
+          </w:p>
+        </w:tc>
+        <w:tc>
+          <w:tcPr>
+            <w:tcW w:w="2590" w:type="dxa"/>
+          </w:tcPr>
+          <w:p>
+            <w:r>
+              <w:t>200 OK</w:t>
+            </w:r>
+          </w:p>
+        </w:tc>
+      </w:tr>
+      <w:tr>
+        <w:tc>
+          <w:tcPr>
+            <w:tcW w:w="1481" w:type="dxa"/>
+          </w:tcPr>
+          <w:p>
+            <w:r>
+              <w:t>P</w:t>
+            </w:r>
+            <w:r>
+              <w:t>OST</w:t>
+            </w:r>
+          </w:p>
+        </w:tc>
+        <w:tc>
+          <w:tcPr>
+            <w:tcW w:w="3165" w:type="dxa"/>
+          </w:tcPr>
+          <w:p>
+            <w:r>
+              <w:t>/</w:t>
+            </w:r>
+            <w:proofErr w:type="spellStart"/>
+            <w:r>
+              <w:t>api</w:t>
+            </w:r>
+            <w:proofErr w:type="spellEnd"/>
+            <w:r>
+              <w:t>/Enrolment</w:t>
+            </w:r>
+          </w:p>
+        </w:tc>
+        <w:tc>
+          <w:tcPr>
+            <w:tcW w:w="2619" w:type="dxa"/>
+          </w:tcPr>
+          <w:p>
+            <w:r>
+              <w:t>Organiser</w:t>
+            </w:r>
+            <w:r>
+              <w:t xml:space="preserve"> creates a report that captures the relationship between </w:t>
+            </w:r>
+            <w:r>
+              <w:t>Participant, Event and Category</w:t>
+            </w:r>
+          </w:p>
+        </w:tc>
+        <w:tc>
+          <w:tcPr>
+            <w:tcW w:w="1643" w:type="dxa"/>
+          </w:tcPr>
+          <w:p>
+            <w:r>
+              <w:t>Organiser</w:t>
+            </w:r>
+          </w:p>
+        </w:tc>
+        <w:tc>
+          <w:tcPr>
+            <w:tcW w:w="3098" w:type="dxa"/>
+          </w:tcPr>
+          <w:p>
+            <w:r>
+              <w:t xml:space="preserve">{ </w:t>
+            </w:r>
+            <w:proofErr w:type="spellStart"/>
+            <w:r>
+              <w:t>AccountID</w:t>
+            </w:r>
+            <w:proofErr w:type="spellEnd"/>
+            <w:r>
+              <w:t xml:space="preserve">, </w:t>
+            </w:r>
+            <w:proofErr w:type="spellStart"/>
+            <w:r>
+              <w:t>CategoryID</w:t>
+            </w:r>
+            <w:proofErr w:type="spellEnd"/>
+            <w:r>
+              <w:t xml:space="preserve">, </w:t>
+            </w:r>
+            <w:proofErr w:type="spellStart"/>
+            <w:r>
+              <w:t>EventID</w:t>
+            </w:r>
+            <w:proofErr w:type="spellEnd"/>
+            <w:r>
+              <w:t>}</w:t>
+            </w:r>
+          </w:p>
+        </w:tc>
+        <w:tc>
+          <w:tcPr>
+            <w:tcW w:w="2590" w:type="dxa"/>
+          </w:tcPr>
+          <w:p>
+            <w:r>
+              <w:t>201 Created; 400 Bad Request;</w:t>
+            </w:r>
+            <w:r>
+              <w:t xml:space="preserve"> </w:t>
+            </w:r>
+            <w:r>
+              <w:t>401/403 if access is invalid</w:t>
+            </w:r>
+          </w:p>
+        </w:tc>
+      </w:tr>
+      <w:tr>
+        <w:tc>
+          <w:tcPr>
+            <w:tcW w:w="1481" w:type="dxa"/>
+          </w:tcPr>
+          <w:p>
+            <w:r>
+              <w:t>GET</w:t>
+            </w:r>
+          </w:p>
+        </w:tc>
+        <w:tc>
+          <w:tcPr>
+            <w:tcW w:w="3165" w:type="dxa"/>
+          </w:tcPr>
+          <w:p>
+            <w:r>
+              <w:t>/</w:t>
+            </w:r>
+            <w:proofErr w:type="spellStart"/>
+            <w:r>
+              <w:t>api</w:t>
+            </w:r>
+            <w:proofErr w:type="spellEnd"/>
+            <w:r>
+              <w:t>/Enrolment</w:t>
+            </w:r>
+          </w:p>
+        </w:tc>
+        <w:tc>
+          <w:tcPr>
+            <w:tcW w:w="2619" w:type="dxa"/>
+          </w:tcPr>
+          <w:p>
+            <w:r>
+              <w:t>Organiser</w:t>
+            </w:r>
+            <w:r>
+              <w:t xml:space="preserve"> view report </w:t>
+            </w:r>
+          </w:p>
+        </w:tc>
+        <w:tc>
+          <w:tcPr>
+            <w:tcW w:w="1643" w:type="dxa"/>
+          </w:tcPr>
+          <w:p>
+            <w:r>
+              <w:t>Organiser</w:t>
+            </w:r>
+          </w:p>
+        </w:tc>
+        <w:tc>
+          <w:tcPr>
+            <w:tcW w:w="3098" w:type="dxa"/>
+          </w:tcPr>
+          <w:p>
+            <w:r>
+              <w:t>None</w:t>
+            </w:r>
+          </w:p>
+        </w:tc>
+        <w:tc>
+          <w:tcPr>
+            <w:tcW w:w="2590" w:type="dxa"/>
           </w:tcPr>
           <w:p>
             <w:r>

</xml_diff>

<commit_message>
feat: Added Race Results API Funtionality
Organiser records finishing position, finish time, performance detail and award that should be awarded to the top 3 positions. Both organisers or participants can view their results
</commit_message>
<xml_diff>
--- a/docs/RaceDay_ API Endpoint Planning.docx
+++ b/docs/RaceDay_ API Endpoint Planning.docx
@@ -9,12 +9,12 @@
         <w:tblLook w:val="04A0" w:firstRow="1" w:lastRow="0" w:firstColumn="1" w:lastColumn="0" w:noHBand="0" w:noVBand="1"/>
       </w:tblPr>
       <w:tblGrid>
-        <w:gridCol w:w="1481"/>
+        <w:gridCol w:w="1473"/>
         <w:gridCol w:w="3165"/>
-        <w:gridCol w:w="2619"/>
-        <w:gridCol w:w="1643"/>
-        <w:gridCol w:w="3098"/>
-        <w:gridCol w:w="2590"/>
+        <w:gridCol w:w="2614"/>
+        <w:gridCol w:w="1638"/>
+        <w:gridCol w:w="3147"/>
+        <w:gridCol w:w="2559"/>
       </w:tblGrid>
       <w:tr>
         <w:trPr>
@@ -371,12 +371,17 @@
               <w:t>/</w:t>
             </w:r>
             <w:proofErr w:type="spellStart"/>
+            <w:proofErr w:type="gramStart"/>
             <w:r>
               <w:t>OrganiserID</w:t>
             </w:r>
             <w:proofErr w:type="spellEnd"/>
             <w:r>
-              <w:t xml:space="preserve">,     </w:t>
+              <w:t xml:space="preserve">,   </w:t>
+            </w:r>
+            <w:proofErr w:type="gramEnd"/>
+            <w:r>
+              <w:t xml:space="preserve">  </w:t>
             </w:r>
             <w:proofErr w:type="spellStart"/>
             <w:r>
@@ -514,7 +519,7 @@
               <w:tblLook w:val="04A0" w:firstRow="1" w:lastRow="0" w:firstColumn="1" w:lastColumn="0" w:noHBand="0" w:noVBand="1"/>
             </w:tblPr>
             <w:tblGrid>
-              <w:gridCol w:w="1427"/>
+              <w:gridCol w:w="1422"/>
             </w:tblGrid>
             <w:tr>
               <w:trPr>
@@ -747,10 +752,12 @@
               <w:t>/</w:t>
             </w:r>
             <w:proofErr w:type="spellStart"/>
+            <w:proofErr w:type="gramStart"/>
             <w:r>
               <w:t>api</w:t>
             </w:r>
             <w:proofErr w:type="spellEnd"/>
+            <w:proofErr w:type="gramEnd"/>
             <w:r>
               <w:t>/account</w:t>
             </w:r>
@@ -865,10 +872,12 @@
               <w:t>/</w:t>
             </w:r>
             <w:proofErr w:type="spellStart"/>
+            <w:proofErr w:type="gramStart"/>
             <w:r>
               <w:t>api</w:t>
             </w:r>
             <w:proofErr w:type="spellEnd"/>
+            <w:proofErr w:type="gramEnd"/>
             <w:r>
               <w:t>/account</w:t>
             </w:r>
@@ -1123,10 +1132,12 @@
               <w:t>/</w:t>
             </w:r>
             <w:proofErr w:type="spellStart"/>
+            <w:proofErr w:type="gramStart"/>
             <w:r>
               <w:t>api</w:t>
             </w:r>
             <w:proofErr w:type="spellEnd"/>
+            <w:proofErr w:type="gramEnd"/>
             <w:r>
               <w:t>/events</w:t>
             </w:r>
@@ -1296,10 +1307,12 @@
               <w:t>/</w:t>
             </w:r>
             <w:proofErr w:type="spellStart"/>
+            <w:proofErr w:type="gramStart"/>
             <w:r>
               <w:t>api</w:t>
             </w:r>
             <w:proofErr w:type="spellEnd"/>
+            <w:proofErr w:type="gramEnd"/>
             <w:r>
               <w:t>/events</w:t>
             </w:r>
@@ -1708,10 +1721,12 @@
               <w:t>/</w:t>
             </w:r>
             <w:proofErr w:type="spellStart"/>
+            <w:proofErr w:type="gramStart"/>
             <w:r>
               <w:t>api</w:t>
             </w:r>
             <w:proofErr w:type="spellEnd"/>
+            <w:proofErr w:type="gramEnd"/>
             <w:r>
               <w:t>/Category</w:t>
             </w:r>
@@ -1842,10 +1857,12 @@
               <w:t>/</w:t>
             </w:r>
             <w:proofErr w:type="spellStart"/>
+            <w:proofErr w:type="gramStart"/>
             <w:r>
               <w:t>api</w:t>
             </w:r>
             <w:proofErr w:type="spellEnd"/>
+            <w:proofErr w:type="gramEnd"/>
             <w:r>
               <w:t>/Category</w:t>
             </w:r>
@@ -2376,6 +2393,7 @@
             <w:tcW w:w="3098" w:type="dxa"/>
           </w:tcPr>
           <w:p>
+            <w:proofErr w:type="gramStart"/>
             <w:r>
               <w:t xml:space="preserve">{ </w:t>
             </w:r>
@@ -2384,6 +2402,7 @@
               <w:t>AccountID</w:t>
             </w:r>
             <w:proofErr w:type="spellEnd"/>
+            <w:proofErr w:type="gramEnd"/>
             <w:r>
               <w:t xml:space="preserve">, </w:t>
             </w:r>
@@ -2471,6 +2490,206 @@
           <w:p>
             <w:r>
               <w:t>Organiser</w:t>
+            </w:r>
+          </w:p>
+        </w:tc>
+        <w:tc>
+          <w:tcPr>
+            <w:tcW w:w="3098" w:type="dxa"/>
+          </w:tcPr>
+          <w:p>
+            <w:r>
+              <w:t>None</w:t>
+            </w:r>
+          </w:p>
+        </w:tc>
+        <w:tc>
+          <w:tcPr>
+            <w:tcW w:w="2590" w:type="dxa"/>
+          </w:tcPr>
+          <w:p>
+            <w:r>
+              <w:t>200 OK</w:t>
+            </w:r>
+          </w:p>
+        </w:tc>
+      </w:tr>
+      <w:tr>
+        <w:tc>
+          <w:tcPr>
+            <w:tcW w:w="1481" w:type="dxa"/>
+          </w:tcPr>
+          <w:p>
+            <w:r>
+              <w:lastRenderedPageBreak/>
+              <w:t>P</w:t>
+            </w:r>
+            <w:r>
+              <w:t>OST</w:t>
+            </w:r>
+          </w:p>
+        </w:tc>
+        <w:tc>
+          <w:tcPr>
+            <w:tcW w:w="3165" w:type="dxa"/>
+          </w:tcPr>
+          <w:p>
+            <w:r>
+              <w:t>/</w:t>
+            </w:r>
+            <w:proofErr w:type="spellStart"/>
+            <w:r>
+              <w:t>api</w:t>
+            </w:r>
+            <w:proofErr w:type="spellEnd"/>
+            <w:r>
+              <w:t>/</w:t>
+            </w:r>
+            <w:proofErr w:type="spellStart"/>
+            <w:r>
+              <w:t>RaceResults</w:t>
+            </w:r>
+            <w:proofErr w:type="spellEnd"/>
+          </w:p>
+        </w:tc>
+        <w:tc>
+          <w:tcPr>
+            <w:tcW w:w="2619" w:type="dxa"/>
+          </w:tcPr>
+          <w:p>
+            <w:r>
+              <w:t>Organiser</w:t>
+            </w:r>
+            <w:r>
+              <w:t xml:space="preserve"> creates a report that captures participant's finish time, finish position and award for the result</w:t>
+            </w:r>
+          </w:p>
+        </w:tc>
+        <w:tc>
+          <w:tcPr>
+            <w:tcW w:w="1643" w:type="dxa"/>
+          </w:tcPr>
+          <w:p>
+            <w:r>
+              <w:t>Organiser</w:t>
+            </w:r>
+          </w:p>
+        </w:tc>
+        <w:tc>
+          <w:tcPr>
+            <w:tcW w:w="3098" w:type="dxa"/>
+          </w:tcPr>
+          <w:p>
+            <w:r>
+              <w:t>{</w:t>
+            </w:r>
+            <w:proofErr w:type="spellStart"/>
+            <w:r>
+              <w:t>EnrolmentID</w:t>
+            </w:r>
+            <w:proofErr w:type="spellEnd"/>
+            <w:r>
+              <w:t xml:space="preserve">, </w:t>
+            </w:r>
+            <w:proofErr w:type="spellStart"/>
+            <w:r>
+              <w:t>FinishTime</w:t>
+            </w:r>
+            <w:proofErr w:type="spellEnd"/>
+            <w:r>
+              <w:t xml:space="preserve">, </w:t>
+            </w:r>
+            <w:proofErr w:type="spellStart"/>
+            <w:r>
+              <w:t>FinishPosition</w:t>
+            </w:r>
+            <w:proofErr w:type="spellEnd"/>
+            <w:r>
+              <w:t xml:space="preserve">, </w:t>
+            </w:r>
+            <w:proofErr w:type="spellStart"/>
+            <w:proofErr w:type="gramStart"/>
+            <w:r>
+              <w:t>PerformanceDetails,Award</w:t>
+            </w:r>
+            <w:proofErr w:type="spellEnd"/>
+            <w:proofErr w:type="gramEnd"/>
+            <w:r>
+              <w:t>}</w:t>
+            </w:r>
+          </w:p>
+        </w:tc>
+        <w:tc>
+          <w:tcPr>
+            <w:tcW w:w="2590" w:type="dxa"/>
+          </w:tcPr>
+          <w:p>
+            <w:r>
+              <w:t>201 Created; 400 Bad Request;</w:t>
+            </w:r>
+            <w:r>
+              <w:t xml:space="preserve"> </w:t>
+            </w:r>
+            <w:r>
+              <w:t>401/403 if access is invalid</w:t>
+            </w:r>
+          </w:p>
+        </w:tc>
+      </w:tr>
+      <w:tr>
+        <w:tc>
+          <w:tcPr>
+            <w:tcW w:w="1481" w:type="dxa"/>
+          </w:tcPr>
+          <w:p>
+            <w:r>
+              <w:t>GET</w:t>
+            </w:r>
+          </w:p>
+        </w:tc>
+        <w:tc>
+          <w:tcPr>
+            <w:tcW w:w="3165" w:type="dxa"/>
+          </w:tcPr>
+          <w:p>
+            <w:r>
+              <w:t>/</w:t>
+            </w:r>
+            <w:proofErr w:type="spellStart"/>
+            <w:r>
+              <w:t>api</w:t>
+            </w:r>
+            <w:proofErr w:type="spellEnd"/>
+            <w:r>
+              <w:t>/</w:t>
+            </w:r>
+            <w:proofErr w:type="spellStart"/>
+            <w:r>
+              <w:t>RaceResults</w:t>
+            </w:r>
+            <w:proofErr w:type="spellEnd"/>
+          </w:p>
+        </w:tc>
+        <w:tc>
+          <w:tcPr>
+            <w:tcW w:w="2619" w:type="dxa"/>
+          </w:tcPr>
+          <w:p>
+            <w:r>
+              <w:t>Participant/organiser views the race results</w:t>
+            </w:r>
+          </w:p>
+        </w:tc>
+        <w:tc>
+          <w:tcPr>
+            <w:tcW w:w="1643" w:type="dxa"/>
+          </w:tcPr>
+          <w:p>
+            <w:r>
+              <w:rPr>
+                <w:lang w:val="en-ZA"/>
+              </w:rPr>
+              <w:t>Participant / Organiser</w:t>
             </w:r>
           </w:p>
         </w:tc>

</xml_diff>

<commit_message>
feat: Added Awards API Functionality
Organiser can create awards and both organiser or participant can view the awards
</commit_message>
<xml_diff>
--- a/docs/RaceDay_ API Endpoint Planning.docx
+++ b/docs/RaceDay_ API Endpoint Planning.docx
@@ -11,10 +11,10 @@
       <w:tblGrid>
         <w:gridCol w:w="1473"/>
         <w:gridCol w:w="3165"/>
-        <w:gridCol w:w="2614"/>
+        <w:gridCol w:w="2615"/>
         <w:gridCol w:w="1638"/>
         <w:gridCol w:w="3147"/>
-        <w:gridCol w:w="2559"/>
+        <w:gridCol w:w="2558"/>
       </w:tblGrid>
       <w:tr>
         <w:trPr>
@@ -371,17 +371,12 @@
               <w:t>/</w:t>
             </w:r>
             <w:proofErr w:type="spellStart"/>
-            <w:proofErr w:type="gramStart"/>
             <w:r>
               <w:t>OrganiserID</w:t>
             </w:r>
             <w:proofErr w:type="spellEnd"/>
             <w:r>
-              <w:t xml:space="preserve">,   </w:t>
-            </w:r>
-            <w:proofErr w:type="gramEnd"/>
-            <w:r>
-              <w:t xml:space="preserve">  </w:t>
+              <w:t xml:space="preserve">,     </w:t>
             </w:r>
             <w:proofErr w:type="spellStart"/>
             <w:r>
@@ -752,12 +747,10 @@
               <w:t>/</w:t>
             </w:r>
             <w:proofErr w:type="spellStart"/>
-            <w:proofErr w:type="gramStart"/>
             <w:r>
               <w:t>api</w:t>
             </w:r>
             <w:proofErr w:type="spellEnd"/>
-            <w:proofErr w:type="gramEnd"/>
             <w:r>
               <w:t>/account</w:t>
             </w:r>
@@ -872,12 +865,10 @@
               <w:t>/</w:t>
             </w:r>
             <w:proofErr w:type="spellStart"/>
-            <w:proofErr w:type="gramStart"/>
             <w:r>
               <w:t>api</w:t>
             </w:r>
             <w:proofErr w:type="spellEnd"/>
-            <w:proofErr w:type="gramEnd"/>
             <w:r>
               <w:t>/account</w:t>
             </w:r>
@@ -1132,12 +1123,10 @@
               <w:t>/</w:t>
             </w:r>
             <w:proofErr w:type="spellStart"/>
-            <w:proofErr w:type="gramStart"/>
             <w:r>
               <w:t>api</w:t>
             </w:r>
             <w:proofErr w:type="spellEnd"/>
-            <w:proofErr w:type="gramEnd"/>
             <w:r>
               <w:t>/events</w:t>
             </w:r>
@@ -1307,12 +1296,10 @@
               <w:t>/</w:t>
             </w:r>
             <w:proofErr w:type="spellStart"/>
-            <w:proofErr w:type="gramStart"/>
             <w:r>
               <w:t>api</w:t>
             </w:r>
             <w:proofErr w:type="spellEnd"/>
-            <w:proofErr w:type="gramEnd"/>
             <w:r>
               <w:t>/events</w:t>
             </w:r>
@@ -1721,12 +1708,10 @@
               <w:t>/</w:t>
             </w:r>
             <w:proofErr w:type="spellStart"/>
-            <w:proofErr w:type="gramStart"/>
             <w:r>
               <w:t>api</w:t>
             </w:r>
             <w:proofErr w:type="spellEnd"/>
-            <w:proofErr w:type="gramEnd"/>
             <w:r>
               <w:t>/Category</w:t>
             </w:r>
@@ -1857,12 +1842,10 @@
               <w:t>/</w:t>
             </w:r>
             <w:proofErr w:type="spellStart"/>
-            <w:proofErr w:type="gramStart"/>
             <w:r>
               <w:t>api</w:t>
             </w:r>
             <w:proofErr w:type="spellEnd"/>
-            <w:proofErr w:type="gramEnd"/>
             <w:r>
               <w:t>/Category</w:t>
             </w:r>
@@ -2393,7 +2376,6 @@
             <w:tcW w:w="3098" w:type="dxa"/>
           </w:tcPr>
           <w:p>
-            <w:proofErr w:type="gramStart"/>
             <w:r>
               <w:t xml:space="preserve">{ </w:t>
             </w:r>
@@ -2402,7 +2384,6 @@
               <w:t>AccountID</w:t>
             </w:r>
             <w:proofErr w:type="spellEnd"/>
-            <w:proofErr w:type="gramEnd"/>
             <w:r>
               <w:t xml:space="preserve">, </w:t>
             </w:r>
@@ -2479,7 +2460,13 @@
               <w:t>Organiser</w:t>
             </w:r>
             <w:r>
-              <w:t xml:space="preserve"> view report </w:t>
+              <w:t xml:space="preserve"> view</w:t>
+            </w:r>
+            <w:r>
+              <w:t>s</w:t>
+            </w:r>
+            <w:r>
+              <w:t xml:space="preserve"> report </w:t>
             </w:r>
           </w:p>
         </w:tc>
@@ -2608,12 +2595,10 @@
               <w:t xml:space="preserve">, </w:t>
             </w:r>
             <w:proofErr w:type="spellStart"/>
-            <w:proofErr w:type="gramStart"/>
             <w:r>
               <w:t>PerformanceDetails,Award</w:t>
             </w:r>
             <w:proofErr w:type="spellEnd"/>
-            <w:proofErr w:type="gramEnd"/>
             <w:r>
               <w:t>}</w:t>
             </w:r>
@@ -2677,6 +2662,194 @@
           <w:p>
             <w:r>
               <w:t>Participant/organiser views the race results</w:t>
+            </w:r>
+          </w:p>
+        </w:tc>
+        <w:tc>
+          <w:tcPr>
+            <w:tcW w:w="1643" w:type="dxa"/>
+          </w:tcPr>
+          <w:p>
+            <w:r>
+              <w:rPr>
+                <w:lang w:val="en-ZA"/>
+              </w:rPr>
+              <w:t>Participant / Organiser</w:t>
+            </w:r>
+          </w:p>
+        </w:tc>
+        <w:tc>
+          <w:tcPr>
+            <w:tcW w:w="3098" w:type="dxa"/>
+          </w:tcPr>
+          <w:p>
+            <w:r>
+              <w:t>None</w:t>
+            </w:r>
+          </w:p>
+        </w:tc>
+        <w:tc>
+          <w:tcPr>
+            <w:tcW w:w="2590" w:type="dxa"/>
+          </w:tcPr>
+          <w:p>
+            <w:r>
+              <w:t>200 OK</w:t>
+            </w:r>
+          </w:p>
+        </w:tc>
+      </w:tr>
+      <w:tr>
+        <w:tc>
+          <w:tcPr>
+            <w:tcW w:w="1481" w:type="dxa"/>
+          </w:tcPr>
+          <w:p>
+            <w:r>
+              <w:t>P</w:t>
+            </w:r>
+            <w:r>
+              <w:t>OST</w:t>
+            </w:r>
+          </w:p>
+        </w:tc>
+        <w:tc>
+          <w:tcPr>
+            <w:tcW w:w="3165" w:type="dxa"/>
+          </w:tcPr>
+          <w:p>
+            <w:r>
+              <w:t>/</w:t>
+            </w:r>
+            <w:proofErr w:type="spellStart"/>
+            <w:r>
+              <w:t>api</w:t>
+            </w:r>
+            <w:proofErr w:type="spellEnd"/>
+            <w:r>
+              <w:t>/</w:t>
+            </w:r>
+            <w:r>
+              <w:t>Awards</w:t>
+            </w:r>
+          </w:p>
+        </w:tc>
+        <w:tc>
+          <w:tcPr>
+            <w:tcW w:w="2619" w:type="dxa"/>
+          </w:tcPr>
+          <w:p>
+            <w:r>
+              <w:t>Organiser</w:t>
+            </w:r>
+            <w:r>
+              <w:t xml:space="preserve"> creates the race awards that must be awarded to top 3 participants</w:t>
+            </w:r>
+          </w:p>
+        </w:tc>
+        <w:tc>
+          <w:tcPr>
+            <w:tcW w:w="1643" w:type="dxa"/>
+          </w:tcPr>
+          <w:p>
+            <w:pPr>
+              <w:rPr>
+                <w:lang w:val="en-ZA"/>
+              </w:rPr>
+            </w:pPr>
+            <w:r>
+              <w:t>Organiser</w:t>
+            </w:r>
+          </w:p>
+        </w:tc>
+        <w:tc>
+          <w:tcPr>
+            <w:tcW w:w="3098" w:type="dxa"/>
+          </w:tcPr>
+          <w:p>
+            <w:r>
+              <w:t>{</w:t>
+            </w:r>
+            <w:proofErr w:type="spellStart"/>
+            <w:r>
+              <w:t>RaceResultsID</w:t>
+            </w:r>
+            <w:proofErr w:type="spellEnd"/>
+            <w:r>
+              <w:t xml:space="preserve">, </w:t>
+            </w:r>
+            <w:proofErr w:type="spellStart"/>
+            <w:r>
+              <w:t>AwardDetails</w:t>
+            </w:r>
+            <w:proofErr w:type="spellEnd"/>
+            <w:r>
+              <w:t>}</w:t>
+            </w:r>
+          </w:p>
+        </w:tc>
+        <w:tc>
+          <w:tcPr>
+            <w:tcW w:w="2590" w:type="dxa"/>
+          </w:tcPr>
+          <w:p>
+            <w:r>
+              <w:t>201 Created; 400 Bad Request;</w:t>
+            </w:r>
+            <w:r>
+              <w:t xml:space="preserve"> </w:t>
+            </w:r>
+            <w:r>
+              <w:t>401/403 if access is invalid</w:t>
+            </w:r>
+          </w:p>
+        </w:tc>
+      </w:tr>
+      <w:tr>
+        <w:tc>
+          <w:tcPr>
+            <w:tcW w:w="1481" w:type="dxa"/>
+          </w:tcPr>
+          <w:p>
+            <w:r>
+              <w:t>GET</w:t>
+            </w:r>
+          </w:p>
+        </w:tc>
+        <w:tc>
+          <w:tcPr>
+            <w:tcW w:w="3165" w:type="dxa"/>
+          </w:tcPr>
+          <w:p>
+            <w:r>
+              <w:t>/</w:t>
+            </w:r>
+            <w:proofErr w:type="spellStart"/>
+            <w:r>
+              <w:t>api</w:t>
+            </w:r>
+            <w:proofErr w:type="spellEnd"/>
+            <w:r>
+              <w:t>/Awards</w:t>
+            </w:r>
+          </w:p>
+        </w:tc>
+        <w:tc>
+          <w:tcPr>
+            <w:tcW w:w="2619" w:type="dxa"/>
+          </w:tcPr>
+          <w:p>
+            <w:r>
+              <w:t>Organiser</w:t>
+            </w:r>
+            <w:r>
+              <w:t>/participant</w:t>
+            </w:r>
+            <w:r>
+              <w:t xml:space="preserve"> view</w:t>
+            </w:r>
+            <w:r>
+              <w:t>s awards</w:t>
             </w:r>
           </w:p>
         </w:tc>

</xml_diff>

<commit_message>
fix: updated table attributes
</commit_message>
<xml_diff>
--- a/docs/RaceDay_ API Endpoint Planning.docx
+++ b/docs/RaceDay_ API Endpoint Planning.docx
@@ -9,12 +9,12 @@
         <w:tblLook w:val="04A0" w:firstRow="1" w:lastRow="0" w:firstColumn="1" w:lastColumn="0" w:noHBand="0" w:noVBand="1"/>
       </w:tblPr>
       <w:tblGrid>
-        <w:gridCol w:w="1473"/>
-        <w:gridCol w:w="3165"/>
-        <w:gridCol w:w="2615"/>
-        <w:gridCol w:w="1638"/>
+        <w:gridCol w:w="1382"/>
+        <w:gridCol w:w="3712"/>
+        <w:gridCol w:w="2567"/>
+        <w:gridCol w:w="1583"/>
         <w:gridCol w:w="3147"/>
-        <w:gridCol w:w="2558"/>
+        <w:gridCol w:w="2205"/>
       </w:tblGrid>
       <w:tr>
         <w:trPr>
@@ -23,6 +23,7 @@
         <w:tc>
           <w:tcPr>
             <w:tcW w:w="1481" w:type="dxa"/>
+            <w:shd w:val="clear" w:color="auto" w:fill="D9E2F3" w:themeFill="accent1" w:themeFillTint="33"/>
           </w:tcPr>
           <w:p>
             <w:r>
@@ -33,6 +34,7 @@
         <w:tc>
           <w:tcPr>
             <w:tcW w:w="3165" w:type="dxa"/>
+            <w:shd w:val="clear" w:color="auto" w:fill="D9E2F3" w:themeFill="accent1" w:themeFillTint="33"/>
           </w:tcPr>
           <w:p>
             <w:r>
@@ -43,6 +45,7 @@
         <w:tc>
           <w:tcPr>
             <w:tcW w:w="2619" w:type="dxa"/>
+            <w:shd w:val="clear" w:color="auto" w:fill="D9E2F3" w:themeFill="accent1" w:themeFillTint="33"/>
           </w:tcPr>
           <w:p>
             <w:r>
@@ -53,6 +56,7 @@
         <w:tc>
           <w:tcPr>
             <w:tcW w:w="1643" w:type="dxa"/>
+            <w:shd w:val="clear" w:color="auto" w:fill="D9E2F3" w:themeFill="accent1" w:themeFillTint="33"/>
           </w:tcPr>
           <w:p>
             <w:r>
@@ -63,6 +67,7 @@
         <w:tc>
           <w:tcPr>
             <w:tcW w:w="3098" w:type="dxa"/>
+            <w:shd w:val="clear" w:color="auto" w:fill="D9E2F3" w:themeFill="accent1" w:themeFillTint="33"/>
           </w:tcPr>
           <w:p>
             <w:r>
@@ -73,6 +78,7 @@
         <w:tc>
           <w:tcPr>
             <w:tcW w:w="2590" w:type="dxa"/>
+            <w:shd w:val="clear" w:color="auto" w:fill="D9E2F3" w:themeFill="accent1" w:themeFillTint="33"/>
           </w:tcPr>
           <w:p>
             <w:r>
@@ -101,15 +107,7 @@
           </w:tcPr>
           <w:p>
             <w:r>
-              <w:t>/</w:t>
-            </w:r>
-            <w:proofErr w:type="spellStart"/>
-            <w:r>
-              <w:t>api</w:t>
-            </w:r>
-            <w:proofErr w:type="spellEnd"/>
-            <w:r>
-              <w:t>/</w:t>
+              <w:t>/api/</w:t>
             </w:r>
             <w:r>
               <w:t>Participant</w:t>
@@ -156,24 +154,17 @@
             <w:r>
               <w:t xml:space="preserve">, </w:t>
             </w:r>
-            <w:proofErr w:type="spellStart"/>
             <w:r>
               <w:t>LastName</w:t>
             </w:r>
-            <w:proofErr w:type="spellEnd"/>
             <w:r>
               <w:t xml:space="preserve">, </w:t>
             </w:r>
-            <w:proofErr w:type="spellStart"/>
             <w:r>
               <w:t>cellnumbe</w:t>
             </w:r>
             <w:r>
-              <w:t>r</w:t>
-            </w:r>
-            <w:proofErr w:type="spellEnd"/>
-            <w:r>
-              <w:t xml:space="preserve">, </w:t>
+              <w:t xml:space="preserve">r, </w:t>
             </w:r>
             <w:r>
               <w:t>address</w:t>
@@ -214,15 +205,7 @@
           </w:tcPr>
           <w:p>
             <w:r>
-              <w:t>/</w:t>
-            </w:r>
-            <w:proofErr w:type="spellStart"/>
-            <w:r>
-              <w:t>api</w:t>
-            </w:r>
-            <w:proofErr w:type="spellEnd"/>
-            <w:r>
-              <w:t>/</w:t>
+              <w:t>/api/</w:t>
             </w:r>
             <w:r>
               <w:t>Organiser</w:t>
@@ -275,13 +258,8 @@
             <w:r>
               <w:t xml:space="preserve">, </w:t>
             </w:r>
-            <w:proofErr w:type="spellStart"/>
-            <w:r>
-              <w:t>LastName</w:t>
-            </w:r>
-            <w:proofErr w:type="spellEnd"/>
-            <w:r>
-              <w:t>, address</w:t>
+            <w:r>
+              <w:t>LastName, address</w:t>
             </w:r>
             <w:r>
               <w:t>}</w:t>
@@ -319,15 +297,7 @@
           </w:tcPr>
           <w:p>
             <w:r>
-              <w:t>/</w:t>
-            </w:r>
-            <w:proofErr w:type="spellStart"/>
-            <w:r>
-              <w:t>api</w:t>
-            </w:r>
-            <w:proofErr w:type="spellEnd"/>
-            <w:r>
-              <w:t>/account</w:t>
+              <w:t>/api/account</w:t>
             </w:r>
           </w:p>
         </w:tc>
@@ -360,31 +330,7 @@
           </w:tcPr>
           <w:p>
             <w:r>
-              <w:t>{</w:t>
-            </w:r>
-            <w:proofErr w:type="spellStart"/>
-            <w:r>
-              <w:t>ParticipantID</w:t>
-            </w:r>
-            <w:proofErr w:type="spellEnd"/>
-            <w:r>
-              <w:t>/</w:t>
-            </w:r>
-            <w:proofErr w:type="spellStart"/>
-            <w:r>
-              <w:t>OrganiserID</w:t>
-            </w:r>
-            <w:proofErr w:type="spellEnd"/>
-            <w:r>
-              <w:t xml:space="preserve">,     </w:t>
-            </w:r>
-            <w:proofErr w:type="spellStart"/>
-            <w:r>
-              <w:t>AuthenticationRole</w:t>
-            </w:r>
-            <w:proofErr w:type="spellEnd"/>
-            <w:r>
-              <w:t>, email, Password}</w:t>
+              <w:t>{ParticipantID/OrganiserID,     AuthenticationRole, email, Password}</w:t>
             </w:r>
           </w:p>
         </w:tc>
@@ -416,15 +362,7 @@
           </w:tcPr>
           <w:p>
             <w:r>
-              <w:t>/</w:t>
-            </w:r>
-            <w:proofErr w:type="spellStart"/>
-            <w:r>
-              <w:t>api</w:t>
-            </w:r>
-            <w:proofErr w:type="spellEnd"/>
-            <w:r>
-              <w:t>/auth/login</w:t>
+              <w:t>/api/auth/login</w:t>
             </w:r>
           </w:p>
         </w:tc>
@@ -514,7 +452,7 @@
               <w:tblLook w:val="04A0" w:firstRow="1" w:lastRow="0" w:firstColumn="1" w:lastColumn="0" w:noHBand="0" w:noVBand="1"/>
             </w:tblPr>
             <w:tblGrid>
-              <w:gridCol w:w="1422"/>
+              <w:gridCol w:w="1367"/>
             </w:tblGrid>
             <w:tr>
               <w:trPr>
@@ -586,15 +524,7 @@
           </w:tcPr>
           <w:p>
             <w:r>
-              <w:t>/</w:t>
-            </w:r>
-            <w:proofErr w:type="spellStart"/>
-            <w:r>
-              <w:t>api</w:t>
-            </w:r>
-            <w:proofErr w:type="spellEnd"/>
-            <w:r>
-              <w:t>/</w:t>
+              <w:t>/api/</w:t>
             </w:r>
             <w:r>
               <w:t>account</w:t>
@@ -665,15 +595,7 @@
           </w:tcPr>
           <w:p>
             <w:r>
-              <w:t>/</w:t>
-            </w:r>
-            <w:proofErr w:type="spellStart"/>
-            <w:r>
-              <w:t>api</w:t>
-            </w:r>
-            <w:proofErr w:type="spellEnd"/>
-            <w:r>
-              <w:t>/account</w:t>
+              <w:t>/api/account</w:t>
             </w:r>
           </w:p>
         </w:tc>
@@ -744,24 +666,14 @@
           </w:tcPr>
           <w:p>
             <w:r>
-              <w:t>/</w:t>
-            </w:r>
-            <w:proofErr w:type="spellStart"/>
-            <w:r>
-              <w:t>api</w:t>
-            </w:r>
-            <w:proofErr w:type="spellEnd"/>
-            <w:r>
-              <w:t>/account</w:t>
+              <w:t>/api/account</w:t>
             </w:r>
             <w:r>
               <w:t>/{</w:t>
             </w:r>
-            <w:proofErr w:type="spellStart"/>
             <w:r>
               <w:t>ParticipantID</w:t>
             </w:r>
-            <w:proofErr w:type="spellEnd"/>
             <w:r>
               <w:t>}</w:t>
             </w:r>
@@ -799,23 +711,7 @@
           </w:tcPr>
           <w:p>
             <w:r>
-              <w:t xml:space="preserve">{FirstName, </w:t>
-            </w:r>
-            <w:proofErr w:type="spellStart"/>
-            <w:r>
-              <w:t>LastName</w:t>
-            </w:r>
-            <w:proofErr w:type="spellEnd"/>
-            <w:r>
-              <w:t xml:space="preserve">, </w:t>
-            </w:r>
-            <w:proofErr w:type="spellStart"/>
-            <w:r>
-              <w:t>cellnumber</w:t>
-            </w:r>
-            <w:proofErr w:type="spellEnd"/>
-            <w:r>
-              <w:t xml:space="preserve">, </w:t>
+              <w:t xml:space="preserve">{FirstName, LastName, cellnumber, </w:t>
             </w:r>
             <w:r>
               <w:t>A</w:t>
@@ -862,26 +758,10 @@
           </w:tcPr>
           <w:p>
             <w:r>
-              <w:t>/</w:t>
-            </w:r>
-            <w:proofErr w:type="spellStart"/>
-            <w:r>
-              <w:t>api</w:t>
-            </w:r>
-            <w:proofErr w:type="spellEnd"/>
-            <w:r>
-              <w:t>/account</w:t>
-            </w:r>
-            <w:r>
-              <w:t>/{</w:t>
-            </w:r>
-            <w:proofErr w:type="spellStart"/>
-            <w:r>
-              <w:t>OrganiserID</w:t>
-            </w:r>
-            <w:proofErr w:type="spellEnd"/>
-            <w:r>
-              <w:t>}</w:t>
+              <w:t>/api/account</w:t>
+            </w:r>
+            <w:r>
+              <w:t>/{OrganiserID}</w:t>
             </w:r>
           </w:p>
         </w:tc>
@@ -917,15 +797,7 @@
           </w:tcPr>
           <w:p>
             <w:r>
-              <w:t xml:space="preserve">{FirstName, </w:t>
-            </w:r>
-            <w:proofErr w:type="spellStart"/>
-            <w:r>
-              <w:t>LastName</w:t>
-            </w:r>
-            <w:proofErr w:type="spellEnd"/>
-            <w:r>
-              <w:t>, Address, Email}</w:t>
+              <w:t>{FirstName, LastName, Address, Email}</w:t>
             </w:r>
           </w:p>
         </w:tc>
@@ -960,15 +832,7 @@
           </w:tcPr>
           <w:p>
             <w:r>
-              <w:t>/</w:t>
-            </w:r>
-            <w:proofErr w:type="spellStart"/>
-            <w:r>
-              <w:t>api</w:t>
-            </w:r>
-            <w:proofErr w:type="spellEnd"/>
-            <w:r>
-              <w:t>/events</w:t>
+              <w:t>/api/events</w:t>
             </w:r>
           </w:p>
         </w:tc>
@@ -978,15 +842,7 @@
           </w:tcPr>
           <w:p>
             <w:r>
-              <w:t xml:space="preserve">Creates a new </w:t>
-            </w:r>
-            <w:proofErr w:type="spellStart"/>
-            <w:r>
-              <w:t>RaceDay</w:t>
-            </w:r>
-            <w:proofErr w:type="spellEnd"/>
-            <w:r>
-              <w:t xml:space="preserve"> event</w:t>
+              <w:t>Creates a new RaceDay event</w:t>
             </w:r>
             <w:r>
               <w:t>.</w:t>
@@ -1011,24 +867,14 @@
             <w:r>
               <w:t>{</w:t>
             </w:r>
-            <w:proofErr w:type="spellStart"/>
-            <w:r>
-              <w:t>OrganiserID</w:t>
-            </w:r>
-            <w:proofErr w:type="spellEnd"/>
-            <w:r>
-              <w:t>,</w:t>
+            <w:r>
+              <w:t>OrganiserID,</w:t>
             </w:r>
             <w:r>
               <w:t xml:space="preserve"> </w:t>
             </w:r>
-            <w:proofErr w:type="spellStart"/>
-            <w:r>
-              <w:t>EventName</w:t>
-            </w:r>
-            <w:proofErr w:type="spellEnd"/>
-            <w:r>
-              <w:t>,</w:t>
+            <w:r>
+              <w:t>EventName,</w:t>
             </w:r>
             <w:r>
               <w:t xml:space="preserve"> </w:t>
@@ -1039,35 +885,20 @@
             <w:r>
               <w:t xml:space="preserve"> </w:t>
             </w:r>
-            <w:proofErr w:type="spellStart"/>
-            <w:r>
-              <w:t>EventType</w:t>
-            </w:r>
-            <w:proofErr w:type="spellEnd"/>
-            <w:r>
-              <w:t>,</w:t>
+            <w:r>
+              <w:t>EventType,</w:t>
             </w:r>
             <w:r>
               <w:t xml:space="preserve"> </w:t>
             </w:r>
-            <w:proofErr w:type="spellStart"/>
-            <w:r>
-              <w:t>EventDate</w:t>
-            </w:r>
-            <w:proofErr w:type="spellEnd"/>
-            <w:r>
-              <w:t>,</w:t>
+            <w:r>
+              <w:t>EventDate,</w:t>
             </w:r>
             <w:r>
               <w:t xml:space="preserve"> </w:t>
             </w:r>
-            <w:proofErr w:type="spellStart"/>
-            <w:r>
-              <w:t>EventDuration</w:t>
-            </w:r>
-            <w:proofErr w:type="spellEnd"/>
-            <w:r>
-              <w:t>,</w:t>
+            <w:r>
+              <w:t>EventDuration,</w:t>
             </w:r>
             <w:r>
               <w:t xml:space="preserve"> </w:t>
@@ -1110,6 +941,7 @@
           </w:tcPr>
           <w:p>
             <w:r>
+              <w:lastRenderedPageBreak/>
               <w:t>PUT</w:t>
             </w:r>
           </w:p>
@@ -1120,26 +952,16 @@
           </w:tcPr>
           <w:p>
             <w:r>
-              <w:t>/</w:t>
-            </w:r>
-            <w:proofErr w:type="spellStart"/>
-            <w:r>
-              <w:t>api</w:t>
-            </w:r>
-            <w:proofErr w:type="spellEnd"/>
-            <w:r>
-              <w:t>/events</w:t>
+              <w:t>/api/events</w:t>
             </w:r>
             <w:r>
               <w:t>/{</w:t>
             </w:r>
-            <w:proofErr w:type="spellStart"/>
-            <w:r>
-              <w:t>OrganiserID</w:t>
-            </w:r>
-            <w:proofErr w:type="spellEnd"/>
-            <w:r>
-              <w:t>}</w:t>
+            <w:r>
+              <w:t>Event</w:t>
+            </w:r>
+            <w:r>
+              <w:t>ID}</w:t>
             </w:r>
           </w:p>
         </w:tc>
@@ -1183,57 +1005,32 @@
             <w:r>
               <w:t>{</w:t>
             </w:r>
-            <w:proofErr w:type="spellStart"/>
-            <w:r>
-              <w:t>OrganiserID</w:t>
-            </w:r>
-            <w:proofErr w:type="spellEnd"/>
-            <w:r>
-              <w:t>,</w:t>
+            <w:r>
+              <w:t>OrganiserID,</w:t>
             </w:r>
             <w:r>
               <w:t xml:space="preserve"> </w:t>
             </w:r>
-            <w:proofErr w:type="spellStart"/>
-            <w:r>
-              <w:t>EventName</w:t>
-            </w:r>
-            <w:proofErr w:type="spellEnd"/>
-            <w:r>
-              <w:t>, Description,</w:t>
+            <w:r>
+              <w:t>EventName, Description,</w:t>
             </w:r>
             <w:r>
               <w:t xml:space="preserve"> </w:t>
             </w:r>
-            <w:proofErr w:type="spellStart"/>
-            <w:r>
-              <w:t>EventType</w:t>
-            </w:r>
-            <w:proofErr w:type="spellEnd"/>
-            <w:r>
-              <w:t>,</w:t>
+            <w:r>
+              <w:t>EventType,</w:t>
             </w:r>
             <w:r>
               <w:t xml:space="preserve"> </w:t>
             </w:r>
-            <w:proofErr w:type="spellStart"/>
-            <w:r>
-              <w:t>EventDate</w:t>
-            </w:r>
-            <w:proofErr w:type="spellEnd"/>
-            <w:r>
-              <w:t>,</w:t>
+            <w:r>
+              <w:t>EventDate,</w:t>
             </w:r>
             <w:r>
               <w:t xml:space="preserve"> </w:t>
             </w:r>
-            <w:proofErr w:type="spellStart"/>
-            <w:r>
-              <w:t>EventDuration</w:t>
-            </w:r>
-            <w:proofErr w:type="spellEnd"/>
-            <w:r>
-              <w:t>,</w:t>
+            <w:r>
+              <w:t>EventDuration,</w:t>
             </w:r>
             <w:r>
               <w:t xml:space="preserve"> </w:t>
@@ -1282,7 +1079,6 @@
           </w:tcPr>
           <w:p>
             <w:r>
-              <w:lastRenderedPageBreak/>
               <w:t>DELETE</w:t>
             </w:r>
           </w:p>
@@ -1293,26 +1089,16 @@
           </w:tcPr>
           <w:p>
             <w:r>
-              <w:t>/</w:t>
-            </w:r>
-            <w:proofErr w:type="spellStart"/>
-            <w:r>
-              <w:t>api</w:t>
-            </w:r>
-            <w:proofErr w:type="spellEnd"/>
-            <w:r>
-              <w:t>/events</w:t>
+              <w:t>/api/events</w:t>
             </w:r>
             <w:r>
               <w:t>/{</w:t>
             </w:r>
-            <w:proofErr w:type="spellStart"/>
-            <w:r>
-              <w:t>OrganiserID</w:t>
-            </w:r>
-            <w:proofErr w:type="spellEnd"/>
-            <w:r>
-              <w:t>}</w:t>
+            <w:r>
+              <w:t>Event</w:t>
+            </w:r>
+            <w:r>
+              <w:t>ID}</w:t>
             </w:r>
           </w:p>
         </w:tc>
@@ -1398,15 +1184,13 @@
           </w:tcPr>
           <w:p>
             <w:r>
+              <w:t>/api/events</w:t>
+            </w:r>
+            <w:r>
               <w:t>/</w:t>
             </w:r>
-            <w:proofErr w:type="spellStart"/>
-            <w:r>
-              <w:t>api</w:t>
-            </w:r>
-            <w:proofErr w:type="spellEnd"/>
-            <w:r>
-              <w:t>/events</w:t>
+            <w:r>
+              <w:t>{EventID}</w:t>
             </w:r>
           </w:p>
         </w:tc>
@@ -1486,15 +1270,7 @@
           </w:tcPr>
           <w:p>
             <w:r>
-              <w:t>/</w:t>
-            </w:r>
-            <w:proofErr w:type="spellStart"/>
-            <w:r>
-              <w:t>api</w:t>
-            </w:r>
-            <w:proofErr w:type="spellEnd"/>
-            <w:r>
-              <w:t>/events</w:t>
+              <w:t>/api/events</w:t>
             </w:r>
           </w:p>
         </w:tc>
@@ -1577,15 +1353,7 @@
           </w:tcPr>
           <w:p>
             <w:r>
-              <w:t>/</w:t>
-            </w:r>
-            <w:proofErr w:type="spellStart"/>
-            <w:r>
-              <w:t>api</w:t>
-            </w:r>
-            <w:proofErr w:type="spellEnd"/>
-            <w:r>
-              <w:t>/</w:t>
+              <w:t>/api/</w:t>
             </w:r>
             <w:r>
               <w:t>Category</w:t>
@@ -1604,15 +1372,7 @@
               <w:t xml:space="preserve"> c</w:t>
             </w:r>
             <w:r>
-              <w:t xml:space="preserve">reates a new </w:t>
-            </w:r>
-            <w:proofErr w:type="spellStart"/>
-            <w:r>
-              <w:t>RaceDay</w:t>
-            </w:r>
-            <w:proofErr w:type="spellEnd"/>
-            <w:r>
-              <w:t xml:space="preserve"> </w:t>
+              <w:t xml:space="preserve">reates a new RaceDay </w:t>
             </w:r>
             <w:r>
               <w:t>category</w:t>
@@ -1637,35 +1397,9 @@
             <w:r>
               <w:t>{</w:t>
             </w:r>
-            <w:proofErr w:type="spellStart"/>
-            <w:r>
-              <w:t>EventID</w:t>
-            </w:r>
-            <w:proofErr w:type="spellEnd"/>
-            <w:r>
-              <w:t xml:space="preserve">, </w:t>
-            </w:r>
-            <w:proofErr w:type="spellStart"/>
-            <w:r>
-              <w:t>CategoryName</w:t>
-            </w:r>
-            <w:proofErr w:type="spellEnd"/>
-            <w:r>
-              <w:t xml:space="preserve">, </w:t>
-            </w:r>
-            <w:proofErr w:type="spellStart"/>
-            <w:r>
-              <w:t>MinAge</w:t>
-            </w:r>
-            <w:proofErr w:type="spellEnd"/>
-            <w:r>
-              <w:t xml:space="preserve">, </w:t>
-            </w:r>
-            <w:proofErr w:type="spellStart"/>
-            <w:r>
-              <w:t>MaxAge</w:t>
-            </w:r>
-            <w:proofErr w:type="spellEnd"/>
+            <w:r>
+              <w:t>EventID, CategoryName, MinAge, MaxAge</w:t>
+            </w:r>
             <w:r>
               <w:t>}</w:t>
             </w:r>
@@ -1705,24 +1439,14 @@
           </w:tcPr>
           <w:p>
             <w:r>
-              <w:t>/</w:t>
-            </w:r>
-            <w:proofErr w:type="spellStart"/>
-            <w:r>
-              <w:t>api</w:t>
-            </w:r>
-            <w:proofErr w:type="spellEnd"/>
-            <w:r>
-              <w:t>/Category</w:t>
+              <w:t>/api/Category</w:t>
             </w:r>
             <w:r>
               <w:t>/{</w:t>
             </w:r>
-            <w:proofErr w:type="spellStart"/>
-            <w:r>
-              <w:t>OrganiserID</w:t>
-            </w:r>
-            <w:proofErr w:type="spellEnd"/>
+            <w:r>
+              <w:t>CategoryID</w:t>
+            </w:r>
             <w:r>
               <w:t>}</w:t>
             </w:r>
@@ -1768,35 +1492,9 @@
             <w:r>
               <w:t>{</w:t>
             </w:r>
-            <w:proofErr w:type="spellStart"/>
-            <w:r>
-              <w:t>EventID</w:t>
-            </w:r>
-            <w:proofErr w:type="spellEnd"/>
-            <w:r>
-              <w:t xml:space="preserve">, </w:t>
-            </w:r>
-            <w:proofErr w:type="spellStart"/>
-            <w:r>
-              <w:t>CategoryName</w:t>
-            </w:r>
-            <w:proofErr w:type="spellEnd"/>
-            <w:r>
-              <w:t xml:space="preserve">, </w:t>
-            </w:r>
-            <w:proofErr w:type="spellStart"/>
-            <w:r>
-              <w:t>MinAge</w:t>
-            </w:r>
-            <w:proofErr w:type="spellEnd"/>
-            <w:r>
-              <w:t xml:space="preserve">, </w:t>
-            </w:r>
-            <w:proofErr w:type="spellStart"/>
-            <w:r>
-              <w:t>MaxAge</w:t>
-            </w:r>
-            <w:proofErr w:type="spellEnd"/>
+            <w:r>
+              <w:t>EventID, CategoryName, MinAge, MaxAge</w:t>
+            </w:r>
             <w:r>
               <w:t>}</w:t>
             </w:r>
@@ -1839,24 +1537,14 @@
           </w:tcPr>
           <w:p>
             <w:r>
-              <w:t>/</w:t>
-            </w:r>
-            <w:proofErr w:type="spellStart"/>
-            <w:r>
-              <w:t>api</w:t>
-            </w:r>
-            <w:proofErr w:type="spellEnd"/>
-            <w:r>
-              <w:t>/Category</w:t>
+              <w:t>/api/Category</w:t>
             </w:r>
             <w:r>
               <w:t>/{</w:t>
             </w:r>
-            <w:proofErr w:type="spellStart"/>
-            <w:r>
-              <w:t>OrganiserID</w:t>
-            </w:r>
-            <w:proofErr w:type="spellEnd"/>
+            <w:r>
+              <w:t>CategoryID</w:t>
+            </w:r>
             <w:r>
               <w:t>}</w:t>
             </w:r>
@@ -1947,15 +1635,7 @@
           </w:tcPr>
           <w:p>
             <w:r>
-              <w:t>/</w:t>
-            </w:r>
-            <w:proofErr w:type="spellStart"/>
-            <w:r>
-              <w:t>api</w:t>
-            </w:r>
-            <w:proofErr w:type="spellEnd"/>
-            <w:r>
-              <w:t>/Category</w:t>
+              <w:t>/api/Category</w:t>
             </w:r>
           </w:p>
         </w:tc>
@@ -2044,15 +1724,7 @@
           </w:tcPr>
           <w:p>
             <w:r>
-              <w:t>/</w:t>
-            </w:r>
-            <w:proofErr w:type="spellStart"/>
-            <w:r>
-              <w:t>api</w:t>
-            </w:r>
-            <w:proofErr w:type="spellEnd"/>
-            <w:r>
-              <w:t>/</w:t>
+              <w:t>/api/</w:t>
             </w:r>
             <w:r>
               <w:t>Enrolment</w:t>
@@ -2091,31 +1763,13 @@
           </w:tcPr>
           <w:p>
             <w:r>
-              <w:t>{</w:t>
-            </w:r>
-            <w:proofErr w:type="spellStart"/>
-            <w:r>
-              <w:t>AccountID</w:t>
-            </w:r>
-            <w:proofErr w:type="spellEnd"/>
-            <w:r>
-              <w:t xml:space="preserve">, </w:t>
-            </w:r>
-            <w:proofErr w:type="spellStart"/>
-            <w:r>
-              <w:t>CategoryID</w:t>
-            </w:r>
-            <w:proofErr w:type="spellEnd"/>
-            <w:r>
-              <w:t xml:space="preserve">, </w:t>
-            </w:r>
-            <w:proofErr w:type="spellStart"/>
-            <w:r>
-              <w:t>EnrollmentDate</w:t>
-            </w:r>
-            <w:proofErr w:type="spellEnd"/>
-            <w:r>
-              <w:t>}</w:t>
+              <w:t xml:space="preserve">{CategoryID, </w:t>
+            </w:r>
+            <w:r>
+              <w:t xml:space="preserve">EventID, </w:t>
+            </w:r>
+            <w:r>
+              <w:t>EnrollmentDate}</w:t>
             </w:r>
           </w:p>
         </w:tc>
@@ -2147,15 +1801,7 @@
           </w:tcPr>
           <w:p>
             <w:r>
-              <w:t>/</w:t>
-            </w:r>
-            <w:proofErr w:type="spellStart"/>
-            <w:r>
-              <w:t>api</w:t>
-            </w:r>
-            <w:proofErr w:type="spellEnd"/>
-            <w:r>
-              <w:t>/Enrolment</w:t>
+              <w:t>/api/Enrolment</w:t>
             </w:r>
           </w:p>
         </w:tc>
@@ -2243,15 +1889,7 @@
           </w:tcPr>
           <w:p>
             <w:r>
-              <w:t>/</w:t>
-            </w:r>
-            <w:proofErr w:type="spellStart"/>
-            <w:r>
-              <w:t>api</w:t>
-            </w:r>
-            <w:proofErr w:type="spellEnd"/>
-            <w:r>
-              <w:t>/Enrolment</w:t>
+              <w:t>/api/Enrolment</w:t>
             </w:r>
           </w:p>
         </w:tc>
@@ -2320,10 +1958,7 @@
           </w:tcPr>
           <w:p>
             <w:r>
-              <w:t>P</w:t>
-            </w:r>
-            <w:r>
-              <w:t>OST</w:t>
+              <w:t>GET</w:t>
             </w:r>
           </w:p>
         </w:tc>
@@ -2333,15 +1968,7 @@
           </w:tcPr>
           <w:p>
             <w:r>
-              <w:t>/</w:t>
-            </w:r>
-            <w:proofErr w:type="spellStart"/>
-            <w:r>
-              <w:t>api</w:t>
-            </w:r>
-            <w:proofErr w:type="spellEnd"/>
-            <w:r>
-              <w:t>/Enrolment</w:t>
+              <w:t>/api/events/{EventID}/enrolments</w:t>
             </w:r>
           </w:p>
         </w:tc>
@@ -2351,24 +1978,24 @@
           </w:tcPr>
           <w:p>
             <w:r>
+              <w:t xml:space="preserve">Organiser views </w:t>
+            </w:r>
+            <w:r>
+              <w:t>specific</w:t>
+            </w:r>
+            <w:r>
+              <w:t xml:space="preserve"> event enrolments.</w:t>
+            </w:r>
+          </w:p>
+        </w:tc>
+        <w:tc>
+          <w:tcPr>
+            <w:tcW w:w="1643" w:type="dxa"/>
+          </w:tcPr>
+          <w:p>
+            <w:r>
               <w:t>Organiser</w:t>
             </w:r>
-            <w:r>
-              <w:t xml:space="preserve"> creates a report that captures the relationship between </w:t>
-            </w:r>
-            <w:r>
-              <w:t>Participant, Event and Category</w:t>
-            </w:r>
-          </w:p>
-        </w:tc>
-        <w:tc>
-          <w:tcPr>
-            <w:tcW w:w="1643" w:type="dxa"/>
-          </w:tcPr>
-          <w:p>
-            <w:r>
-              <w:t>Organiser</w:t>
-            </w:r>
           </w:p>
         </w:tc>
         <w:tc>
@@ -2377,31 +2004,7 @@
           </w:tcPr>
           <w:p>
             <w:r>
-              <w:t xml:space="preserve">{ </w:t>
-            </w:r>
-            <w:proofErr w:type="spellStart"/>
-            <w:r>
-              <w:t>AccountID</w:t>
-            </w:r>
-            <w:proofErr w:type="spellEnd"/>
-            <w:r>
-              <w:t xml:space="preserve">, </w:t>
-            </w:r>
-            <w:proofErr w:type="spellStart"/>
-            <w:r>
-              <w:t>CategoryID</w:t>
-            </w:r>
-            <w:proofErr w:type="spellEnd"/>
-            <w:r>
-              <w:t xml:space="preserve">, </w:t>
-            </w:r>
-            <w:proofErr w:type="spellStart"/>
-            <w:r>
-              <w:t>EventID</w:t>
-            </w:r>
-            <w:proofErr w:type="spellEnd"/>
-            <w:r>
-              <w:t>}</w:t>
+              <w:t>None</w:t>
             </w:r>
           </w:p>
         </w:tc>
@@ -2411,13 +2014,7 @@
           </w:tcPr>
           <w:p>
             <w:r>
-              <w:t>201 Created; 400 Bad Request;</w:t>
-            </w:r>
-            <w:r>
-              <w:t xml:space="preserve"> </w:t>
-            </w:r>
-            <w:r>
-              <w:t>401/403 if access is invalid</w:t>
+              <w:t>200 OK</w:t>
             </w:r>
           </w:p>
         </w:tc>
@@ -2429,7 +2026,11 @@
           </w:tcPr>
           <w:p>
             <w:r>
-              <w:t>GET</w:t>
+              <w:lastRenderedPageBreak/>
+              <w:t>P</w:t>
+            </w:r>
+            <w:r>
+              <w:t>OST</w:t>
             </w:r>
           </w:p>
         </w:tc>
@@ -2439,15 +2040,7 @@
           </w:tcPr>
           <w:p>
             <w:r>
-              <w:t>/</w:t>
-            </w:r>
-            <w:proofErr w:type="spellStart"/>
-            <w:r>
-              <w:t>api</w:t>
-            </w:r>
-            <w:proofErr w:type="spellEnd"/>
-            <w:r>
-              <w:t>/Enrolment</w:t>
+              <w:t>/api/Enrolment</w:t>
             </w:r>
           </w:p>
         </w:tc>
@@ -2460,13 +2053,10 @@
               <w:t>Organiser</w:t>
             </w:r>
             <w:r>
-              <w:t xml:space="preserve"> view</w:t>
-            </w:r>
-            <w:r>
-              <w:t>s</w:t>
-            </w:r>
-            <w:r>
-              <w:t xml:space="preserve"> report </w:t>
+              <w:t xml:space="preserve"> creates a report that captures the relationship between </w:t>
+            </w:r>
+            <w:r>
+              <w:t>Participant, Event and Category</w:t>
             </w:r>
           </w:p>
         </w:tc>
@@ -2486,7 +2076,13 @@
           </w:tcPr>
           <w:p>
             <w:r>
-              <w:t>None</w:t>
+              <w:t xml:space="preserve">{ </w:t>
+            </w:r>
+            <w:r>
+              <w:t xml:space="preserve">AccountID, CategoryID, </w:t>
+            </w:r>
+            <w:r>
+              <w:t>EventID}</w:t>
             </w:r>
           </w:p>
         </w:tc>
@@ -2496,7 +2092,13 @@
           </w:tcPr>
           <w:p>
             <w:r>
-              <w:t>200 OK</w:t>
+              <w:t>201 Created; 400 Bad Request;</w:t>
+            </w:r>
+            <w:r>
+              <w:t xml:space="preserve"> </w:t>
+            </w:r>
+            <w:r>
+              <w:t>401/403 if access is invalid</w:t>
             </w:r>
           </w:p>
         </w:tc>
@@ -2508,11 +2110,7 @@
           </w:tcPr>
           <w:p>
             <w:r>
-              <w:lastRenderedPageBreak/>
-              <w:t>P</w:t>
-            </w:r>
-            <w:r>
-              <w:t>OST</w:t>
+              <w:t>GET</w:t>
             </w:r>
           </w:p>
         </w:tc>
@@ -2522,21 +2120,8 @@
           </w:tcPr>
           <w:p>
             <w:r>
-              <w:t>/</w:t>
-            </w:r>
-            <w:proofErr w:type="spellStart"/>
-            <w:r>
-              <w:t>api</w:t>
-            </w:r>
-            <w:proofErr w:type="spellEnd"/>
-            <w:r>
-              <w:t>/</w:t>
-            </w:r>
-            <w:proofErr w:type="spellStart"/>
-            <w:r>
-              <w:t>RaceResults</w:t>
-            </w:r>
-            <w:proofErr w:type="spellEnd"/>
+              <w:t>/api/Enrolment</w:t>
+            </w:r>
           </w:p>
         </w:tc>
         <w:tc>
@@ -2548,7 +2133,13 @@
               <w:t>Organiser</w:t>
             </w:r>
             <w:r>
-              <w:t xml:space="preserve"> creates a report that captures participant's finish time, finish position and award for the result</w:t>
+              <w:t xml:space="preserve"> view</w:t>
+            </w:r>
+            <w:r>
+              <w:t>s</w:t>
+            </w:r>
+            <w:r>
+              <w:t xml:space="preserve"> report </w:t>
             </w:r>
           </w:p>
         </w:tc>
@@ -2568,39 +2159,7 @@
           </w:tcPr>
           <w:p>
             <w:r>
-              <w:t>{</w:t>
-            </w:r>
-            <w:proofErr w:type="spellStart"/>
-            <w:r>
-              <w:t>EnrolmentID</w:t>
-            </w:r>
-            <w:proofErr w:type="spellEnd"/>
-            <w:r>
-              <w:t xml:space="preserve">, </w:t>
-            </w:r>
-            <w:proofErr w:type="spellStart"/>
-            <w:r>
-              <w:t>FinishTime</w:t>
-            </w:r>
-            <w:proofErr w:type="spellEnd"/>
-            <w:r>
-              <w:t xml:space="preserve">, </w:t>
-            </w:r>
-            <w:proofErr w:type="spellStart"/>
-            <w:r>
-              <w:t>FinishPosition</w:t>
-            </w:r>
-            <w:proofErr w:type="spellEnd"/>
-            <w:r>
-              <w:t xml:space="preserve">, </w:t>
-            </w:r>
-            <w:proofErr w:type="spellStart"/>
-            <w:r>
-              <w:t>PerformanceDetails,Award</w:t>
-            </w:r>
-            <w:proofErr w:type="spellEnd"/>
-            <w:r>
-              <w:t>}</w:t>
+              <w:t>None</w:t>
             </w:r>
           </w:p>
         </w:tc>
@@ -2610,13 +2169,7 @@
           </w:tcPr>
           <w:p>
             <w:r>
-              <w:t>201 Created; 400 Bad Request;</w:t>
-            </w:r>
-            <w:r>
-              <w:t xml:space="preserve"> </w:t>
-            </w:r>
-            <w:r>
-              <w:t>401/403 if access is invalid</w:t>
+              <w:t>200 OK</w:t>
             </w:r>
           </w:p>
         </w:tc>
@@ -2628,6 +2181,83 @@
           </w:tcPr>
           <w:p>
             <w:r>
+              <w:t>P</w:t>
+            </w:r>
+            <w:r>
+              <w:t>OST</w:t>
+            </w:r>
+          </w:p>
+        </w:tc>
+        <w:tc>
+          <w:tcPr>
+            <w:tcW w:w="3165" w:type="dxa"/>
+          </w:tcPr>
+          <w:p>
+            <w:r>
+              <w:t>/api/</w:t>
+            </w:r>
+            <w:r>
+              <w:t>RaceResults</w:t>
+            </w:r>
+          </w:p>
+        </w:tc>
+        <w:tc>
+          <w:tcPr>
+            <w:tcW w:w="2619" w:type="dxa"/>
+          </w:tcPr>
+          <w:p>
+            <w:r>
+              <w:t>Organiser</w:t>
+            </w:r>
+            <w:r>
+              <w:t xml:space="preserve"> creates a report that captures participant's finish time, finish position and award for the result</w:t>
+            </w:r>
+          </w:p>
+        </w:tc>
+        <w:tc>
+          <w:tcPr>
+            <w:tcW w:w="1643" w:type="dxa"/>
+          </w:tcPr>
+          <w:p>
+            <w:r>
+              <w:t>Organiser</w:t>
+            </w:r>
+          </w:p>
+        </w:tc>
+        <w:tc>
+          <w:tcPr>
+            <w:tcW w:w="3098" w:type="dxa"/>
+          </w:tcPr>
+          <w:p>
+            <w:r>
+              <w:t>{EnrolmentID, FinishTime, FinishPosition, PerformanceDetails,Award}</w:t>
+            </w:r>
+          </w:p>
+        </w:tc>
+        <w:tc>
+          <w:tcPr>
+            <w:tcW w:w="2590" w:type="dxa"/>
+          </w:tcPr>
+          <w:p>
+            <w:r>
+              <w:t>201 Created; 400 Bad Request;</w:t>
+            </w:r>
+            <w:r>
+              <w:t xml:space="preserve"> </w:t>
+            </w:r>
+            <w:r>
+              <w:t>401/403 if access is invalid</w:t>
+            </w:r>
+          </w:p>
+        </w:tc>
+      </w:tr>
+      <w:tr>
+        <w:tc>
+          <w:tcPr>
+            <w:tcW w:w="1481" w:type="dxa"/>
+          </w:tcPr>
+          <w:p>
+            <w:r>
               <w:t>GET</w:t>
             </w:r>
           </w:p>
@@ -2638,21 +2268,8 @@
           </w:tcPr>
           <w:p>
             <w:r>
-              <w:t>/</w:t>
-            </w:r>
-            <w:proofErr w:type="spellStart"/>
-            <w:r>
-              <w:t>api</w:t>
-            </w:r>
-            <w:proofErr w:type="spellEnd"/>
-            <w:r>
-              <w:t>/</w:t>
-            </w:r>
-            <w:proofErr w:type="spellStart"/>
-            <w:r>
-              <w:t>RaceResults</w:t>
-            </w:r>
-            <w:proofErr w:type="spellEnd"/>
+              <w:t>/api/RaceResults</w:t>
+            </w:r>
           </w:p>
         </w:tc>
         <w:tc>
@@ -2719,15 +2336,7 @@
           </w:tcPr>
           <w:p>
             <w:r>
-              <w:t>/</w:t>
-            </w:r>
-            <w:proofErr w:type="spellStart"/>
-            <w:r>
-              <w:t>api</w:t>
-            </w:r>
-            <w:proofErr w:type="spellEnd"/>
-            <w:r>
-              <w:t>/</w:t>
+              <w:t>/api/</w:t>
             </w:r>
             <w:r>
               <w:t>Awards</w:t>
@@ -2768,23 +2377,7 @@
           </w:tcPr>
           <w:p>
             <w:r>
-              <w:t>{</w:t>
-            </w:r>
-            <w:proofErr w:type="spellStart"/>
-            <w:r>
-              <w:t>RaceResultsID</w:t>
-            </w:r>
-            <w:proofErr w:type="spellEnd"/>
-            <w:r>
-              <w:t xml:space="preserve">, </w:t>
-            </w:r>
-            <w:proofErr w:type="spellStart"/>
-            <w:r>
-              <w:t>AwardDetails</w:t>
-            </w:r>
-            <w:proofErr w:type="spellEnd"/>
-            <w:r>
-              <w:t>}</w:t>
+              <w:t>{RaceResultsID, AwardDetails}</w:t>
             </w:r>
           </w:p>
         </w:tc>
@@ -2822,15 +2415,7 @@
           </w:tcPr>
           <w:p>
             <w:r>
-              <w:t>/</w:t>
-            </w:r>
-            <w:proofErr w:type="spellStart"/>
-            <w:r>
-              <w:t>api</w:t>
-            </w:r>
-            <w:proofErr w:type="spellEnd"/>
-            <w:r>
-              <w:t>/Awards</w:t>
+              <w:t>/api/Awards</w:t>
             </w:r>
           </w:p>
         </w:tc>

</xml_diff>